<commit_message>
modified project details file after task 5 implementation
</commit_message>
<xml_diff>
--- a/Project_details.docx
+++ b/Project_details.docx
@@ -1714,6 +1714,180 @@
     </w:p>
     <w:p>
       <w:pPr>
+        <w:tabs>
+          <w:tab w:val="left" w:pos="720" w:leader="none"/>
+        </w:tabs>
+        <w:spacing w:before="100" w:after="100" w:line="240"/>
+        <w:ind w:right="0" w:left="0" w:firstLine="0"/>
+        <w:jc w:val="left"/>
+        <w:rPr>
+          <w:rFonts w:ascii="Times New Roman" w:hAnsi="Times New Roman" w:cs="Times New Roman" w:eastAsia="Times New Roman"/>
+          <w:color w:val="auto"/>
+          <w:spacing w:val="0"/>
+          <w:position w:val="0"/>
+          <w:sz w:val="24"/>
+          <w:shd w:fill="auto" w:val="clear"/>
+        </w:rPr>
+      </w:pPr>
+      <w:r>
+        <w:rPr>
+          <w:rFonts w:ascii="Times New Roman" w:hAnsi="Times New Roman" w:cs="Times New Roman" w:eastAsia="Times New Roman"/>
+          <w:color w:val="auto"/>
+          <w:spacing w:val="0"/>
+          <w:position w:val="0"/>
+          <w:sz w:val="24"/>
+          <w:shd w:fill="auto" w:val="clear"/>
+        </w:rPr>
+        <w:t xml:space="preserve">In this task, we verify if the following code flow produces sensible observations</w:t>
+      </w:r>
+    </w:p>
+    <w:p>
+      <w:pPr>
+        <w:tabs>
+          <w:tab w:val="left" w:pos="720" w:leader="none"/>
+        </w:tabs>
+        <w:spacing w:before="100" w:after="100" w:line="240"/>
+        <w:ind w:right="0" w:left="0" w:firstLine="0"/>
+        <w:jc w:val="left"/>
+        <w:rPr>
+          <w:rFonts w:ascii="Times New Roman" w:hAnsi="Times New Roman" w:cs="Times New Roman" w:eastAsia="Times New Roman"/>
+          <w:color w:val="auto"/>
+          <w:spacing w:val="0"/>
+          <w:position w:val="0"/>
+          <w:sz w:val="24"/>
+          <w:shd w:fill="auto" w:val="clear"/>
+        </w:rPr>
+      </w:pPr>
+      <w:r>
+        <w:rPr>
+          <w:rFonts w:ascii="Times New Roman" w:hAnsi="Times New Roman" w:cs="Times New Roman" w:eastAsia="Times New Roman"/>
+          <w:color w:val="auto"/>
+          <w:spacing w:val="0"/>
+          <w:position w:val="0"/>
+          <w:sz w:val="24"/>
+          <w:shd w:fill="auto" w:val="clear"/>
+        </w:rPr>
+        <w:t xml:space="preserve">Breakout</w:t>
+      </w:r>
+    </w:p>
+    <w:p>
+      <w:pPr>
+        <w:tabs>
+          <w:tab w:val="left" w:pos="720" w:leader="none"/>
+        </w:tabs>
+        <w:spacing w:before="100" w:after="100" w:line="240"/>
+        <w:ind w:right="0" w:left="0" w:firstLine="0"/>
+        <w:jc w:val="left"/>
+        <w:rPr>
+          <w:rFonts w:ascii="Times New Roman" w:hAnsi="Times New Roman" w:cs="Times New Roman" w:eastAsia="Times New Roman"/>
+          <w:color w:val="auto"/>
+          <w:spacing w:val="0"/>
+          <w:position w:val="0"/>
+          <w:sz w:val="24"/>
+          <w:shd w:fill="auto" w:val="clear"/>
+        </w:rPr>
+      </w:pPr>
+      <w:r>
+        <w:rPr>
+          <w:rFonts w:ascii="Cambria Math" w:hAnsi="Cambria Math" w:cs="Cambria Math" w:eastAsia="Cambria Math"/>
+          <w:color w:val="auto"/>
+          <w:spacing w:val="0"/>
+          <w:position w:val="0"/>
+          <w:sz w:val="24"/>
+          <w:shd w:fill="auto" w:val="clear"/>
+        </w:rPr>
+        <w:t xml:space="preserve">↓</w:t>
+      </w:r>
+    </w:p>
+    <w:p>
+      <w:pPr>
+        <w:tabs>
+          <w:tab w:val="left" w:pos="720" w:leader="none"/>
+        </w:tabs>
+        <w:spacing w:before="100" w:after="100" w:line="240"/>
+        <w:ind w:right="0" w:left="0" w:firstLine="0"/>
+        <w:jc w:val="left"/>
+        <w:rPr>
+          <w:rFonts w:ascii="Times New Roman" w:hAnsi="Times New Roman" w:cs="Times New Roman" w:eastAsia="Times New Roman"/>
+          <w:color w:val="auto"/>
+          <w:spacing w:val="0"/>
+          <w:position w:val="0"/>
+          <w:sz w:val="24"/>
+          <w:shd w:fill="auto" w:val="clear"/>
+        </w:rPr>
+      </w:pPr>
+      <w:r>
+        <w:rPr>
+          <w:rFonts w:ascii="Times New Roman" w:hAnsi="Times New Roman" w:cs="Times New Roman" w:eastAsia="Times New Roman"/>
+          <w:color w:val="auto"/>
+          <w:spacing w:val="0"/>
+          <w:position w:val="0"/>
+          <w:sz w:val="24"/>
+          <w:shd w:fill="auto" w:val="clear"/>
+        </w:rPr>
+        <w:t xml:space="preserve">Preprocessing</w:t>
+      </w:r>
+    </w:p>
+    <w:p>
+      <w:pPr>
+        <w:tabs>
+          <w:tab w:val="left" w:pos="720" w:leader="none"/>
+        </w:tabs>
+        <w:spacing w:before="100" w:after="100" w:line="240"/>
+        <w:ind w:right="0" w:left="0" w:firstLine="0"/>
+        <w:jc w:val="left"/>
+        <w:rPr>
+          <w:rFonts w:ascii="Times New Roman" w:hAnsi="Times New Roman" w:cs="Times New Roman" w:eastAsia="Times New Roman"/>
+          <w:color w:val="auto"/>
+          <w:spacing w:val="0"/>
+          <w:position w:val="0"/>
+          <w:sz w:val="24"/>
+          <w:shd w:fill="auto" w:val="clear"/>
+        </w:rPr>
+      </w:pPr>
+      <w:r>
+        <w:rPr>
+          <w:rFonts w:ascii="Cambria Math" w:hAnsi="Cambria Math" w:cs="Cambria Math" w:eastAsia="Cambria Math"/>
+          <w:color w:val="auto"/>
+          <w:spacing w:val="0"/>
+          <w:position w:val="0"/>
+          <w:sz w:val="24"/>
+          <w:shd w:fill="auto" w:val="clear"/>
+        </w:rPr>
+        <w:t xml:space="preserve">↓</w:t>
+      </w:r>
+    </w:p>
+    <w:p>
+      <w:pPr>
+        <w:tabs>
+          <w:tab w:val="left" w:pos="720" w:leader="none"/>
+        </w:tabs>
+        <w:spacing w:before="100" w:after="100" w:line="240"/>
+        <w:ind w:right="0" w:left="0" w:firstLine="0"/>
+        <w:jc w:val="left"/>
+        <w:rPr>
+          <w:rFonts w:ascii="Times New Roman" w:hAnsi="Times New Roman" w:cs="Times New Roman" w:eastAsia="Times New Roman"/>
+          <w:color w:val="auto"/>
+          <w:spacing w:val="0"/>
+          <w:position w:val="0"/>
+          <w:sz w:val="24"/>
+          <w:shd w:fill="auto" w:val="clear"/>
+        </w:rPr>
+      </w:pPr>
+      <w:r>
+        <w:rPr>
+          <w:rFonts w:ascii="Times New Roman" w:hAnsi="Times New Roman" w:cs="Times New Roman" w:eastAsia="Times New Roman"/>
+          <w:color w:val="auto"/>
+          <w:spacing w:val="0"/>
+          <w:position w:val="0"/>
+          <w:sz w:val="24"/>
+          <w:shd w:fill="auto" w:val="clear"/>
+        </w:rPr>
+        <w:t xml:space="preserve">Frame Stack</w:t>
+      </w:r>
+    </w:p>
+    <w:p>
+      <w:pPr>
         <w:spacing w:before="0" w:after="0" w:line="240"/>
         <w:ind w:right="0" w:left="0" w:firstLine="0"/>
         <w:jc w:val="left"/>
@@ -1726,6 +1900,17 @@
           <w:shd w:fill="auto" w:val="clear"/>
         </w:rPr>
       </w:pPr>
+      <w:r>
+        <w:rPr>
+          <w:rFonts w:ascii="Times New Roman" w:hAnsi="Times New Roman" w:cs="Times New Roman" w:eastAsia="Times New Roman"/>
+          <w:color w:val="auto"/>
+          <w:spacing w:val="0"/>
+          <w:position w:val="0"/>
+          <w:sz w:val="24"/>
+          <w:shd w:fill="auto" w:val="clear"/>
+        </w:rPr>
+        <w:t xml:space="preserve">Result: The Breakout environment is functioning correctly, frames are preprocessed to 84×84 grayscale, observations are stacked into a 4-frame state representation, and the resulting state tensor has shape (4,84,84), suitable for DQN training.</w:t>
+      </w:r>
     </w:p>
     <w:p>
       <w:pPr>
@@ -1811,7 +1996,7 @@
       <w:pPr>
         <w:numPr>
           <w:ilvl w:val="0"/>
-          <w:numId w:val="18"/>
+          <w:numId w:val="19"/>
         </w:numPr>
         <w:tabs>
           <w:tab w:val="left" w:pos="720" w:leader="none"/>
@@ -1844,7 +2029,7 @@
       <w:pPr>
         <w:numPr>
           <w:ilvl w:val="0"/>
-          <w:numId w:val="18"/>
+          <w:numId w:val="19"/>
         </w:numPr>
         <w:tabs>
           <w:tab w:val="left" w:pos="720" w:leader="none"/>
@@ -1877,7 +2062,7 @@
       <w:pPr>
         <w:numPr>
           <w:ilvl w:val="0"/>
-          <w:numId w:val="18"/>
+          <w:numId w:val="19"/>
         </w:numPr>
         <w:tabs>
           <w:tab w:val="left" w:pos="720" w:leader="none"/>
@@ -1938,7 +2123,7 @@
       <w:pPr>
         <w:numPr>
           <w:ilvl w:val="0"/>
-          <w:numId w:val="20"/>
+          <w:numId w:val="21"/>
         </w:numPr>
         <w:tabs>
           <w:tab w:val="left" w:pos="720" w:leader="none"/>
@@ -1971,7 +2156,7 @@
       <w:pPr>
         <w:numPr>
           <w:ilvl w:val="0"/>
-          <w:numId w:val="20"/>
+          <w:numId w:val="21"/>
         </w:numPr>
         <w:tabs>
           <w:tab w:val="left" w:pos="720" w:leader="none"/>
@@ -2004,7 +2189,7 @@
       <w:pPr>
         <w:numPr>
           <w:ilvl w:val="0"/>
-          <w:numId w:val="20"/>
+          <w:numId w:val="21"/>
         </w:numPr>
         <w:tabs>
           <w:tab w:val="left" w:pos="720" w:leader="none"/>
@@ -2065,7 +2250,7 @@
       <w:pPr>
         <w:numPr>
           <w:ilvl w:val="0"/>
-          <w:numId w:val="22"/>
+          <w:numId w:val="23"/>
         </w:numPr>
         <w:tabs>
           <w:tab w:val="left" w:pos="720" w:leader="none"/>
@@ -2098,7 +2283,7 @@
       <w:pPr>
         <w:numPr>
           <w:ilvl w:val="0"/>
-          <w:numId w:val="22"/>
+          <w:numId w:val="23"/>
         </w:numPr>
         <w:tabs>
           <w:tab w:val="left" w:pos="720" w:leader="none"/>
@@ -2131,7 +2316,7 @@
       <w:pPr>
         <w:numPr>
           <w:ilvl w:val="0"/>
-          <w:numId w:val="22"/>
+          <w:numId w:val="23"/>
         </w:numPr>
         <w:tabs>
           <w:tab w:val="left" w:pos="720" w:leader="none"/>
@@ -2192,7 +2377,7 @@
       <w:pPr>
         <w:numPr>
           <w:ilvl w:val="0"/>
-          <w:numId w:val="24"/>
+          <w:numId w:val="25"/>
         </w:numPr>
         <w:tabs>
           <w:tab w:val="left" w:pos="720" w:leader="none"/>
@@ -2225,7 +2410,7 @@
       <w:pPr>
         <w:numPr>
           <w:ilvl w:val="0"/>
-          <w:numId w:val="24"/>
+          <w:numId w:val="25"/>
         </w:numPr>
         <w:tabs>
           <w:tab w:val="left" w:pos="720" w:leader="none"/>
@@ -2258,7 +2443,7 @@
       <w:pPr>
         <w:numPr>
           <w:ilvl w:val="0"/>
-          <w:numId w:val="24"/>
+          <w:numId w:val="25"/>
         </w:numPr>
         <w:tabs>
           <w:tab w:val="left" w:pos="720" w:leader="none"/>
@@ -2319,7 +2504,7 @@
       <w:pPr>
         <w:numPr>
           <w:ilvl w:val="0"/>
-          <w:numId w:val="26"/>
+          <w:numId w:val="27"/>
         </w:numPr>
         <w:tabs>
           <w:tab w:val="left" w:pos="720" w:leader="none"/>
@@ -2352,7 +2537,7 @@
       <w:pPr>
         <w:numPr>
           <w:ilvl w:val="0"/>
-          <w:numId w:val="26"/>
+          <w:numId w:val="27"/>
         </w:numPr>
         <w:tabs>
           <w:tab w:val="left" w:pos="720" w:leader="none"/>
@@ -2385,7 +2570,7 @@
       <w:pPr>
         <w:numPr>
           <w:ilvl w:val="0"/>
-          <w:numId w:val="26"/>
+          <w:numId w:val="27"/>
         </w:numPr>
         <w:tabs>
           <w:tab w:val="left" w:pos="720" w:leader="none"/>
@@ -2446,7 +2631,7 @@
       <w:pPr>
         <w:numPr>
           <w:ilvl w:val="0"/>
-          <w:numId w:val="28"/>
+          <w:numId w:val="29"/>
         </w:numPr>
         <w:tabs>
           <w:tab w:val="left" w:pos="720" w:leader="none"/>
@@ -2479,7 +2664,7 @@
       <w:pPr>
         <w:numPr>
           <w:ilvl w:val="0"/>
-          <w:numId w:val="28"/>
+          <w:numId w:val="29"/>
         </w:numPr>
         <w:tabs>
           <w:tab w:val="left" w:pos="720" w:leader="none"/>
@@ -2512,7 +2697,7 @@
       <w:pPr>
         <w:numPr>
           <w:ilvl w:val="0"/>
-          <w:numId w:val="28"/>
+          <w:numId w:val="29"/>
         </w:numPr>
         <w:tabs>
           <w:tab w:val="left" w:pos="720" w:leader="none"/>
@@ -2545,7 +2730,7 @@
       <w:pPr>
         <w:numPr>
           <w:ilvl w:val="0"/>
-          <w:numId w:val="28"/>
+          <w:numId w:val="29"/>
         </w:numPr>
         <w:tabs>
           <w:tab w:val="left" w:pos="720" w:leader="none"/>
@@ -2578,7 +2763,7 @@
       <w:pPr>
         <w:numPr>
           <w:ilvl w:val="0"/>
-          <w:numId w:val="28"/>
+          <w:numId w:val="29"/>
         </w:numPr>
         <w:tabs>
           <w:tab w:val="left" w:pos="720" w:leader="none"/>
@@ -2639,7 +2824,7 @@
       <w:pPr>
         <w:numPr>
           <w:ilvl w:val="0"/>
-          <w:numId w:val="30"/>
+          <w:numId w:val="31"/>
         </w:numPr>
         <w:tabs>
           <w:tab w:val="left" w:pos="720" w:leader="none"/>
@@ -2672,7 +2857,7 @@
       <w:pPr>
         <w:numPr>
           <w:ilvl w:val="0"/>
-          <w:numId w:val="30"/>
+          <w:numId w:val="31"/>
         </w:numPr>
         <w:tabs>
           <w:tab w:val="left" w:pos="720" w:leader="none"/>
@@ -2705,7 +2890,7 @@
       <w:pPr>
         <w:numPr>
           <w:ilvl w:val="0"/>
-          <w:numId w:val="30"/>
+          <w:numId w:val="31"/>
         </w:numPr>
         <w:tabs>
           <w:tab w:val="left" w:pos="720" w:leader="none"/>
@@ -2738,7 +2923,7 @@
       <w:pPr>
         <w:numPr>
           <w:ilvl w:val="0"/>
-          <w:numId w:val="30"/>
+          <w:numId w:val="31"/>
         </w:numPr>
         <w:tabs>
           <w:tab w:val="left" w:pos="720" w:leader="none"/>
@@ -2866,7 +3051,7 @@
       <w:pPr>
         <w:numPr>
           <w:ilvl w:val="0"/>
-          <w:numId w:val="33"/>
+          <w:numId w:val="34"/>
         </w:numPr>
         <w:tabs>
           <w:tab w:val="left" w:pos="720" w:leader="none"/>
@@ -2899,7 +3084,7 @@
       <w:pPr>
         <w:numPr>
           <w:ilvl w:val="0"/>
-          <w:numId w:val="33"/>
+          <w:numId w:val="34"/>
         </w:numPr>
         <w:tabs>
           <w:tab w:val="left" w:pos="720" w:leader="none"/>
@@ -2932,7 +3117,7 @@
       <w:pPr>
         <w:numPr>
           <w:ilvl w:val="0"/>
-          <w:numId w:val="33"/>
+          <w:numId w:val="34"/>
         </w:numPr>
         <w:tabs>
           <w:tab w:val="left" w:pos="720" w:leader="none"/>
@@ -2993,7 +3178,7 @@
       <w:pPr>
         <w:numPr>
           <w:ilvl w:val="0"/>
-          <w:numId w:val="35"/>
+          <w:numId w:val="36"/>
         </w:numPr>
         <w:tabs>
           <w:tab w:val="left" w:pos="720" w:leader="none"/>
@@ -3026,7 +3211,7 @@
       <w:pPr>
         <w:numPr>
           <w:ilvl w:val="0"/>
-          <w:numId w:val="35"/>
+          <w:numId w:val="36"/>
         </w:numPr>
         <w:tabs>
           <w:tab w:val="left" w:pos="720" w:leader="none"/>
@@ -3059,7 +3244,7 @@
       <w:pPr>
         <w:numPr>
           <w:ilvl w:val="0"/>
-          <w:numId w:val="35"/>
+          <w:numId w:val="36"/>
         </w:numPr>
         <w:tabs>
           <w:tab w:val="left" w:pos="720" w:leader="none"/>
@@ -3187,7 +3372,7 @@
       <w:pPr>
         <w:numPr>
           <w:ilvl w:val="0"/>
-          <w:numId w:val="38"/>
+          <w:numId w:val="39"/>
         </w:numPr>
         <w:tabs>
           <w:tab w:val="left" w:pos="720" w:leader="none"/>
@@ -3220,7 +3405,7 @@
       <w:pPr>
         <w:numPr>
           <w:ilvl w:val="0"/>
-          <w:numId w:val="38"/>
+          <w:numId w:val="39"/>
         </w:numPr>
         <w:tabs>
           <w:tab w:val="left" w:pos="720" w:leader="none"/>
@@ -3253,7 +3438,7 @@
       <w:pPr>
         <w:numPr>
           <w:ilvl w:val="0"/>
-          <w:numId w:val="38"/>
+          <w:numId w:val="39"/>
         </w:numPr>
         <w:tabs>
           <w:tab w:val="left" w:pos="720" w:leader="none"/>
@@ -3314,7 +3499,7 @@
       <w:pPr>
         <w:numPr>
           <w:ilvl w:val="0"/>
-          <w:numId w:val="40"/>
+          <w:numId w:val="41"/>
         </w:numPr>
         <w:tabs>
           <w:tab w:val="left" w:pos="720" w:leader="none"/>
@@ -3347,7 +3532,7 @@
       <w:pPr>
         <w:numPr>
           <w:ilvl w:val="0"/>
-          <w:numId w:val="40"/>
+          <w:numId w:val="41"/>
         </w:numPr>
         <w:tabs>
           <w:tab w:val="left" w:pos="720" w:leader="none"/>
@@ -3475,7 +3660,7 @@
       <w:pPr>
         <w:numPr>
           <w:ilvl w:val="0"/>
-          <w:numId w:val="43"/>
+          <w:numId w:val="44"/>
         </w:numPr>
         <w:tabs>
           <w:tab w:val="left" w:pos="720" w:leader="none"/>
@@ -3508,7 +3693,7 @@
       <w:pPr>
         <w:numPr>
           <w:ilvl w:val="0"/>
-          <w:numId w:val="43"/>
+          <w:numId w:val="44"/>
         </w:numPr>
         <w:tabs>
           <w:tab w:val="left" w:pos="720" w:leader="none"/>
@@ -3541,7 +3726,7 @@
       <w:pPr>
         <w:numPr>
           <w:ilvl w:val="0"/>
-          <w:numId w:val="43"/>
+          <w:numId w:val="44"/>
         </w:numPr>
         <w:tabs>
           <w:tab w:val="left" w:pos="720" w:leader="none"/>
@@ -3574,7 +3759,7 @@
       <w:pPr>
         <w:numPr>
           <w:ilvl w:val="0"/>
-          <w:numId w:val="43"/>
+          <w:numId w:val="44"/>
         </w:numPr>
         <w:tabs>
           <w:tab w:val="left" w:pos="720" w:leader="none"/>
@@ -3635,7 +3820,7 @@
       <w:pPr>
         <w:numPr>
           <w:ilvl w:val="0"/>
-          <w:numId w:val="45"/>
+          <w:numId w:val="46"/>
         </w:numPr>
         <w:tabs>
           <w:tab w:val="left" w:pos="720" w:leader="none"/>
@@ -3668,7 +3853,7 @@
       <w:pPr>
         <w:numPr>
           <w:ilvl w:val="0"/>
-          <w:numId w:val="45"/>
+          <w:numId w:val="46"/>
         </w:numPr>
         <w:tabs>
           <w:tab w:val="left" w:pos="720" w:leader="none"/>
@@ -3796,7 +3981,7 @@
       <w:pPr>
         <w:numPr>
           <w:ilvl w:val="0"/>
-          <w:numId w:val="48"/>
+          <w:numId w:val="49"/>
         </w:numPr>
         <w:tabs>
           <w:tab w:val="left" w:pos="720" w:leader="none"/>
@@ -3829,7 +4014,7 @@
       <w:pPr>
         <w:numPr>
           <w:ilvl w:val="0"/>
-          <w:numId w:val="48"/>
+          <w:numId w:val="49"/>
         </w:numPr>
         <w:tabs>
           <w:tab w:val="left" w:pos="720" w:leader="none"/>
@@ -3862,7 +4047,7 @@
       <w:pPr>
         <w:numPr>
           <w:ilvl w:val="0"/>
-          <w:numId w:val="48"/>
+          <w:numId w:val="49"/>
         </w:numPr>
         <w:tabs>
           <w:tab w:val="left" w:pos="720" w:leader="none"/>
@@ -3923,7 +4108,7 @@
       <w:pPr>
         <w:numPr>
           <w:ilvl w:val="0"/>
-          <w:numId w:val="50"/>
+          <w:numId w:val="51"/>
         </w:numPr>
         <w:tabs>
           <w:tab w:val="left" w:pos="720" w:leader="none"/>
@@ -3956,7 +4141,7 @@
       <w:pPr>
         <w:numPr>
           <w:ilvl w:val="0"/>
-          <w:numId w:val="50"/>
+          <w:numId w:val="51"/>
         </w:numPr>
         <w:tabs>
           <w:tab w:val="left" w:pos="720" w:leader="none"/>
@@ -3989,7 +4174,7 @@
       <w:pPr>
         <w:numPr>
           <w:ilvl w:val="0"/>
-          <w:numId w:val="50"/>
+          <w:numId w:val="51"/>
         </w:numPr>
         <w:tabs>
           <w:tab w:val="left" w:pos="720" w:leader="none"/>
@@ -4050,7 +4235,7 @@
       <w:pPr>
         <w:numPr>
           <w:ilvl w:val="0"/>
-          <w:numId w:val="52"/>
+          <w:numId w:val="53"/>
         </w:numPr>
         <w:tabs>
           <w:tab w:val="left" w:pos="720" w:leader="none"/>
@@ -4083,7 +4268,7 @@
       <w:pPr>
         <w:numPr>
           <w:ilvl w:val="0"/>
-          <w:numId w:val="52"/>
+          <w:numId w:val="53"/>
         </w:numPr>
         <w:tabs>
           <w:tab w:val="left" w:pos="720" w:leader="none"/>
@@ -4116,7 +4301,7 @@
       <w:pPr>
         <w:numPr>
           <w:ilvl w:val="0"/>
-          <w:numId w:val="52"/>
+          <w:numId w:val="53"/>
         </w:numPr>
         <w:tabs>
           <w:tab w:val="left" w:pos="720" w:leader="none"/>
@@ -4149,7 +4334,7 @@
       <w:pPr>
         <w:numPr>
           <w:ilvl w:val="0"/>
-          <w:numId w:val="52"/>
+          <w:numId w:val="53"/>
         </w:numPr>
         <w:tabs>
           <w:tab w:val="left" w:pos="720" w:leader="none"/>
@@ -4277,7 +4462,7 @@
       <w:pPr>
         <w:numPr>
           <w:ilvl w:val="0"/>
-          <w:numId w:val="55"/>
+          <w:numId w:val="56"/>
         </w:numPr>
         <w:tabs>
           <w:tab w:val="left" w:pos="720" w:leader="none"/>
@@ -4310,7 +4495,7 @@
       <w:pPr>
         <w:numPr>
           <w:ilvl w:val="0"/>
-          <w:numId w:val="55"/>
+          <w:numId w:val="56"/>
         </w:numPr>
         <w:tabs>
           <w:tab w:val="left" w:pos="720" w:leader="none"/>
@@ -4343,7 +4528,7 @@
       <w:pPr>
         <w:numPr>
           <w:ilvl w:val="0"/>
-          <w:numId w:val="55"/>
+          <w:numId w:val="56"/>
         </w:numPr>
         <w:tabs>
           <w:tab w:val="left" w:pos="720" w:leader="none"/>
@@ -4404,7 +4589,7 @@
       <w:pPr>
         <w:numPr>
           <w:ilvl w:val="0"/>
-          <w:numId w:val="57"/>
+          <w:numId w:val="58"/>
         </w:numPr>
         <w:tabs>
           <w:tab w:val="left" w:pos="720" w:leader="none"/>
@@ -4437,7 +4622,7 @@
       <w:pPr>
         <w:numPr>
           <w:ilvl w:val="0"/>
-          <w:numId w:val="57"/>
+          <w:numId w:val="58"/>
         </w:numPr>
         <w:tabs>
           <w:tab w:val="left" w:pos="720" w:leader="none"/>
@@ -4470,7 +4655,7 @@
       <w:pPr>
         <w:numPr>
           <w:ilvl w:val="0"/>
-          <w:numId w:val="57"/>
+          <w:numId w:val="58"/>
         </w:numPr>
         <w:tabs>
           <w:tab w:val="left" w:pos="720" w:leader="none"/>
@@ -4531,7 +4716,7 @@
       <w:pPr>
         <w:numPr>
           <w:ilvl w:val="0"/>
-          <w:numId w:val="59"/>
+          <w:numId w:val="60"/>
         </w:numPr>
         <w:tabs>
           <w:tab w:val="left" w:pos="720" w:leader="none"/>
@@ -4564,7 +4749,7 @@
       <w:pPr>
         <w:numPr>
           <w:ilvl w:val="0"/>
-          <w:numId w:val="59"/>
+          <w:numId w:val="60"/>
         </w:numPr>
         <w:tabs>
           <w:tab w:val="left" w:pos="720" w:leader="none"/>
@@ -4625,7 +4810,7 @@
       <w:pPr>
         <w:numPr>
           <w:ilvl w:val="0"/>
-          <w:numId w:val="61"/>
+          <w:numId w:val="62"/>
         </w:numPr>
         <w:tabs>
           <w:tab w:val="left" w:pos="720" w:leader="none"/>
@@ -4658,7 +4843,7 @@
       <w:pPr>
         <w:numPr>
           <w:ilvl w:val="0"/>
-          <w:numId w:val="61"/>
+          <w:numId w:val="62"/>
         </w:numPr>
         <w:tabs>
           <w:tab w:val="left" w:pos="720" w:leader="none"/>
@@ -4691,7 +4876,7 @@
       <w:pPr>
         <w:numPr>
           <w:ilvl w:val="0"/>
-          <w:numId w:val="61"/>
+          <w:numId w:val="62"/>
         </w:numPr>
         <w:tabs>
           <w:tab w:val="left" w:pos="720" w:leader="none"/>
@@ -4724,7 +4909,7 @@
       <w:pPr>
         <w:numPr>
           <w:ilvl w:val="0"/>
-          <w:numId w:val="61"/>
+          <w:numId w:val="62"/>
         </w:numPr>
         <w:tabs>
           <w:tab w:val="left" w:pos="720" w:leader="none"/>
@@ -4757,7 +4942,7 @@
       <w:pPr>
         <w:numPr>
           <w:ilvl w:val="0"/>
-          <w:numId w:val="61"/>
+          <w:numId w:val="62"/>
         </w:numPr>
         <w:tabs>
           <w:tab w:val="left" w:pos="720" w:leader="none"/>
@@ -4790,7 +4975,7 @@
       <w:pPr>
         <w:numPr>
           <w:ilvl w:val="0"/>
-          <w:numId w:val="61"/>
+          <w:numId w:val="62"/>
         </w:numPr>
         <w:tabs>
           <w:tab w:val="left" w:pos="720" w:leader="none"/>
@@ -5030,64 +5215,64 @@
   <w:num w:numId="15">
     <w:abstractNumId w:val="120"/>
   </w:num>
-  <w:num w:numId="18">
+  <w:num w:numId="19">
     <w:abstractNumId w:val="114"/>
   </w:num>
-  <w:num w:numId="20">
+  <w:num w:numId="21">
     <w:abstractNumId w:val="108"/>
   </w:num>
-  <w:num w:numId="22">
+  <w:num w:numId="23">
     <w:abstractNumId w:val="102"/>
   </w:num>
-  <w:num w:numId="24">
+  <w:num w:numId="25">
     <w:abstractNumId w:val="96"/>
   </w:num>
-  <w:num w:numId="26">
+  <w:num w:numId="27">
     <w:abstractNumId w:val="90"/>
   </w:num>
-  <w:num w:numId="28">
+  <w:num w:numId="29">
     <w:abstractNumId w:val="84"/>
   </w:num>
-  <w:num w:numId="30">
+  <w:num w:numId="31">
     <w:abstractNumId w:val="78"/>
   </w:num>
-  <w:num w:numId="33">
+  <w:num w:numId="34">
     <w:abstractNumId w:val="72"/>
   </w:num>
-  <w:num w:numId="35">
+  <w:num w:numId="36">
     <w:abstractNumId w:val="66"/>
   </w:num>
-  <w:num w:numId="38">
+  <w:num w:numId="39">
     <w:abstractNumId w:val="60"/>
   </w:num>
-  <w:num w:numId="40">
+  <w:num w:numId="41">
     <w:abstractNumId w:val="54"/>
   </w:num>
-  <w:num w:numId="43">
+  <w:num w:numId="44">
     <w:abstractNumId w:val="48"/>
   </w:num>
-  <w:num w:numId="45">
+  <w:num w:numId="46">
     <w:abstractNumId w:val="42"/>
   </w:num>
-  <w:num w:numId="48">
+  <w:num w:numId="49">
     <w:abstractNumId w:val="36"/>
   </w:num>
-  <w:num w:numId="50">
+  <w:num w:numId="51">
     <w:abstractNumId w:val="30"/>
   </w:num>
-  <w:num w:numId="52">
+  <w:num w:numId="53">
     <w:abstractNumId w:val="24"/>
   </w:num>
-  <w:num w:numId="55">
+  <w:num w:numId="56">
     <w:abstractNumId w:val="18"/>
   </w:num>
-  <w:num w:numId="57">
+  <w:num w:numId="58">
     <w:abstractNumId w:val="12"/>
   </w:num>
-  <w:num w:numId="59">
+  <w:num w:numId="60">
     <w:abstractNumId w:val="6"/>
   </w:num>
-  <w:num w:numId="61">
+  <w:num w:numId="62">
     <w:abstractNumId w:val="0"/>
   </w:num>
 </w:numbering>

</xml_diff>

<commit_message>
modified project details file after implementation of task 7
</commit_message>
<xml_diff>
--- a/Project_details.docx
+++ b/Project_details.docx
@@ -2220,6 +2220,209 @@
     </w:p>
     <w:p>
       <w:pPr>
+        <w:tabs>
+          <w:tab w:val="left" w:pos="720" w:leader="none"/>
+        </w:tabs>
+        <w:spacing w:before="100" w:after="100" w:line="240"/>
+        <w:ind w:right="0" w:left="0" w:firstLine="0"/>
+        <w:jc w:val="left"/>
+        <w:rPr>
+          <w:rFonts w:ascii="Times New Roman" w:hAnsi="Times New Roman" w:cs="Times New Roman" w:eastAsia="Times New Roman"/>
+          <w:color w:val="auto"/>
+          <w:spacing w:val="0"/>
+          <w:position w:val="0"/>
+          <w:sz w:val="24"/>
+          <w:shd w:fill="auto" w:val="clear"/>
+        </w:rPr>
+      </w:pPr>
+      <w:r>
+        <w:rPr>
+          <w:rFonts w:ascii="Times New Roman" w:hAnsi="Times New Roman" w:cs="Times New Roman" w:eastAsia="Times New Roman"/>
+          <w:color w:val="auto"/>
+          <w:spacing w:val="0"/>
+          <w:position w:val="0"/>
+          <w:sz w:val="24"/>
+          <w:shd w:fill="auto" w:val="clear"/>
+        </w:rPr>
+        <w:t xml:space="preserve">3 conv layers + 2 FC layers is the standard DQN Architecture. DeepMind found it to work well for many Atari games. Lesser layers means easier training, lesser learning. More layers means harder training, more learning. We use a sweet spot in-between.</w:t>
+      </w:r>
+    </w:p>
+    <w:p>
+      <w:pPr>
+        <w:tabs>
+          <w:tab w:val="left" w:pos="720" w:leader="none"/>
+        </w:tabs>
+        <w:spacing w:before="100" w:after="100" w:line="240"/>
+        <w:ind w:right="0" w:left="0" w:firstLine="0"/>
+        <w:jc w:val="left"/>
+        <w:rPr>
+          <w:rFonts w:ascii="Times New Roman" w:hAnsi="Times New Roman" w:cs="Times New Roman" w:eastAsia="Times New Roman"/>
+          <w:color w:val="auto"/>
+          <w:spacing w:val="0"/>
+          <w:position w:val="0"/>
+          <w:sz w:val="24"/>
+          <w:shd w:fill="auto" w:val="clear"/>
+        </w:rPr>
+      </w:pPr>
+      <w:r>
+        <w:rPr>
+          <w:rFonts w:ascii="Times New Roman" w:hAnsi="Times New Roman" w:cs="Times New Roman" w:eastAsia="Times New Roman"/>
+          <w:color w:val="auto"/>
+          <w:spacing w:val="0"/>
+          <w:position w:val="0"/>
+          <w:sz w:val="24"/>
+          <w:shd w:fill="auto" w:val="clear"/>
+        </w:rPr>
+        <w:t xml:space="preserve">The reason we use this exact structure is:</w:t>
+      </w:r>
+    </w:p>
+    <w:p>
+      <w:pPr>
+        <w:tabs>
+          <w:tab w:val="left" w:pos="720" w:leader="none"/>
+        </w:tabs>
+        <w:spacing w:before="100" w:after="100" w:line="240"/>
+        <w:ind w:right="0" w:left="0" w:firstLine="0"/>
+        <w:jc w:val="left"/>
+        <w:rPr>
+          <w:rFonts w:ascii="Times New Roman" w:hAnsi="Times New Roman" w:cs="Times New Roman" w:eastAsia="Times New Roman"/>
+          <w:color w:val="auto"/>
+          <w:spacing w:val="0"/>
+          <w:position w:val="0"/>
+          <w:sz w:val="24"/>
+          <w:shd w:fill="auto" w:val="clear"/>
+        </w:rPr>
+      </w:pPr>
+      <w:r>
+        <w:rPr>
+          <w:rFonts w:ascii="Times New Roman" w:hAnsi="Times New Roman" w:cs="Times New Roman" w:eastAsia="Times New Roman"/>
+          <w:color w:val="auto"/>
+          <w:spacing w:val="0"/>
+          <w:position w:val="0"/>
+          <w:sz w:val="24"/>
+          <w:shd w:fill="auto" w:val="clear"/>
+        </w:rPr>
+        <w:t xml:space="preserve">proven on Atari</w:t>
+      </w:r>
+    </w:p>
+    <w:p>
+      <w:pPr>
+        <w:tabs>
+          <w:tab w:val="left" w:pos="720" w:leader="none"/>
+        </w:tabs>
+        <w:spacing w:before="100" w:after="100" w:line="240"/>
+        <w:ind w:right="0" w:left="0" w:firstLine="0"/>
+        <w:jc w:val="left"/>
+        <w:rPr>
+          <w:rFonts w:ascii="Times New Roman" w:hAnsi="Times New Roman" w:cs="Times New Roman" w:eastAsia="Times New Roman"/>
+          <w:color w:val="auto"/>
+          <w:spacing w:val="0"/>
+          <w:position w:val="0"/>
+          <w:sz w:val="24"/>
+          <w:shd w:fill="auto" w:val="clear"/>
+        </w:rPr>
+      </w:pPr>
+      <w:r>
+        <w:rPr>
+          <w:rFonts w:ascii="Times New Roman" w:hAnsi="Times New Roman" w:cs="Times New Roman" w:eastAsia="Times New Roman"/>
+          <w:color w:val="auto"/>
+          <w:spacing w:val="0"/>
+          <w:position w:val="0"/>
+          <w:sz w:val="24"/>
+          <w:shd w:fill="auto" w:val="clear"/>
+        </w:rPr>
+        <w:t xml:space="preserve">easy to implement</w:t>
+      </w:r>
+    </w:p>
+    <w:p>
+      <w:pPr>
+        <w:tabs>
+          <w:tab w:val="left" w:pos="720" w:leader="none"/>
+        </w:tabs>
+        <w:spacing w:before="100" w:after="100" w:line="240"/>
+        <w:ind w:right="0" w:left="0" w:firstLine="0"/>
+        <w:jc w:val="left"/>
+        <w:rPr>
+          <w:rFonts w:ascii="Times New Roman" w:hAnsi="Times New Roman" w:cs="Times New Roman" w:eastAsia="Times New Roman"/>
+          <w:color w:val="auto"/>
+          <w:spacing w:val="0"/>
+          <w:position w:val="0"/>
+          <w:sz w:val="24"/>
+          <w:shd w:fill="auto" w:val="clear"/>
+        </w:rPr>
+      </w:pPr>
+      <w:r>
+        <w:rPr>
+          <w:rFonts w:ascii="Times New Roman" w:hAnsi="Times New Roman" w:cs="Times New Roman" w:eastAsia="Times New Roman"/>
+          <w:color w:val="auto"/>
+          <w:spacing w:val="0"/>
+          <w:position w:val="0"/>
+          <w:sz w:val="24"/>
+          <w:shd w:fill="auto" w:val="clear"/>
+        </w:rPr>
+        <w:t xml:space="preserve">widely recognized</w:t>
+      </w:r>
+    </w:p>
+    <w:p>
+      <w:pPr>
+        <w:tabs>
+          <w:tab w:val="left" w:pos="720" w:leader="none"/>
+        </w:tabs>
+        <w:spacing w:before="100" w:after="100" w:line="240"/>
+        <w:ind w:right="0" w:left="0" w:firstLine="0"/>
+        <w:jc w:val="left"/>
+        <w:rPr>
+          <w:rFonts w:ascii="Times New Roman" w:hAnsi="Times New Roman" w:cs="Times New Roman" w:eastAsia="Times New Roman"/>
+          <w:color w:val="auto"/>
+          <w:spacing w:val="0"/>
+          <w:position w:val="0"/>
+          <w:sz w:val="24"/>
+          <w:shd w:fill="auto" w:val="clear"/>
+        </w:rPr>
+      </w:pPr>
+      <w:r>
+        <w:rPr>
+          <w:rFonts w:ascii="Times New Roman" w:hAnsi="Times New Roman" w:cs="Times New Roman" w:eastAsia="Times New Roman"/>
+          <w:color w:val="auto"/>
+          <w:spacing w:val="0"/>
+          <w:position w:val="0"/>
+          <w:sz w:val="24"/>
+          <w:shd w:fill="auto" w:val="clear"/>
+        </w:rPr>
+        <w:t xml:space="preserve">easy to explain in a project presentation</w:t>
+      </w:r>
+    </w:p>
+    <w:p>
+      <w:pPr>
+        <w:tabs>
+          <w:tab w:val="left" w:pos="720" w:leader="none"/>
+        </w:tabs>
+        <w:spacing w:before="100" w:after="100" w:line="240"/>
+        <w:ind w:right="0" w:left="0" w:firstLine="0"/>
+        <w:jc w:val="left"/>
+        <w:rPr>
+          <w:rFonts w:ascii="Times New Roman" w:hAnsi="Times New Roman" w:cs="Times New Roman" w:eastAsia="Times New Roman"/>
+          <w:color w:val="auto"/>
+          <w:spacing w:val="0"/>
+          <w:position w:val="0"/>
+          <w:sz w:val="24"/>
+          <w:shd w:fill="auto" w:val="clear"/>
+        </w:rPr>
+      </w:pPr>
+      <w:r>
+        <w:rPr>
+          <w:rFonts w:ascii="Times New Roman" w:hAnsi="Times New Roman" w:cs="Times New Roman" w:eastAsia="Times New Roman"/>
+          <w:color w:val="auto"/>
+          <w:spacing w:val="0"/>
+          <w:position w:val="0"/>
+          <w:sz w:val="24"/>
+          <w:shd w:fill="auto" w:val="clear"/>
+        </w:rPr>
+        <w:t xml:space="preserve">gives a fair baseline for comparing DQN and Double DQN</w:t>
+      </w:r>
+    </w:p>
+    <w:p>
+      <w:pPr>
         <w:spacing w:before="100" w:after="100" w:line="240"/>
         <w:ind w:right="0" w:left="0" w:firstLine="0"/>
         <w:jc w:val="left"/>
@@ -2250,7 +2453,7 @@
       <w:pPr>
         <w:numPr>
           <w:ilvl w:val="0"/>
-          <w:numId w:val="23"/>
+          <w:numId w:val="24"/>
         </w:numPr>
         <w:tabs>
           <w:tab w:val="left" w:pos="720" w:leader="none"/>
@@ -2283,7 +2486,7 @@
       <w:pPr>
         <w:numPr>
           <w:ilvl w:val="0"/>
-          <w:numId w:val="23"/>
+          <w:numId w:val="24"/>
         </w:numPr>
         <w:tabs>
           <w:tab w:val="left" w:pos="720" w:leader="none"/>
@@ -2316,7 +2519,7 @@
       <w:pPr>
         <w:numPr>
           <w:ilvl w:val="0"/>
-          <w:numId w:val="23"/>
+          <w:numId w:val="24"/>
         </w:numPr>
         <w:tabs>
           <w:tab w:val="left" w:pos="720" w:leader="none"/>
@@ -2377,7 +2580,7 @@
       <w:pPr>
         <w:numPr>
           <w:ilvl w:val="0"/>
-          <w:numId w:val="25"/>
+          <w:numId w:val="26"/>
         </w:numPr>
         <w:tabs>
           <w:tab w:val="left" w:pos="720" w:leader="none"/>
@@ -2410,7 +2613,7 @@
       <w:pPr>
         <w:numPr>
           <w:ilvl w:val="0"/>
-          <w:numId w:val="25"/>
+          <w:numId w:val="26"/>
         </w:numPr>
         <w:tabs>
           <w:tab w:val="left" w:pos="720" w:leader="none"/>
@@ -2443,7 +2646,7 @@
       <w:pPr>
         <w:numPr>
           <w:ilvl w:val="0"/>
-          <w:numId w:val="25"/>
+          <w:numId w:val="26"/>
         </w:numPr>
         <w:tabs>
           <w:tab w:val="left" w:pos="720" w:leader="none"/>
@@ -2504,7 +2707,7 @@
       <w:pPr>
         <w:numPr>
           <w:ilvl w:val="0"/>
-          <w:numId w:val="27"/>
+          <w:numId w:val="28"/>
         </w:numPr>
         <w:tabs>
           <w:tab w:val="left" w:pos="720" w:leader="none"/>
@@ -2537,7 +2740,7 @@
       <w:pPr>
         <w:numPr>
           <w:ilvl w:val="0"/>
-          <w:numId w:val="27"/>
+          <w:numId w:val="28"/>
         </w:numPr>
         <w:tabs>
           <w:tab w:val="left" w:pos="720" w:leader="none"/>
@@ -2570,7 +2773,7 @@
       <w:pPr>
         <w:numPr>
           <w:ilvl w:val="0"/>
-          <w:numId w:val="27"/>
+          <w:numId w:val="28"/>
         </w:numPr>
         <w:tabs>
           <w:tab w:val="left" w:pos="720" w:leader="none"/>
@@ -2631,7 +2834,7 @@
       <w:pPr>
         <w:numPr>
           <w:ilvl w:val="0"/>
-          <w:numId w:val="29"/>
+          <w:numId w:val="30"/>
         </w:numPr>
         <w:tabs>
           <w:tab w:val="left" w:pos="720" w:leader="none"/>
@@ -2664,7 +2867,7 @@
       <w:pPr>
         <w:numPr>
           <w:ilvl w:val="0"/>
-          <w:numId w:val="29"/>
+          <w:numId w:val="30"/>
         </w:numPr>
         <w:tabs>
           <w:tab w:val="left" w:pos="720" w:leader="none"/>
@@ -2697,7 +2900,7 @@
       <w:pPr>
         <w:numPr>
           <w:ilvl w:val="0"/>
-          <w:numId w:val="29"/>
+          <w:numId w:val="30"/>
         </w:numPr>
         <w:tabs>
           <w:tab w:val="left" w:pos="720" w:leader="none"/>
@@ -2730,7 +2933,7 @@
       <w:pPr>
         <w:numPr>
           <w:ilvl w:val="0"/>
-          <w:numId w:val="29"/>
+          <w:numId w:val="30"/>
         </w:numPr>
         <w:tabs>
           <w:tab w:val="left" w:pos="720" w:leader="none"/>
@@ -2763,7 +2966,7 @@
       <w:pPr>
         <w:numPr>
           <w:ilvl w:val="0"/>
-          <w:numId w:val="29"/>
+          <w:numId w:val="30"/>
         </w:numPr>
         <w:tabs>
           <w:tab w:val="left" w:pos="720" w:leader="none"/>
@@ -2824,7 +3027,7 @@
       <w:pPr>
         <w:numPr>
           <w:ilvl w:val="0"/>
-          <w:numId w:val="31"/>
+          <w:numId w:val="32"/>
         </w:numPr>
         <w:tabs>
           <w:tab w:val="left" w:pos="720" w:leader="none"/>
@@ -2857,7 +3060,7 @@
       <w:pPr>
         <w:numPr>
           <w:ilvl w:val="0"/>
-          <w:numId w:val="31"/>
+          <w:numId w:val="32"/>
         </w:numPr>
         <w:tabs>
           <w:tab w:val="left" w:pos="720" w:leader="none"/>
@@ -2890,7 +3093,7 @@
       <w:pPr>
         <w:numPr>
           <w:ilvl w:val="0"/>
-          <w:numId w:val="31"/>
+          <w:numId w:val="32"/>
         </w:numPr>
         <w:tabs>
           <w:tab w:val="left" w:pos="720" w:leader="none"/>
@@ -2923,7 +3126,7 @@
       <w:pPr>
         <w:numPr>
           <w:ilvl w:val="0"/>
-          <w:numId w:val="31"/>
+          <w:numId w:val="32"/>
         </w:numPr>
         <w:tabs>
           <w:tab w:val="left" w:pos="720" w:leader="none"/>
@@ -3051,7 +3254,7 @@
       <w:pPr>
         <w:numPr>
           <w:ilvl w:val="0"/>
-          <w:numId w:val="34"/>
+          <w:numId w:val="35"/>
         </w:numPr>
         <w:tabs>
           <w:tab w:val="left" w:pos="720" w:leader="none"/>
@@ -3084,7 +3287,7 @@
       <w:pPr>
         <w:numPr>
           <w:ilvl w:val="0"/>
-          <w:numId w:val="34"/>
+          <w:numId w:val="35"/>
         </w:numPr>
         <w:tabs>
           <w:tab w:val="left" w:pos="720" w:leader="none"/>
@@ -3117,7 +3320,7 @@
       <w:pPr>
         <w:numPr>
           <w:ilvl w:val="0"/>
-          <w:numId w:val="34"/>
+          <w:numId w:val="35"/>
         </w:numPr>
         <w:tabs>
           <w:tab w:val="left" w:pos="720" w:leader="none"/>
@@ -3178,7 +3381,7 @@
       <w:pPr>
         <w:numPr>
           <w:ilvl w:val="0"/>
-          <w:numId w:val="36"/>
+          <w:numId w:val="37"/>
         </w:numPr>
         <w:tabs>
           <w:tab w:val="left" w:pos="720" w:leader="none"/>
@@ -3211,7 +3414,7 @@
       <w:pPr>
         <w:numPr>
           <w:ilvl w:val="0"/>
-          <w:numId w:val="36"/>
+          <w:numId w:val="37"/>
         </w:numPr>
         <w:tabs>
           <w:tab w:val="left" w:pos="720" w:leader="none"/>
@@ -3244,7 +3447,7 @@
       <w:pPr>
         <w:numPr>
           <w:ilvl w:val="0"/>
-          <w:numId w:val="36"/>
+          <w:numId w:val="37"/>
         </w:numPr>
         <w:tabs>
           <w:tab w:val="left" w:pos="720" w:leader="none"/>
@@ -3372,7 +3575,7 @@
       <w:pPr>
         <w:numPr>
           <w:ilvl w:val="0"/>
-          <w:numId w:val="39"/>
+          <w:numId w:val="40"/>
         </w:numPr>
         <w:tabs>
           <w:tab w:val="left" w:pos="720" w:leader="none"/>
@@ -3405,7 +3608,7 @@
       <w:pPr>
         <w:numPr>
           <w:ilvl w:val="0"/>
-          <w:numId w:val="39"/>
+          <w:numId w:val="40"/>
         </w:numPr>
         <w:tabs>
           <w:tab w:val="left" w:pos="720" w:leader="none"/>
@@ -3438,7 +3641,7 @@
       <w:pPr>
         <w:numPr>
           <w:ilvl w:val="0"/>
-          <w:numId w:val="39"/>
+          <w:numId w:val="40"/>
         </w:numPr>
         <w:tabs>
           <w:tab w:val="left" w:pos="720" w:leader="none"/>
@@ -3499,7 +3702,7 @@
       <w:pPr>
         <w:numPr>
           <w:ilvl w:val="0"/>
-          <w:numId w:val="41"/>
+          <w:numId w:val="42"/>
         </w:numPr>
         <w:tabs>
           <w:tab w:val="left" w:pos="720" w:leader="none"/>
@@ -3532,7 +3735,7 @@
       <w:pPr>
         <w:numPr>
           <w:ilvl w:val="0"/>
-          <w:numId w:val="41"/>
+          <w:numId w:val="42"/>
         </w:numPr>
         <w:tabs>
           <w:tab w:val="left" w:pos="720" w:leader="none"/>
@@ -3660,7 +3863,7 @@
       <w:pPr>
         <w:numPr>
           <w:ilvl w:val="0"/>
-          <w:numId w:val="44"/>
+          <w:numId w:val="45"/>
         </w:numPr>
         <w:tabs>
           <w:tab w:val="left" w:pos="720" w:leader="none"/>
@@ -3693,7 +3896,7 @@
       <w:pPr>
         <w:numPr>
           <w:ilvl w:val="0"/>
-          <w:numId w:val="44"/>
+          <w:numId w:val="45"/>
         </w:numPr>
         <w:tabs>
           <w:tab w:val="left" w:pos="720" w:leader="none"/>
@@ -3726,7 +3929,7 @@
       <w:pPr>
         <w:numPr>
           <w:ilvl w:val="0"/>
-          <w:numId w:val="44"/>
+          <w:numId w:val="45"/>
         </w:numPr>
         <w:tabs>
           <w:tab w:val="left" w:pos="720" w:leader="none"/>
@@ -3759,7 +3962,7 @@
       <w:pPr>
         <w:numPr>
           <w:ilvl w:val="0"/>
-          <w:numId w:val="44"/>
+          <w:numId w:val="45"/>
         </w:numPr>
         <w:tabs>
           <w:tab w:val="left" w:pos="720" w:leader="none"/>
@@ -3820,7 +4023,7 @@
       <w:pPr>
         <w:numPr>
           <w:ilvl w:val="0"/>
-          <w:numId w:val="46"/>
+          <w:numId w:val="47"/>
         </w:numPr>
         <w:tabs>
           <w:tab w:val="left" w:pos="720" w:leader="none"/>
@@ -3853,7 +4056,7 @@
       <w:pPr>
         <w:numPr>
           <w:ilvl w:val="0"/>
-          <w:numId w:val="46"/>
+          <w:numId w:val="47"/>
         </w:numPr>
         <w:tabs>
           <w:tab w:val="left" w:pos="720" w:leader="none"/>
@@ -3981,7 +4184,7 @@
       <w:pPr>
         <w:numPr>
           <w:ilvl w:val="0"/>
-          <w:numId w:val="49"/>
+          <w:numId w:val="50"/>
         </w:numPr>
         <w:tabs>
           <w:tab w:val="left" w:pos="720" w:leader="none"/>
@@ -4014,7 +4217,7 @@
       <w:pPr>
         <w:numPr>
           <w:ilvl w:val="0"/>
-          <w:numId w:val="49"/>
+          <w:numId w:val="50"/>
         </w:numPr>
         <w:tabs>
           <w:tab w:val="left" w:pos="720" w:leader="none"/>
@@ -4047,7 +4250,7 @@
       <w:pPr>
         <w:numPr>
           <w:ilvl w:val="0"/>
-          <w:numId w:val="49"/>
+          <w:numId w:val="50"/>
         </w:numPr>
         <w:tabs>
           <w:tab w:val="left" w:pos="720" w:leader="none"/>
@@ -4108,7 +4311,7 @@
       <w:pPr>
         <w:numPr>
           <w:ilvl w:val="0"/>
-          <w:numId w:val="51"/>
+          <w:numId w:val="52"/>
         </w:numPr>
         <w:tabs>
           <w:tab w:val="left" w:pos="720" w:leader="none"/>
@@ -4141,7 +4344,7 @@
       <w:pPr>
         <w:numPr>
           <w:ilvl w:val="0"/>
-          <w:numId w:val="51"/>
+          <w:numId w:val="52"/>
         </w:numPr>
         <w:tabs>
           <w:tab w:val="left" w:pos="720" w:leader="none"/>
@@ -4174,7 +4377,7 @@
       <w:pPr>
         <w:numPr>
           <w:ilvl w:val="0"/>
-          <w:numId w:val="51"/>
+          <w:numId w:val="52"/>
         </w:numPr>
         <w:tabs>
           <w:tab w:val="left" w:pos="720" w:leader="none"/>
@@ -4235,7 +4438,7 @@
       <w:pPr>
         <w:numPr>
           <w:ilvl w:val="0"/>
-          <w:numId w:val="53"/>
+          <w:numId w:val="54"/>
         </w:numPr>
         <w:tabs>
           <w:tab w:val="left" w:pos="720" w:leader="none"/>
@@ -4268,7 +4471,7 @@
       <w:pPr>
         <w:numPr>
           <w:ilvl w:val="0"/>
-          <w:numId w:val="53"/>
+          <w:numId w:val="54"/>
         </w:numPr>
         <w:tabs>
           <w:tab w:val="left" w:pos="720" w:leader="none"/>
@@ -4301,7 +4504,7 @@
       <w:pPr>
         <w:numPr>
           <w:ilvl w:val="0"/>
-          <w:numId w:val="53"/>
+          <w:numId w:val="54"/>
         </w:numPr>
         <w:tabs>
           <w:tab w:val="left" w:pos="720" w:leader="none"/>
@@ -4334,7 +4537,7 @@
       <w:pPr>
         <w:numPr>
           <w:ilvl w:val="0"/>
-          <w:numId w:val="53"/>
+          <w:numId w:val="54"/>
         </w:numPr>
         <w:tabs>
           <w:tab w:val="left" w:pos="720" w:leader="none"/>
@@ -4462,7 +4665,7 @@
       <w:pPr>
         <w:numPr>
           <w:ilvl w:val="0"/>
-          <w:numId w:val="56"/>
+          <w:numId w:val="57"/>
         </w:numPr>
         <w:tabs>
           <w:tab w:val="left" w:pos="720" w:leader="none"/>
@@ -4495,7 +4698,7 @@
       <w:pPr>
         <w:numPr>
           <w:ilvl w:val="0"/>
-          <w:numId w:val="56"/>
+          <w:numId w:val="57"/>
         </w:numPr>
         <w:tabs>
           <w:tab w:val="left" w:pos="720" w:leader="none"/>
@@ -4528,7 +4731,7 @@
       <w:pPr>
         <w:numPr>
           <w:ilvl w:val="0"/>
-          <w:numId w:val="56"/>
+          <w:numId w:val="57"/>
         </w:numPr>
         <w:tabs>
           <w:tab w:val="left" w:pos="720" w:leader="none"/>
@@ -4589,7 +4792,7 @@
       <w:pPr>
         <w:numPr>
           <w:ilvl w:val="0"/>
-          <w:numId w:val="58"/>
+          <w:numId w:val="59"/>
         </w:numPr>
         <w:tabs>
           <w:tab w:val="left" w:pos="720" w:leader="none"/>
@@ -4622,7 +4825,7 @@
       <w:pPr>
         <w:numPr>
           <w:ilvl w:val="0"/>
-          <w:numId w:val="58"/>
+          <w:numId w:val="59"/>
         </w:numPr>
         <w:tabs>
           <w:tab w:val="left" w:pos="720" w:leader="none"/>
@@ -4655,7 +4858,7 @@
       <w:pPr>
         <w:numPr>
           <w:ilvl w:val="0"/>
-          <w:numId w:val="58"/>
+          <w:numId w:val="59"/>
         </w:numPr>
         <w:tabs>
           <w:tab w:val="left" w:pos="720" w:leader="none"/>
@@ -4716,7 +4919,7 @@
       <w:pPr>
         <w:numPr>
           <w:ilvl w:val="0"/>
-          <w:numId w:val="60"/>
+          <w:numId w:val="61"/>
         </w:numPr>
         <w:tabs>
           <w:tab w:val="left" w:pos="720" w:leader="none"/>
@@ -4749,7 +4952,7 @@
       <w:pPr>
         <w:numPr>
           <w:ilvl w:val="0"/>
-          <w:numId w:val="60"/>
+          <w:numId w:val="61"/>
         </w:numPr>
         <w:tabs>
           <w:tab w:val="left" w:pos="720" w:leader="none"/>
@@ -4810,7 +5013,7 @@
       <w:pPr>
         <w:numPr>
           <w:ilvl w:val="0"/>
-          <w:numId w:val="62"/>
+          <w:numId w:val="63"/>
         </w:numPr>
         <w:tabs>
           <w:tab w:val="left" w:pos="720" w:leader="none"/>
@@ -4843,7 +5046,7 @@
       <w:pPr>
         <w:numPr>
           <w:ilvl w:val="0"/>
-          <w:numId w:val="62"/>
+          <w:numId w:val="63"/>
         </w:numPr>
         <w:tabs>
           <w:tab w:val="left" w:pos="720" w:leader="none"/>
@@ -4876,7 +5079,7 @@
       <w:pPr>
         <w:numPr>
           <w:ilvl w:val="0"/>
-          <w:numId w:val="62"/>
+          <w:numId w:val="63"/>
         </w:numPr>
         <w:tabs>
           <w:tab w:val="left" w:pos="720" w:leader="none"/>
@@ -4909,7 +5112,7 @@
       <w:pPr>
         <w:numPr>
           <w:ilvl w:val="0"/>
-          <w:numId w:val="62"/>
+          <w:numId w:val="63"/>
         </w:numPr>
         <w:tabs>
           <w:tab w:val="left" w:pos="720" w:leader="none"/>
@@ -4942,7 +5145,7 @@
       <w:pPr>
         <w:numPr>
           <w:ilvl w:val="0"/>
-          <w:numId w:val="62"/>
+          <w:numId w:val="63"/>
         </w:numPr>
         <w:tabs>
           <w:tab w:val="left" w:pos="720" w:leader="none"/>
@@ -4975,7 +5178,7 @@
       <w:pPr>
         <w:numPr>
           <w:ilvl w:val="0"/>
-          <w:numId w:val="62"/>
+          <w:numId w:val="63"/>
         </w:numPr>
         <w:tabs>
           <w:tab w:val="left" w:pos="720" w:leader="none"/>
@@ -5221,58 +5424,58 @@
   <w:num w:numId="21">
     <w:abstractNumId w:val="108"/>
   </w:num>
-  <w:num w:numId="23">
+  <w:num w:numId="24">
     <w:abstractNumId w:val="102"/>
   </w:num>
-  <w:num w:numId="25">
+  <w:num w:numId="26">
     <w:abstractNumId w:val="96"/>
   </w:num>
-  <w:num w:numId="27">
+  <w:num w:numId="28">
     <w:abstractNumId w:val="90"/>
   </w:num>
-  <w:num w:numId="29">
+  <w:num w:numId="30">
     <w:abstractNumId w:val="84"/>
   </w:num>
-  <w:num w:numId="31">
+  <w:num w:numId="32">
     <w:abstractNumId w:val="78"/>
   </w:num>
-  <w:num w:numId="34">
+  <w:num w:numId="35">
     <w:abstractNumId w:val="72"/>
   </w:num>
-  <w:num w:numId="36">
+  <w:num w:numId="37">
     <w:abstractNumId w:val="66"/>
   </w:num>
-  <w:num w:numId="39">
+  <w:num w:numId="40">
     <w:abstractNumId w:val="60"/>
   </w:num>
-  <w:num w:numId="41">
+  <w:num w:numId="42">
     <w:abstractNumId w:val="54"/>
   </w:num>
-  <w:num w:numId="44">
+  <w:num w:numId="45">
     <w:abstractNumId w:val="48"/>
   </w:num>
-  <w:num w:numId="46">
+  <w:num w:numId="47">
     <w:abstractNumId w:val="42"/>
   </w:num>
-  <w:num w:numId="49">
+  <w:num w:numId="50">
     <w:abstractNumId w:val="36"/>
   </w:num>
-  <w:num w:numId="51">
+  <w:num w:numId="52">
     <w:abstractNumId w:val="30"/>
   </w:num>
-  <w:num w:numId="53">
+  <w:num w:numId="54">
     <w:abstractNumId w:val="24"/>
   </w:num>
-  <w:num w:numId="56">
+  <w:num w:numId="57">
     <w:abstractNumId w:val="18"/>
   </w:num>
-  <w:num w:numId="58">
+  <w:num w:numId="59">
     <w:abstractNumId w:val="12"/>
   </w:num>
-  <w:num w:numId="60">
+  <w:num w:numId="61">
     <w:abstractNumId w:val="6"/>
   </w:num>
-  <w:num w:numId="62">
+  <w:num w:numId="63">
     <w:abstractNumId w:val="0"/>
   </w:num>
 </w:numbering>

</xml_diff>

<commit_message>
modified project details file after implementing task 10
</commit_message>
<xml_diff>
--- a/Project_details.docx
+++ b/Project_details.docx
@@ -2574,6 +2574,33 @@
           <w:shd w:fill="auto" w:val="clear"/>
         </w:rPr>
         <w:t xml:space="preserve">Task 9: Implement DQN Target Network</w:t>
+      </w:r>
+    </w:p>
+    <w:p>
+      <w:pPr>
+        <w:spacing w:before="100" w:after="100" w:line="240"/>
+        <w:ind w:right="0" w:left="0" w:firstLine="0"/>
+        <w:jc w:val="left"/>
+        <w:rPr>
+          <w:rFonts w:ascii="Times New Roman" w:hAnsi="Times New Roman" w:cs="Times New Roman" w:eastAsia="Times New Roman"/>
+          <w:b/>
+          <w:color w:val="auto"/>
+          <w:spacing w:val="0"/>
+          <w:position w:val="0"/>
+          <w:sz w:val="27"/>
+          <w:shd w:fill="auto" w:val="clear"/>
+        </w:rPr>
+      </w:pPr>
+      <w:r>
+        <w:rPr>
+          <w:rFonts w:ascii="Times New Roman" w:hAnsi="Times New Roman" w:cs="Times New Roman" w:eastAsia="Times New Roman"/>
+          <w:color w:val="auto"/>
+          <w:spacing w:val="0"/>
+          <w:position w:val="0"/>
+          <w:sz w:val="27"/>
+          <w:shd w:fill="auto" w:val="clear"/>
+        </w:rPr>
+        <w:t xml:space="preserve">Currently, both prediction and target are computed by the Q network which can cause explosion of Q-values, unstable loss and divergence of training. We need a separate target network.</w:t>
       </w:r>
     </w:p>
     <w:p>

</xml_diff>

<commit_message>
modified project details file after implementing task 15
</commit_message>
<xml_diff>
--- a/Project_details.docx
+++ b/Project_details.docx
@@ -3600,6 +3600,32 @@
     </w:p>
     <w:p>
       <w:pPr>
+        <w:spacing w:before="100" w:after="100" w:line="240"/>
+        <w:ind w:right="0" w:left="0" w:firstLine="0"/>
+        <w:jc w:val="left"/>
+        <w:rPr>
+          <w:rFonts w:ascii="Times New Roman" w:hAnsi="Times New Roman" w:cs="Times New Roman" w:eastAsia="Times New Roman"/>
+          <w:color w:val="auto"/>
+          <w:spacing w:val="0"/>
+          <w:position w:val="0"/>
+          <w:sz w:val="27"/>
+          <w:shd w:fill="auto" w:val="clear"/>
+        </w:rPr>
+      </w:pPr>
+      <w:r>
+        <w:rPr>
+          <w:rFonts w:ascii="Times New Roman" w:hAnsi="Times New Roman" w:cs="Times New Roman" w:eastAsia="Times New Roman"/>
+          <w:color w:val="auto"/>
+          <w:spacing w:val="0"/>
+          <w:position w:val="0"/>
+          <w:sz w:val="27"/>
+          <w:shd w:fill="auto" w:val="clear"/>
+        </w:rPr>
+        <w:t xml:space="preserve">Different networks for action selection and action evaluation</w:t>
+      </w:r>
+    </w:p>
+    <w:p>
+      <w:pPr>
         <w:numPr>
           <w:ilvl w:val="0"/>
           <w:numId w:val="40"/>
@@ -3703,6 +3729,80 @@
         <w:ind w:right="0" w:left="0" w:firstLine="0"/>
         <w:jc w:val="left"/>
         <w:rPr>
+          <w:rFonts w:ascii="Cambria Math" w:hAnsi="Cambria Math" w:cs="Cambria Math" w:eastAsia="Cambria Math"/>
+          <w:color w:val="auto"/>
+          <w:spacing w:val="0"/>
+          <w:position w:val="0"/>
+          <w:sz w:val="27"/>
+          <w:shd w:fill="auto" w:val="clear"/>
+        </w:rPr>
+      </w:pPr>
+      <w:r>
+        <w:rPr>
+          <w:rFonts w:ascii="Times New Roman" w:hAnsi="Times New Roman" w:cs="Times New Roman" w:eastAsia="Times New Roman"/>
+          <w:color w:val="auto"/>
+          <w:spacing w:val="0"/>
+          <w:position w:val="0"/>
+          <w:sz w:val="27"/>
+          <w:shd w:fill="auto" w:val="clear"/>
+        </w:rPr>
+        <w:t xml:space="preserve">Earlier in DQN: max operator + noisy estimates </w:t>
+      </w:r>
+      <w:r>
+        <w:rPr>
+          <w:rFonts w:ascii="Cambria Math" w:hAnsi="Cambria Math" w:cs="Cambria Math" w:eastAsia="Cambria Math"/>
+          <w:color w:val="auto"/>
+          <w:spacing w:val="0"/>
+          <w:position w:val="0"/>
+          <w:sz w:val="27"/>
+          <w:shd w:fill="auto" w:val="clear"/>
+        </w:rPr>
+        <w:t xml:space="preserve">→ upward bias</w:t>
+      </w:r>
+    </w:p>
+    <w:p>
+      <w:pPr>
+        <w:spacing w:before="100" w:after="100" w:line="240"/>
+        <w:ind w:right="0" w:left="0" w:firstLine="0"/>
+        <w:jc w:val="left"/>
+        <w:rPr>
+          <w:rFonts w:ascii="Times New Roman" w:hAnsi="Times New Roman" w:cs="Times New Roman" w:eastAsia="Times New Roman"/>
+          <w:color w:val="auto"/>
+          <w:spacing w:val="0"/>
+          <w:position w:val="0"/>
+          <w:sz w:val="24"/>
+          <w:shd w:fill="auto" w:val="clear"/>
+        </w:rPr>
+      </w:pPr>
+      <w:r>
+        <w:rPr>
+          <w:rFonts w:ascii="Cambria Math" w:hAnsi="Cambria Math" w:cs="Cambria Math" w:eastAsia="Cambria Math"/>
+          <w:color w:val="auto"/>
+          <w:spacing w:val="0"/>
+          <w:position w:val="0"/>
+          <w:sz w:val="27"/>
+          <w:shd w:fill="auto" w:val="clear"/>
+        </w:rPr>
+        <w:t xml:space="preserve">Now in Double DQN: selection and evaluation separated </w:t>
+      </w:r>
+      <w:r>
+        <w:rPr>
+          <w:rFonts w:ascii="Cambria Math" w:hAnsi="Cambria Math" w:cs="Cambria Math" w:eastAsia="Cambria Math"/>
+          <w:color w:val="auto"/>
+          <w:spacing w:val="0"/>
+          <w:position w:val="0"/>
+          <w:sz w:val="27"/>
+          <w:shd w:fill="auto" w:val="clear"/>
+        </w:rPr>
+        <w:t xml:space="preserve">→ reduces overestimation</w:t>
+      </w:r>
+    </w:p>
+    <w:p>
+      <w:pPr>
+        <w:spacing w:before="100" w:after="100" w:line="240"/>
+        <w:ind w:right="0" w:left="0" w:firstLine="0"/>
+        <w:jc w:val="left"/>
+        <w:rPr>
           <w:rFonts w:ascii="Times New Roman" w:hAnsi="Times New Roman" w:cs="Times New Roman" w:eastAsia="Times New Roman"/>
           <w:b/>
           <w:color w:val="auto"/>
@@ -3729,7 +3829,7 @@
       <w:pPr>
         <w:numPr>
           <w:ilvl w:val="0"/>
-          <w:numId w:val="42"/>
+          <w:numId w:val="43"/>
         </w:numPr>
         <w:tabs>
           <w:tab w:val="left" w:pos="720" w:leader="none"/>
@@ -3762,7 +3862,7 @@
       <w:pPr>
         <w:numPr>
           <w:ilvl w:val="0"/>
-          <w:numId w:val="42"/>
+          <w:numId w:val="43"/>
         </w:numPr>
         <w:tabs>
           <w:tab w:val="left" w:pos="720" w:leader="none"/>
@@ -3890,7 +3990,7 @@
       <w:pPr>
         <w:numPr>
           <w:ilvl w:val="0"/>
-          <w:numId w:val="45"/>
+          <w:numId w:val="46"/>
         </w:numPr>
         <w:tabs>
           <w:tab w:val="left" w:pos="720" w:leader="none"/>
@@ -3923,7 +4023,7 @@
       <w:pPr>
         <w:numPr>
           <w:ilvl w:val="0"/>
-          <w:numId w:val="45"/>
+          <w:numId w:val="46"/>
         </w:numPr>
         <w:tabs>
           <w:tab w:val="left" w:pos="720" w:leader="none"/>
@@ -3956,7 +4056,7 @@
       <w:pPr>
         <w:numPr>
           <w:ilvl w:val="0"/>
-          <w:numId w:val="45"/>
+          <w:numId w:val="46"/>
         </w:numPr>
         <w:tabs>
           <w:tab w:val="left" w:pos="720" w:leader="none"/>
@@ -3989,7 +4089,7 @@
       <w:pPr>
         <w:numPr>
           <w:ilvl w:val="0"/>
-          <w:numId w:val="45"/>
+          <w:numId w:val="46"/>
         </w:numPr>
         <w:tabs>
           <w:tab w:val="left" w:pos="720" w:leader="none"/>
@@ -4050,7 +4150,7 @@
       <w:pPr>
         <w:numPr>
           <w:ilvl w:val="0"/>
-          <w:numId w:val="47"/>
+          <w:numId w:val="48"/>
         </w:numPr>
         <w:tabs>
           <w:tab w:val="left" w:pos="720" w:leader="none"/>
@@ -4083,7 +4183,7 @@
       <w:pPr>
         <w:numPr>
           <w:ilvl w:val="0"/>
-          <w:numId w:val="47"/>
+          <w:numId w:val="48"/>
         </w:numPr>
         <w:tabs>
           <w:tab w:val="left" w:pos="720" w:leader="none"/>
@@ -4211,7 +4311,7 @@
       <w:pPr>
         <w:numPr>
           <w:ilvl w:val="0"/>
-          <w:numId w:val="50"/>
+          <w:numId w:val="51"/>
         </w:numPr>
         <w:tabs>
           <w:tab w:val="left" w:pos="720" w:leader="none"/>
@@ -4244,7 +4344,7 @@
       <w:pPr>
         <w:numPr>
           <w:ilvl w:val="0"/>
-          <w:numId w:val="50"/>
+          <w:numId w:val="51"/>
         </w:numPr>
         <w:tabs>
           <w:tab w:val="left" w:pos="720" w:leader="none"/>
@@ -4277,7 +4377,7 @@
       <w:pPr>
         <w:numPr>
           <w:ilvl w:val="0"/>
-          <w:numId w:val="50"/>
+          <w:numId w:val="51"/>
         </w:numPr>
         <w:tabs>
           <w:tab w:val="left" w:pos="720" w:leader="none"/>
@@ -4338,7 +4438,7 @@
       <w:pPr>
         <w:numPr>
           <w:ilvl w:val="0"/>
-          <w:numId w:val="52"/>
+          <w:numId w:val="53"/>
         </w:numPr>
         <w:tabs>
           <w:tab w:val="left" w:pos="720" w:leader="none"/>
@@ -4371,7 +4471,7 @@
       <w:pPr>
         <w:numPr>
           <w:ilvl w:val="0"/>
-          <w:numId w:val="52"/>
+          <w:numId w:val="53"/>
         </w:numPr>
         <w:tabs>
           <w:tab w:val="left" w:pos="720" w:leader="none"/>
@@ -4404,7 +4504,7 @@
       <w:pPr>
         <w:numPr>
           <w:ilvl w:val="0"/>
-          <w:numId w:val="52"/>
+          <w:numId w:val="53"/>
         </w:numPr>
         <w:tabs>
           <w:tab w:val="left" w:pos="720" w:leader="none"/>
@@ -4465,7 +4565,7 @@
       <w:pPr>
         <w:numPr>
           <w:ilvl w:val="0"/>
-          <w:numId w:val="54"/>
+          <w:numId w:val="55"/>
         </w:numPr>
         <w:tabs>
           <w:tab w:val="left" w:pos="720" w:leader="none"/>
@@ -4498,7 +4598,7 @@
       <w:pPr>
         <w:numPr>
           <w:ilvl w:val="0"/>
-          <w:numId w:val="54"/>
+          <w:numId w:val="55"/>
         </w:numPr>
         <w:tabs>
           <w:tab w:val="left" w:pos="720" w:leader="none"/>
@@ -4531,7 +4631,7 @@
       <w:pPr>
         <w:numPr>
           <w:ilvl w:val="0"/>
-          <w:numId w:val="54"/>
+          <w:numId w:val="55"/>
         </w:numPr>
         <w:tabs>
           <w:tab w:val="left" w:pos="720" w:leader="none"/>
@@ -4564,7 +4664,7 @@
       <w:pPr>
         <w:numPr>
           <w:ilvl w:val="0"/>
-          <w:numId w:val="54"/>
+          <w:numId w:val="55"/>
         </w:numPr>
         <w:tabs>
           <w:tab w:val="left" w:pos="720" w:leader="none"/>
@@ -4692,7 +4792,7 @@
       <w:pPr>
         <w:numPr>
           <w:ilvl w:val="0"/>
-          <w:numId w:val="57"/>
+          <w:numId w:val="58"/>
         </w:numPr>
         <w:tabs>
           <w:tab w:val="left" w:pos="720" w:leader="none"/>
@@ -4725,7 +4825,7 @@
       <w:pPr>
         <w:numPr>
           <w:ilvl w:val="0"/>
-          <w:numId w:val="57"/>
+          <w:numId w:val="58"/>
         </w:numPr>
         <w:tabs>
           <w:tab w:val="left" w:pos="720" w:leader="none"/>
@@ -4758,7 +4858,7 @@
       <w:pPr>
         <w:numPr>
           <w:ilvl w:val="0"/>
-          <w:numId w:val="57"/>
+          <w:numId w:val="58"/>
         </w:numPr>
         <w:tabs>
           <w:tab w:val="left" w:pos="720" w:leader="none"/>
@@ -4819,7 +4919,7 @@
       <w:pPr>
         <w:numPr>
           <w:ilvl w:val="0"/>
-          <w:numId w:val="59"/>
+          <w:numId w:val="60"/>
         </w:numPr>
         <w:tabs>
           <w:tab w:val="left" w:pos="720" w:leader="none"/>
@@ -4852,7 +4952,7 @@
       <w:pPr>
         <w:numPr>
           <w:ilvl w:val="0"/>
-          <w:numId w:val="59"/>
+          <w:numId w:val="60"/>
         </w:numPr>
         <w:tabs>
           <w:tab w:val="left" w:pos="720" w:leader="none"/>
@@ -4885,7 +4985,7 @@
       <w:pPr>
         <w:numPr>
           <w:ilvl w:val="0"/>
-          <w:numId w:val="59"/>
+          <w:numId w:val="60"/>
         </w:numPr>
         <w:tabs>
           <w:tab w:val="left" w:pos="720" w:leader="none"/>
@@ -4946,7 +5046,7 @@
       <w:pPr>
         <w:numPr>
           <w:ilvl w:val="0"/>
-          <w:numId w:val="61"/>
+          <w:numId w:val="62"/>
         </w:numPr>
         <w:tabs>
           <w:tab w:val="left" w:pos="720" w:leader="none"/>
@@ -4979,7 +5079,7 @@
       <w:pPr>
         <w:numPr>
           <w:ilvl w:val="0"/>
-          <w:numId w:val="61"/>
+          <w:numId w:val="62"/>
         </w:numPr>
         <w:tabs>
           <w:tab w:val="left" w:pos="720" w:leader="none"/>
@@ -5040,7 +5140,7 @@
       <w:pPr>
         <w:numPr>
           <w:ilvl w:val="0"/>
-          <w:numId w:val="63"/>
+          <w:numId w:val="64"/>
         </w:numPr>
         <w:tabs>
           <w:tab w:val="left" w:pos="720" w:leader="none"/>
@@ -5073,7 +5173,7 @@
       <w:pPr>
         <w:numPr>
           <w:ilvl w:val="0"/>
-          <w:numId w:val="63"/>
+          <w:numId w:val="64"/>
         </w:numPr>
         <w:tabs>
           <w:tab w:val="left" w:pos="720" w:leader="none"/>
@@ -5106,7 +5206,7 @@
       <w:pPr>
         <w:numPr>
           <w:ilvl w:val="0"/>
-          <w:numId w:val="63"/>
+          <w:numId w:val="64"/>
         </w:numPr>
         <w:tabs>
           <w:tab w:val="left" w:pos="720" w:leader="none"/>
@@ -5139,7 +5239,7 @@
       <w:pPr>
         <w:numPr>
           <w:ilvl w:val="0"/>
-          <w:numId w:val="63"/>
+          <w:numId w:val="64"/>
         </w:numPr>
         <w:tabs>
           <w:tab w:val="left" w:pos="720" w:leader="none"/>
@@ -5172,7 +5272,7 @@
       <w:pPr>
         <w:numPr>
           <w:ilvl w:val="0"/>
-          <w:numId w:val="63"/>
+          <w:numId w:val="64"/>
         </w:numPr>
         <w:tabs>
           <w:tab w:val="left" w:pos="720" w:leader="none"/>
@@ -5205,7 +5305,7 @@
       <w:pPr>
         <w:numPr>
           <w:ilvl w:val="0"/>
-          <w:numId w:val="63"/>
+          <w:numId w:val="64"/>
         </w:numPr>
         <w:tabs>
           <w:tab w:val="left" w:pos="720" w:leader="none"/>
@@ -5475,34 +5575,34 @@
   <w:num w:numId="40">
     <w:abstractNumId w:val="60"/>
   </w:num>
-  <w:num w:numId="42">
+  <w:num w:numId="43">
     <w:abstractNumId w:val="54"/>
   </w:num>
-  <w:num w:numId="45">
+  <w:num w:numId="46">
     <w:abstractNumId w:val="48"/>
   </w:num>
-  <w:num w:numId="47">
+  <w:num w:numId="48">
     <w:abstractNumId w:val="42"/>
   </w:num>
-  <w:num w:numId="50">
+  <w:num w:numId="51">
     <w:abstractNumId w:val="36"/>
   </w:num>
-  <w:num w:numId="52">
+  <w:num w:numId="53">
     <w:abstractNumId w:val="30"/>
   </w:num>
-  <w:num w:numId="54">
+  <w:num w:numId="55">
     <w:abstractNumId w:val="24"/>
   </w:num>
-  <w:num w:numId="57">
+  <w:num w:numId="58">
     <w:abstractNumId w:val="18"/>
   </w:num>
-  <w:num w:numId="59">
+  <w:num w:numId="60">
     <w:abstractNumId w:val="12"/>
   </w:num>
-  <w:num w:numId="61">
+  <w:num w:numId="62">
     <w:abstractNumId w:val="6"/>
   </w:num>
-  <w:num w:numId="63">
+  <w:num w:numId="64">
     <w:abstractNumId w:val="0"/>
   </w:num>
 </w:numbering>

</xml_diff>

<commit_message>
modified project details file after task 19 and added metrics for the same
</commit_message>
<xml_diff>
--- a/Project_details.docx
+++ b/Project_details.docx
@@ -3829,7 +3829,7 @@
       <w:pPr>
         <w:numPr>
           <w:ilvl w:val="0"/>
-          <w:numId w:val="43"/>
+          <w:numId w:val="42"/>
         </w:numPr>
         <w:tabs>
           <w:tab w:val="left" w:pos="720" w:leader="none"/>
@@ -3862,7 +3862,7 @@
       <w:pPr>
         <w:numPr>
           <w:ilvl w:val="0"/>
-          <w:numId w:val="43"/>
+          <w:numId w:val="42"/>
         </w:numPr>
         <w:tabs>
           <w:tab w:val="left" w:pos="720" w:leader="none"/>
@@ -3990,7 +3990,7 @@
       <w:pPr>
         <w:numPr>
           <w:ilvl w:val="0"/>
-          <w:numId w:val="46"/>
+          <w:numId w:val="45"/>
         </w:numPr>
         <w:tabs>
           <w:tab w:val="left" w:pos="720" w:leader="none"/>
@@ -4023,7 +4023,7 @@
       <w:pPr>
         <w:numPr>
           <w:ilvl w:val="0"/>
-          <w:numId w:val="46"/>
+          <w:numId w:val="45"/>
         </w:numPr>
         <w:tabs>
           <w:tab w:val="left" w:pos="720" w:leader="none"/>
@@ -4056,7 +4056,7 @@
       <w:pPr>
         <w:numPr>
           <w:ilvl w:val="0"/>
-          <w:numId w:val="46"/>
+          <w:numId w:val="45"/>
         </w:numPr>
         <w:tabs>
           <w:tab w:val="left" w:pos="720" w:leader="none"/>
@@ -4089,7 +4089,7 @@
       <w:pPr>
         <w:numPr>
           <w:ilvl w:val="0"/>
-          <w:numId w:val="46"/>
+          <w:numId w:val="45"/>
         </w:numPr>
         <w:tabs>
           <w:tab w:val="left" w:pos="720" w:leader="none"/>
@@ -4150,7 +4150,7 @@
       <w:pPr>
         <w:numPr>
           <w:ilvl w:val="0"/>
-          <w:numId w:val="48"/>
+          <w:numId w:val="47"/>
         </w:numPr>
         <w:tabs>
           <w:tab w:val="left" w:pos="720" w:leader="none"/>
@@ -4183,7 +4183,7 @@
       <w:pPr>
         <w:numPr>
           <w:ilvl w:val="0"/>
-          <w:numId w:val="48"/>
+          <w:numId w:val="47"/>
         </w:numPr>
         <w:tabs>
           <w:tab w:val="left" w:pos="720" w:leader="none"/>
@@ -4311,7 +4311,7 @@
       <w:pPr>
         <w:numPr>
           <w:ilvl w:val="0"/>
-          <w:numId w:val="51"/>
+          <w:numId w:val="50"/>
         </w:numPr>
         <w:tabs>
           <w:tab w:val="left" w:pos="720" w:leader="none"/>
@@ -4344,7 +4344,7 @@
       <w:pPr>
         <w:numPr>
           <w:ilvl w:val="0"/>
-          <w:numId w:val="51"/>
+          <w:numId w:val="50"/>
         </w:numPr>
         <w:tabs>
           <w:tab w:val="left" w:pos="720" w:leader="none"/>
@@ -4377,7 +4377,7 @@
       <w:pPr>
         <w:numPr>
           <w:ilvl w:val="0"/>
-          <w:numId w:val="51"/>
+          <w:numId w:val="50"/>
         </w:numPr>
         <w:tabs>
           <w:tab w:val="left" w:pos="720" w:leader="none"/>
@@ -4404,6 +4404,153 @@
           <w:shd w:fill="auto" w:val="clear"/>
         </w:rPr>
         <w:t xml:space="preserve">Save metrics </w:t>
+      </w:r>
+    </w:p>
+    <w:p>
+      <w:pPr>
+        <w:tabs>
+          <w:tab w:val="left" w:pos="720" w:leader="none"/>
+        </w:tabs>
+        <w:spacing w:before="100" w:after="100" w:line="240"/>
+        <w:ind w:right="0" w:left="0" w:firstLine="0"/>
+        <w:jc w:val="left"/>
+        <w:rPr>
+          <w:rFonts w:ascii="Times New Roman" w:hAnsi="Times New Roman" w:cs="Times New Roman" w:eastAsia="Times New Roman"/>
+          <w:color w:val="auto"/>
+          <w:spacing w:val="0"/>
+          <w:position w:val="0"/>
+          <w:sz w:val="24"/>
+          <w:shd w:fill="auto" w:val="clear"/>
+        </w:rPr>
+      </w:pPr>
+      <w:r>
+        <w:rPr>
+          <w:rFonts w:ascii="Times New Roman" w:hAnsi="Times New Roman" w:cs="Times New Roman" w:eastAsia="Times New Roman"/>
+          <w:color w:val="auto"/>
+          <w:spacing w:val="0"/>
+          <w:position w:val="0"/>
+          <w:sz w:val="24"/>
+          <w:shd w:fill="auto" w:val="clear"/>
+        </w:rPr>
+        <w:t xml:space="preserve">Memory crash reported when running for 50K steps. Stored frames as unsigned 8-bit integer from float64. Float64 uses 8 times the memory. Then ran for 100K steps.</w:t>
+      </w:r>
+    </w:p>
+    <w:p>
+      <w:pPr>
+        <w:tabs>
+          <w:tab w:val="left" w:pos="720" w:leader="none"/>
+        </w:tabs>
+        <w:spacing w:before="100" w:after="100" w:line="240"/>
+        <w:ind w:right="0" w:left="0" w:firstLine="0"/>
+        <w:jc w:val="left"/>
+        <w:rPr>
+          <w:rFonts w:ascii="Times New Roman" w:hAnsi="Times New Roman" w:cs="Times New Roman" w:eastAsia="Times New Roman"/>
+          <w:color w:val="auto"/>
+          <w:spacing w:val="0"/>
+          <w:position w:val="0"/>
+          <w:sz w:val="24"/>
+          <w:shd w:fill="auto" w:val="clear"/>
+        </w:rPr>
+      </w:pPr>
+      <w:r>
+        <w:rPr>
+          <w:rFonts w:ascii="Times New Roman" w:hAnsi="Times New Roman" w:cs="Times New Roman" w:eastAsia="Times New Roman"/>
+          <w:color w:val="auto"/>
+          <w:spacing w:val="0"/>
+          <w:position w:val="0"/>
+          <w:sz w:val="24"/>
+          <w:shd w:fill="auto" w:val="clear"/>
+        </w:rPr>
+        <w:t xml:space="preserve">Metrics: average reward: 3.69</w:t>
+      </w:r>
+    </w:p>
+    <w:p>
+      <w:pPr>
+        <w:tabs>
+          <w:tab w:val="left" w:pos="720" w:leader="none"/>
+        </w:tabs>
+        <w:spacing w:before="100" w:after="100" w:line="240"/>
+        <w:ind w:right="0" w:left="0" w:firstLine="0"/>
+        <w:jc w:val="left"/>
+        <w:rPr>
+          <w:rFonts w:ascii="Times New Roman" w:hAnsi="Times New Roman" w:cs="Times New Roman" w:eastAsia="Times New Roman"/>
+          <w:color w:val="auto"/>
+          <w:spacing w:val="0"/>
+          <w:position w:val="0"/>
+          <w:sz w:val="24"/>
+          <w:shd w:fill="auto" w:val="clear"/>
+        </w:rPr>
+      </w:pPr>
+      <w:r>
+        <w:rPr>
+          <w:rFonts w:ascii="Times New Roman" w:hAnsi="Times New Roman" w:cs="Times New Roman" w:eastAsia="Times New Roman"/>
+          <w:color w:val="auto"/>
+          <w:spacing w:val="0"/>
+          <w:position w:val="0"/>
+          <w:sz w:val="24"/>
+          <w:shd w:fill="auto" w:val="clear"/>
+        </w:rPr>
+        <w:t xml:space="preserve">maximum reward: 11.0</w:t>
+      </w:r>
+    </w:p>
+    <w:p>
+      <w:pPr>
+        <w:tabs>
+          <w:tab w:val="left" w:pos="720" w:leader="none"/>
+        </w:tabs>
+        <w:spacing w:before="100" w:after="100" w:line="240"/>
+        <w:ind w:right="0" w:left="0" w:firstLine="0"/>
+        <w:jc w:val="left"/>
+        <w:rPr>
+          <w:rFonts w:ascii="Times New Roman" w:hAnsi="Times New Roman" w:cs="Times New Roman" w:eastAsia="Times New Roman"/>
+          <w:color w:val="auto"/>
+          <w:spacing w:val="0"/>
+          <w:position w:val="0"/>
+          <w:sz w:val="24"/>
+          <w:shd w:fill="auto" w:val="clear"/>
+        </w:rPr>
+      </w:pPr>
+      <w:r>
+        <w:rPr>
+          <w:rFonts w:ascii="Times New Roman" w:hAnsi="Times New Roman" w:cs="Times New Roman" w:eastAsia="Times New Roman"/>
+          <w:color w:val="auto"/>
+          <w:spacing w:val="0"/>
+          <w:position w:val="0"/>
+          <w:sz w:val="24"/>
+          <w:shd w:fill="auto" w:val="clear"/>
+        </w:rPr>
+        <w:t xml:space="preserve">variability/standard deviation: 2.3439069947418987</w:t>
+      </w:r>
+    </w:p>
+    <w:p>
+      <w:pPr>
+        <w:tabs>
+          <w:tab w:val="left" w:pos="720" w:leader="none"/>
+        </w:tabs>
+        <w:spacing w:before="100" w:after="100" w:line="240"/>
+        <w:ind w:right="0" w:left="0" w:firstLine="0"/>
+        <w:jc w:val="left"/>
+        <w:rPr>
+          <w:rFonts w:ascii="Times New Roman" w:hAnsi="Times New Roman" w:cs="Times New Roman" w:eastAsia="Times New Roman"/>
+          <w:color w:val="auto"/>
+          <w:spacing w:val="0"/>
+          <w:position w:val="0"/>
+          <w:sz w:val="24"/>
+          <w:shd w:fill="auto" w:val="clear"/>
+        </w:rPr>
+      </w:pPr>
+      <w:r>
+        <w:rPr>
+          <w:rFonts w:ascii="Times New Roman" w:hAnsi="Times New Roman" w:cs="Times New Roman" w:eastAsia="Times New Roman"/>
+          <w:color w:val="auto"/>
+          <w:spacing w:val="0"/>
+          <w:position w:val="0"/>
+          <w:sz w:val="24"/>
+          <w:shd w:fill="auto" w:val="clear"/>
+        </w:rPr>
+        <w:t xml:space="preserve">final epsilon: 0.1000089999999999</w:t>
+        <w:br/>
+        <w:t xml:space="preserve">final loss: 0.009555711410939693</w:t>
       </w:r>
     </w:p>
     <w:p>
@@ -5575,16 +5722,16 @@
   <w:num w:numId="40">
     <w:abstractNumId w:val="60"/>
   </w:num>
-  <w:num w:numId="43">
+  <w:num w:numId="42">
     <w:abstractNumId w:val="54"/>
   </w:num>
-  <w:num w:numId="46">
+  <w:num w:numId="45">
     <w:abstractNumId w:val="48"/>
   </w:num>
-  <w:num w:numId="48">
+  <w:num w:numId="47">
     <w:abstractNumId w:val="42"/>
   </w:num>
-  <w:num w:numId="51">
+  <w:num w:numId="50">
     <w:abstractNumId w:val="36"/>
   </w:num>
   <w:num w:numId="53">

</xml_diff>

<commit_message>
logged metrics in project details file after training runs
</commit_message>
<xml_diff>
--- a/Project_details.docx
+++ b/Project_details.docx
@@ -3783,25 +3783,25 @@
           <w:sz w:val="27"/>
           <w:shd w:fill="auto" w:val="clear"/>
         </w:rPr>
-        <w:t xml:space="preserve">Now in Double DQN: selection and evaluation separated </w:t>
-      </w:r>
-      <w:r>
-        <w:rPr>
-          <w:rFonts w:ascii="Cambria Math" w:hAnsi="Cambria Math" w:cs="Cambria Math" w:eastAsia="Cambria Math"/>
+        <w:t xml:space="preserve">Now in Double DQN: selection and evaluation separated → reduces overestimation</w:t>
+      </w:r>
+    </w:p>
+    <w:p>
+      <w:pPr>
+        <w:spacing w:before="100" w:after="100" w:line="240"/>
+        <w:ind w:right="0" w:left="0" w:firstLine="0"/>
+        <w:jc w:val="left"/>
+        <w:rPr>
+          <w:rFonts w:ascii="Times New Roman" w:hAnsi="Times New Roman" w:cs="Times New Roman" w:eastAsia="Times New Roman"/>
+          <w:b/>
           <w:color w:val="auto"/>
           <w:spacing w:val="0"/>
           <w:position w:val="0"/>
           <w:sz w:val="27"/>
           <w:shd w:fill="auto" w:val="clear"/>
         </w:rPr>
-        <w:t xml:space="preserve">→ reduces overestimation</w:t>
-      </w:r>
-    </w:p>
-    <w:p>
-      <w:pPr>
-        <w:spacing w:before="100" w:after="100" w:line="240"/>
-        <w:ind w:right="0" w:left="0" w:firstLine="0"/>
-        <w:jc w:val="left"/>
+      </w:pPr>
+      <w:r>
         <w:rPr>
           <w:rFonts w:ascii="Times New Roman" w:hAnsi="Times New Roman" w:cs="Times New Roman" w:eastAsia="Times New Roman"/>
           <w:b/>
@@ -3811,8 +3811,147 @@
           <w:sz w:val="27"/>
           <w:shd w:fill="auto" w:val="clear"/>
         </w:rPr>
-      </w:pPr>
-      <w:r>
+        <w:t xml:space="preserve">Task 16: Validate Double DQN</w:t>
+      </w:r>
+    </w:p>
+    <w:p>
+      <w:pPr>
+        <w:numPr>
+          <w:ilvl w:val="0"/>
+          <w:numId w:val="42"/>
+        </w:numPr>
+        <w:tabs>
+          <w:tab w:val="left" w:pos="720" w:leader="none"/>
+        </w:tabs>
+        <w:spacing w:before="100" w:after="100" w:line="240"/>
+        <w:ind w:right="0" w:left="720" w:hanging="360"/>
+        <w:jc w:val="left"/>
+        <w:rPr>
+          <w:rFonts w:ascii="Times New Roman" w:hAnsi="Times New Roman" w:cs="Times New Roman" w:eastAsia="Times New Roman"/>
+          <w:color w:val="auto"/>
+          <w:spacing w:val="0"/>
+          <w:position w:val="0"/>
+          <w:sz w:val="24"/>
+          <w:shd w:fill="auto" w:val="clear"/>
+        </w:rPr>
+      </w:pPr>
+      <w:r>
+        <w:rPr>
+          <w:rFonts w:ascii="Times New Roman" w:hAnsi="Times New Roman" w:cs="Times New Roman" w:eastAsia="Times New Roman"/>
+          <w:color w:val="auto"/>
+          <w:spacing w:val="0"/>
+          <w:position w:val="0"/>
+          <w:sz w:val="24"/>
+          <w:shd w:fill="auto" w:val="clear"/>
+        </w:rPr>
+        <w:t xml:space="preserve">Verify target computation </w:t>
+      </w:r>
+    </w:p>
+    <w:p>
+      <w:pPr>
+        <w:numPr>
+          <w:ilvl w:val="0"/>
+          <w:numId w:val="42"/>
+        </w:numPr>
+        <w:tabs>
+          <w:tab w:val="left" w:pos="720" w:leader="none"/>
+        </w:tabs>
+        <w:spacing w:before="100" w:after="100" w:line="240"/>
+        <w:ind w:right="0" w:left="720" w:hanging="360"/>
+        <w:jc w:val="left"/>
+        <w:rPr>
+          <w:rFonts w:ascii="Times New Roman" w:hAnsi="Times New Roman" w:cs="Times New Roman" w:eastAsia="Times New Roman"/>
+          <w:color w:val="auto"/>
+          <w:spacing w:val="0"/>
+          <w:position w:val="0"/>
+          <w:sz w:val="24"/>
+          <w:shd w:fill="auto" w:val="clear"/>
+        </w:rPr>
+      </w:pPr>
+      <w:r>
+        <w:rPr>
+          <w:rFonts w:ascii="Times New Roman" w:hAnsi="Times New Roman" w:cs="Times New Roman" w:eastAsia="Times New Roman"/>
+          <w:color w:val="auto"/>
+          <w:spacing w:val="0"/>
+          <w:position w:val="0"/>
+          <w:sz w:val="24"/>
+          <w:shd w:fill="auto" w:val="clear"/>
+        </w:rPr>
+        <w:t xml:space="preserve">Compare against DQN implementation </w:t>
+      </w:r>
+    </w:p>
+    <w:p>
+      <w:pPr>
+        <w:spacing w:before="0" w:after="0" w:line="240"/>
+        <w:ind w:right="0" w:left="0" w:firstLine="0"/>
+        <w:jc w:val="left"/>
+        <w:rPr>
+          <w:rFonts w:ascii="Times New Roman" w:hAnsi="Times New Roman" w:cs="Times New Roman" w:eastAsia="Times New Roman"/>
+          <w:color w:val="auto"/>
+          <w:spacing w:val="0"/>
+          <w:position w:val="0"/>
+          <w:sz w:val="24"/>
+          <w:shd w:fill="auto" w:val="clear"/>
+        </w:rPr>
+      </w:pPr>
+    </w:p>
+    <w:p>
+      <w:pPr>
+        <w:spacing w:before="100" w:after="100" w:line="240"/>
+        <w:ind w:right="0" w:left="0" w:firstLine="0"/>
+        <w:jc w:val="left"/>
+        <w:rPr>
+          <w:rFonts w:ascii="Times New Roman" w:hAnsi="Times New Roman" w:cs="Times New Roman" w:eastAsia="Times New Roman"/>
+          <w:b/>
+          <w:color w:val="auto"/>
+          <w:spacing w:val="0"/>
+          <w:position w:val="0"/>
+          <w:sz w:val="36"/>
+          <w:shd w:fill="auto" w:val="clear"/>
+        </w:rPr>
+      </w:pPr>
+      <w:r>
+        <w:rPr>
+          <w:rFonts w:ascii="Times New Roman" w:hAnsi="Times New Roman" w:cs="Times New Roman" w:eastAsia="Times New Roman"/>
+          <w:b/>
+          <w:color w:val="auto"/>
+          <w:spacing w:val="0"/>
+          <w:position w:val="0"/>
+          <w:sz w:val="36"/>
+          <w:shd w:fill="auto" w:val="clear"/>
+        </w:rPr>
+        <w:t xml:space="preserve">Phase 6 </w:t>
+      </w:r>
+      <w:r>
+        <w:rPr>
+          <w:rFonts w:ascii="Times New Roman" w:hAnsi="Times New Roman" w:cs="Times New Roman" w:eastAsia="Times New Roman"/>
+          <w:b/>
+          <w:color w:val="auto"/>
+          <w:spacing w:val="0"/>
+          <w:position w:val="0"/>
+          <w:sz w:val="36"/>
+          <w:shd w:fill="auto" w:val="clear"/>
+        </w:rPr>
+        <w:t xml:space="preserve">–</w:t>
+      </w:r>
+      <w:r>
+        <w:rPr>
+          <w:rFonts w:ascii="Times New Roman" w:hAnsi="Times New Roman" w:cs="Times New Roman" w:eastAsia="Times New Roman"/>
+          <w:b/>
+          <w:color w:val="auto"/>
+          <w:spacing w:val="0"/>
+          <w:position w:val="0"/>
+          <w:sz w:val="36"/>
+          <w:shd w:fill="auto" w:val="clear"/>
+        </w:rPr>
+        <w:t xml:space="preserve"> Experiment Tracking</w:t>
+      </w:r>
+    </w:p>
+    <w:p>
+      <w:pPr>
+        <w:spacing w:before="100" w:after="100" w:line="240"/>
+        <w:ind w:right="0" w:left="0" w:firstLine="0"/>
+        <w:jc w:val="left"/>
         <w:rPr>
           <w:rFonts w:ascii="Times New Roman" w:hAnsi="Times New Roman" w:cs="Times New Roman" w:eastAsia="Times New Roman"/>
           <w:b/>
@@ -3822,73 +3961,244 @@
           <w:sz w:val="27"/>
           <w:shd w:fill="auto" w:val="clear"/>
         </w:rPr>
-        <w:t xml:space="preserve">Task 16: Validate Double DQN</w:t>
-      </w:r>
-    </w:p>
-    <w:p>
-      <w:pPr>
-        <w:numPr>
-          <w:ilvl w:val="0"/>
-          <w:numId w:val="42"/>
-        </w:numPr>
-        <w:tabs>
-          <w:tab w:val="left" w:pos="720" w:leader="none"/>
-        </w:tabs>
-        <w:spacing w:before="100" w:after="100" w:line="240"/>
-        <w:ind w:right="0" w:left="720" w:hanging="360"/>
-        <w:jc w:val="left"/>
-        <w:rPr>
-          <w:rFonts w:ascii="Times New Roman" w:hAnsi="Times New Roman" w:cs="Times New Roman" w:eastAsia="Times New Roman"/>
-          <w:color w:val="auto"/>
-          <w:spacing w:val="0"/>
-          <w:position w:val="0"/>
-          <w:sz w:val="24"/>
-          <w:shd w:fill="auto" w:val="clear"/>
-        </w:rPr>
-      </w:pPr>
-      <w:r>
-        <w:rPr>
-          <w:rFonts w:ascii="Times New Roman" w:hAnsi="Times New Roman" w:cs="Times New Roman" w:eastAsia="Times New Roman"/>
-          <w:color w:val="auto"/>
-          <w:spacing w:val="0"/>
-          <w:position w:val="0"/>
-          <w:sz w:val="24"/>
-          <w:shd w:fill="auto" w:val="clear"/>
-        </w:rPr>
-        <w:t xml:space="preserve">Verify target computation </w:t>
-      </w:r>
-    </w:p>
-    <w:p>
-      <w:pPr>
-        <w:numPr>
-          <w:ilvl w:val="0"/>
-          <w:numId w:val="42"/>
-        </w:numPr>
-        <w:tabs>
-          <w:tab w:val="left" w:pos="720" w:leader="none"/>
-        </w:tabs>
-        <w:spacing w:before="100" w:after="100" w:line="240"/>
-        <w:ind w:right="0" w:left="720" w:hanging="360"/>
-        <w:jc w:val="left"/>
-        <w:rPr>
-          <w:rFonts w:ascii="Times New Roman" w:hAnsi="Times New Roman" w:cs="Times New Roman" w:eastAsia="Times New Roman"/>
-          <w:color w:val="auto"/>
-          <w:spacing w:val="0"/>
-          <w:position w:val="0"/>
-          <w:sz w:val="24"/>
-          <w:shd w:fill="auto" w:val="clear"/>
-        </w:rPr>
-      </w:pPr>
-      <w:r>
-        <w:rPr>
-          <w:rFonts w:ascii="Times New Roman" w:hAnsi="Times New Roman" w:cs="Times New Roman" w:eastAsia="Times New Roman"/>
-          <w:color w:val="auto"/>
-          <w:spacing w:val="0"/>
-          <w:position w:val="0"/>
-          <w:sz w:val="24"/>
-          <w:shd w:fill="auto" w:val="clear"/>
-        </w:rPr>
-        <w:t xml:space="preserve">Compare against DQN implementation </w:t>
+      </w:pPr>
+      <w:r>
+        <w:rPr>
+          <w:rFonts w:ascii="Times New Roman" w:hAnsi="Times New Roman" w:cs="Times New Roman" w:eastAsia="Times New Roman"/>
+          <w:b/>
+          <w:color w:val="auto"/>
+          <w:spacing w:val="0"/>
+          <w:position w:val="0"/>
+          <w:sz w:val="27"/>
+          <w:shd w:fill="auto" w:val="clear"/>
+        </w:rPr>
+        <w:t xml:space="preserve">Task 17: Integrate Weights &amp; Biases</w:t>
+      </w:r>
+    </w:p>
+    <w:p>
+      <w:pPr>
+        <w:numPr>
+          <w:ilvl w:val="0"/>
+          <w:numId w:val="45"/>
+        </w:numPr>
+        <w:tabs>
+          <w:tab w:val="left" w:pos="720" w:leader="none"/>
+        </w:tabs>
+        <w:spacing w:before="100" w:after="100" w:line="240"/>
+        <w:ind w:right="0" w:left="720" w:hanging="360"/>
+        <w:jc w:val="left"/>
+        <w:rPr>
+          <w:rFonts w:ascii="Times New Roman" w:hAnsi="Times New Roman" w:cs="Times New Roman" w:eastAsia="Times New Roman"/>
+          <w:color w:val="auto"/>
+          <w:spacing w:val="0"/>
+          <w:position w:val="0"/>
+          <w:sz w:val="24"/>
+          <w:shd w:fill="auto" w:val="clear"/>
+        </w:rPr>
+      </w:pPr>
+      <w:r>
+        <w:rPr>
+          <w:rFonts w:ascii="Times New Roman" w:hAnsi="Times New Roman" w:cs="Times New Roman" w:eastAsia="Times New Roman"/>
+          <w:color w:val="auto"/>
+          <w:spacing w:val="0"/>
+          <w:position w:val="0"/>
+          <w:sz w:val="24"/>
+          <w:shd w:fill="auto" w:val="clear"/>
+        </w:rPr>
+        <w:t xml:space="preserve">Log reward </w:t>
+      </w:r>
+    </w:p>
+    <w:p>
+      <w:pPr>
+        <w:numPr>
+          <w:ilvl w:val="0"/>
+          <w:numId w:val="45"/>
+        </w:numPr>
+        <w:tabs>
+          <w:tab w:val="left" w:pos="720" w:leader="none"/>
+        </w:tabs>
+        <w:spacing w:before="100" w:after="100" w:line="240"/>
+        <w:ind w:right="0" w:left="720" w:hanging="360"/>
+        <w:jc w:val="left"/>
+        <w:rPr>
+          <w:rFonts w:ascii="Times New Roman" w:hAnsi="Times New Roman" w:cs="Times New Roman" w:eastAsia="Times New Roman"/>
+          <w:color w:val="auto"/>
+          <w:spacing w:val="0"/>
+          <w:position w:val="0"/>
+          <w:sz w:val="24"/>
+          <w:shd w:fill="auto" w:val="clear"/>
+        </w:rPr>
+      </w:pPr>
+      <w:r>
+        <w:rPr>
+          <w:rFonts w:ascii="Times New Roman" w:hAnsi="Times New Roman" w:cs="Times New Roman" w:eastAsia="Times New Roman"/>
+          <w:color w:val="auto"/>
+          <w:spacing w:val="0"/>
+          <w:position w:val="0"/>
+          <w:sz w:val="24"/>
+          <w:shd w:fill="auto" w:val="clear"/>
+        </w:rPr>
+        <w:t xml:space="preserve">Log loss </w:t>
+      </w:r>
+    </w:p>
+    <w:p>
+      <w:pPr>
+        <w:numPr>
+          <w:ilvl w:val="0"/>
+          <w:numId w:val="45"/>
+        </w:numPr>
+        <w:tabs>
+          <w:tab w:val="left" w:pos="720" w:leader="none"/>
+        </w:tabs>
+        <w:spacing w:before="100" w:after="100" w:line="240"/>
+        <w:ind w:right="0" w:left="720" w:hanging="360"/>
+        <w:jc w:val="left"/>
+        <w:rPr>
+          <w:rFonts w:ascii="Times New Roman" w:hAnsi="Times New Roman" w:cs="Times New Roman" w:eastAsia="Times New Roman"/>
+          <w:color w:val="auto"/>
+          <w:spacing w:val="0"/>
+          <w:position w:val="0"/>
+          <w:sz w:val="24"/>
+          <w:shd w:fill="auto" w:val="clear"/>
+        </w:rPr>
+      </w:pPr>
+      <w:r>
+        <w:rPr>
+          <w:rFonts w:ascii="Times New Roman" w:hAnsi="Times New Roman" w:cs="Times New Roman" w:eastAsia="Times New Roman"/>
+          <w:color w:val="auto"/>
+          <w:spacing w:val="0"/>
+          <w:position w:val="0"/>
+          <w:sz w:val="24"/>
+          <w:shd w:fill="auto" w:val="clear"/>
+        </w:rPr>
+        <w:t xml:space="preserve">Log epsilon </w:t>
+      </w:r>
+    </w:p>
+    <w:p>
+      <w:pPr>
+        <w:numPr>
+          <w:ilvl w:val="0"/>
+          <w:numId w:val="45"/>
+        </w:numPr>
+        <w:tabs>
+          <w:tab w:val="left" w:pos="720" w:leader="none"/>
+        </w:tabs>
+        <w:spacing w:before="100" w:after="100" w:line="240"/>
+        <w:ind w:right="0" w:left="720" w:hanging="360"/>
+        <w:jc w:val="left"/>
+        <w:rPr>
+          <w:rFonts w:ascii="Times New Roman" w:hAnsi="Times New Roman" w:cs="Times New Roman" w:eastAsia="Times New Roman"/>
+          <w:color w:val="auto"/>
+          <w:spacing w:val="0"/>
+          <w:position w:val="0"/>
+          <w:sz w:val="24"/>
+          <w:shd w:fill="auto" w:val="clear"/>
+        </w:rPr>
+      </w:pPr>
+      <w:r>
+        <w:rPr>
+          <w:rFonts w:ascii="Times New Roman" w:hAnsi="Times New Roman" w:cs="Times New Roman" w:eastAsia="Times New Roman"/>
+          <w:color w:val="auto"/>
+          <w:spacing w:val="0"/>
+          <w:position w:val="0"/>
+          <w:sz w:val="24"/>
+          <w:shd w:fill="auto" w:val="clear"/>
+        </w:rPr>
+        <w:t xml:space="preserve">Log Q-values (optional) </w:t>
+      </w:r>
+    </w:p>
+    <w:p>
+      <w:pPr>
+        <w:spacing w:before="100" w:after="100" w:line="240"/>
+        <w:ind w:right="0" w:left="0" w:firstLine="0"/>
+        <w:jc w:val="left"/>
+        <w:rPr>
+          <w:rFonts w:ascii="Times New Roman" w:hAnsi="Times New Roman" w:cs="Times New Roman" w:eastAsia="Times New Roman"/>
+          <w:b/>
+          <w:color w:val="auto"/>
+          <w:spacing w:val="0"/>
+          <w:position w:val="0"/>
+          <w:sz w:val="27"/>
+          <w:shd w:fill="auto" w:val="clear"/>
+        </w:rPr>
+      </w:pPr>
+      <w:r>
+        <w:rPr>
+          <w:rFonts w:ascii="Times New Roman" w:hAnsi="Times New Roman" w:cs="Times New Roman" w:eastAsia="Times New Roman"/>
+          <w:b/>
+          <w:color w:val="auto"/>
+          <w:spacing w:val="0"/>
+          <w:position w:val="0"/>
+          <w:sz w:val="27"/>
+          <w:shd w:fill="auto" w:val="clear"/>
+        </w:rPr>
+        <w:t xml:space="preserve">Task 18: Configure Experiments</w:t>
+      </w:r>
+    </w:p>
+    <w:p>
+      <w:pPr>
+        <w:numPr>
+          <w:ilvl w:val="0"/>
+          <w:numId w:val="47"/>
+        </w:numPr>
+        <w:tabs>
+          <w:tab w:val="left" w:pos="720" w:leader="none"/>
+        </w:tabs>
+        <w:spacing w:before="100" w:after="100" w:line="240"/>
+        <w:ind w:right="0" w:left="720" w:hanging="360"/>
+        <w:jc w:val="left"/>
+        <w:rPr>
+          <w:rFonts w:ascii="Times New Roman" w:hAnsi="Times New Roman" w:cs="Times New Roman" w:eastAsia="Times New Roman"/>
+          <w:color w:val="auto"/>
+          <w:spacing w:val="0"/>
+          <w:position w:val="0"/>
+          <w:sz w:val="24"/>
+          <w:shd w:fill="auto" w:val="clear"/>
+        </w:rPr>
+      </w:pPr>
+      <w:r>
+        <w:rPr>
+          <w:rFonts w:ascii="Times New Roman" w:hAnsi="Times New Roman" w:cs="Times New Roman" w:eastAsia="Times New Roman"/>
+          <w:color w:val="auto"/>
+          <w:spacing w:val="0"/>
+          <w:position w:val="0"/>
+          <w:sz w:val="24"/>
+          <w:shd w:fill="auto" w:val="clear"/>
+        </w:rPr>
+        <w:t xml:space="preserve">DQN configuration </w:t>
+      </w:r>
+    </w:p>
+    <w:p>
+      <w:pPr>
+        <w:numPr>
+          <w:ilvl w:val="0"/>
+          <w:numId w:val="47"/>
+        </w:numPr>
+        <w:tabs>
+          <w:tab w:val="left" w:pos="720" w:leader="none"/>
+        </w:tabs>
+        <w:spacing w:before="100" w:after="100" w:line="240"/>
+        <w:ind w:right="0" w:left="720" w:hanging="360"/>
+        <w:jc w:val="left"/>
+        <w:rPr>
+          <w:rFonts w:ascii="Times New Roman" w:hAnsi="Times New Roman" w:cs="Times New Roman" w:eastAsia="Times New Roman"/>
+          <w:color w:val="auto"/>
+          <w:spacing w:val="0"/>
+          <w:position w:val="0"/>
+          <w:sz w:val="24"/>
+          <w:shd w:fill="auto" w:val="clear"/>
+        </w:rPr>
+      </w:pPr>
+      <w:r>
+        <w:rPr>
+          <w:rFonts w:ascii="Times New Roman" w:hAnsi="Times New Roman" w:cs="Times New Roman" w:eastAsia="Times New Roman"/>
+          <w:color w:val="auto"/>
+          <w:spacing w:val="0"/>
+          <w:position w:val="0"/>
+          <w:sz w:val="24"/>
+          <w:shd w:fill="auto" w:val="clear"/>
+        </w:rPr>
+        <w:t xml:space="preserve">Double DQN configuration </w:t>
       </w:r>
     </w:p>
     <w:p>
@@ -3931,7 +4241,7 @@
           <w:sz w:val="36"/>
           <w:shd w:fill="auto" w:val="clear"/>
         </w:rPr>
-        <w:t xml:space="preserve">Phase 6 </w:t>
+        <w:t xml:space="preserve">Phase 7 </w:t>
       </w:r>
       <w:r>
         <w:rPr>
@@ -3955,7 +4265,7 @@
           <w:sz w:val="36"/>
           <w:shd w:fill="auto" w:val="clear"/>
         </w:rPr>
-        <w:t xml:space="preserve"> Experiment Tracking</w:t>
+        <w:t xml:space="preserve"> Evaluation</w:t>
       </w:r>
     </w:p>
     <w:p>
@@ -3983,327 +4293,6 @@
           <w:sz w:val="27"/>
           <w:shd w:fill="auto" w:val="clear"/>
         </w:rPr>
-        <w:t xml:space="preserve">Task 17: Integrate Weights &amp; Biases</w:t>
-      </w:r>
-    </w:p>
-    <w:p>
-      <w:pPr>
-        <w:numPr>
-          <w:ilvl w:val="0"/>
-          <w:numId w:val="45"/>
-        </w:numPr>
-        <w:tabs>
-          <w:tab w:val="left" w:pos="720" w:leader="none"/>
-        </w:tabs>
-        <w:spacing w:before="100" w:after="100" w:line="240"/>
-        <w:ind w:right="0" w:left="720" w:hanging="360"/>
-        <w:jc w:val="left"/>
-        <w:rPr>
-          <w:rFonts w:ascii="Times New Roman" w:hAnsi="Times New Roman" w:cs="Times New Roman" w:eastAsia="Times New Roman"/>
-          <w:color w:val="auto"/>
-          <w:spacing w:val="0"/>
-          <w:position w:val="0"/>
-          <w:sz w:val="24"/>
-          <w:shd w:fill="auto" w:val="clear"/>
-        </w:rPr>
-      </w:pPr>
-      <w:r>
-        <w:rPr>
-          <w:rFonts w:ascii="Times New Roman" w:hAnsi="Times New Roman" w:cs="Times New Roman" w:eastAsia="Times New Roman"/>
-          <w:color w:val="auto"/>
-          <w:spacing w:val="0"/>
-          <w:position w:val="0"/>
-          <w:sz w:val="24"/>
-          <w:shd w:fill="auto" w:val="clear"/>
-        </w:rPr>
-        <w:t xml:space="preserve">Log reward </w:t>
-      </w:r>
-    </w:p>
-    <w:p>
-      <w:pPr>
-        <w:numPr>
-          <w:ilvl w:val="0"/>
-          <w:numId w:val="45"/>
-        </w:numPr>
-        <w:tabs>
-          <w:tab w:val="left" w:pos="720" w:leader="none"/>
-        </w:tabs>
-        <w:spacing w:before="100" w:after="100" w:line="240"/>
-        <w:ind w:right="0" w:left="720" w:hanging="360"/>
-        <w:jc w:val="left"/>
-        <w:rPr>
-          <w:rFonts w:ascii="Times New Roman" w:hAnsi="Times New Roman" w:cs="Times New Roman" w:eastAsia="Times New Roman"/>
-          <w:color w:val="auto"/>
-          <w:spacing w:val="0"/>
-          <w:position w:val="0"/>
-          <w:sz w:val="24"/>
-          <w:shd w:fill="auto" w:val="clear"/>
-        </w:rPr>
-      </w:pPr>
-      <w:r>
-        <w:rPr>
-          <w:rFonts w:ascii="Times New Roman" w:hAnsi="Times New Roman" w:cs="Times New Roman" w:eastAsia="Times New Roman"/>
-          <w:color w:val="auto"/>
-          <w:spacing w:val="0"/>
-          <w:position w:val="0"/>
-          <w:sz w:val="24"/>
-          <w:shd w:fill="auto" w:val="clear"/>
-        </w:rPr>
-        <w:t xml:space="preserve">Log loss </w:t>
-      </w:r>
-    </w:p>
-    <w:p>
-      <w:pPr>
-        <w:numPr>
-          <w:ilvl w:val="0"/>
-          <w:numId w:val="45"/>
-        </w:numPr>
-        <w:tabs>
-          <w:tab w:val="left" w:pos="720" w:leader="none"/>
-        </w:tabs>
-        <w:spacing w:before="100" w:after="100" w:line="240"/>
-        <w:ind w:right="0" w:left="720" w:hanging="360"/>
-        <w:jc w:val="left"/>
-        <w:rPr>
-          <w:rFonts w:ascii="Times New Roman" w:hAnsi="Times New Roman" w:cs="Times New Roman" w:eastAsia="Times New Roman"/>
-          <w:color w:val="auto"/>
-          <w:spacing w:val="0"/>
-          <w:position w:val="0"/>
-          <w:sz w:val="24"/>
-          <w:shd w:fill="auto" w:val="clear"/>
-        </w:rPr>
-      </w:pPr>
-      <w:r>
-        <w:rPr>
-          <w:rFonts w:ascii="Times New Roman" w:hAnsi="Times New Roman" w:cs="Times New Roman" w:eastAsia="Times New Roman"/>
-          <w:color w:val="auto"/>
-          <w:spacing w:val="0"/>
-          <w:position w:val="0"/>
-          <w:sz w:val="24"/>
-          <w:shd w:fill="auto" w:val="clear"/>
-        </w:rPr>
-        <w:t xml:space="preserve">Log epsilon </w:t>
-      </w:r>
-    </w:p>
-    <w:p>
-      <w:pPr>
-        <w:numPr>
-          <w:ilvl w:val="0"/>
-          <w:numId w:val="45"/>
-        </w:numPr>
-        <w:tabs>
-          <w:tab w:val="left" w:pos="720" w:leader="none"/>
-        </w:tabs>
-        <w:spacing w:before="100" w:after="100" w:line="240"/>
-        <w:ind w:right="0" w:left="720" w:hanging="360"/>
-        <w:jc w:val="left"/>
-        <w:rPr>
-          <w:rFonts w:ascii="Times New Roman" w:hAnsi="Times New Roman" w:cs="Times New Roman" w:eastAsia="Times New Roman"/>
-          <w:color w:val="auto"/>
-          <w:spacing w:val="0"/>
-          <w:position w:val="0"/>
-          <w:sz w:val="24"/>
-          <w:shd w:fill="auto" w:val="clear"/>
-        </w:rPr>
-      </w:pPr>
-      <w:r>
-        <w:rPr>
-          <w:rFonts w:ascii="Times New Roman" w:hAnsi="Times New Roman" w:cs="Times New Roman" w:eastAsia="Times New Roman"/>
-          <w:color w:val="auto"/>
-          <w:spacing w:val="0"/>
-          <w:position w:val="0"/>
-          <w:sz w:val="24"/>
-          <w:shd w:fill="auto" w:val="clear"/>
-        </w:rPr>
-        <w:t xml:space="preserve">Log Q-values (optional) </w:t>
-      </w:r>
-    </w:p>
-    <w:p>
-      <w:pPr>
-        <w:spacing w:before="100" w:after="100" w:line="240"/>
-        <w:ind w:right="0" w:left="0" w:firstLine="0"/>
-        <w:jc w:val="left"/>
-        <w:rPr>
-          <w:rFonts w:ascii="Times New Roman" w:hAnsi="Times New Roman" w:cs="Times New Roman" w:eastAsia="Times New Roman"/>
-          <w:b/>
-          <w:color w:val="auto"/>
-          <w:spacing w:val="0"/>
-          <w:position w:val="0"/>
-          <w:sz w:val="27"/>
-          <w:shd w:fill="auto" w:val="clear"/>
-        </w:rPr>
-      </w:pPr>
-      <w:r>
-        <w:rPr>
-          <w:rFonts w:ascii="Times New Roman" w:hAnsi="Times New Roman" w:cs="Times New Roman" w:eastAsia="Times New Roman"/>
-          <w:b/>
-          <w:color w:val="auto"/>
-          <w:spacing w:val="0"/>
-          <w:position w:val="0"/>
-          <w:sz w:val="27"/>
-          <w:shd w:fill="auto" w:val="clear"/>
-        </w:rPr>
-        <w:t xml:space="preserve">Task 18: Configure Experiments</w:t>
-      </w:r>
-    </w:p>
-    <w:p>
-      <w:pPr>
-        <w:numPr>
-          <w:ilvl w:val="0"/>
-          <w:numId w:val="47"/>
-        </w:numPr>
-        <w:tabs>
-          <w:tab w:val="left" w:pos="720" w:leader="none"/>
-        </w:tabs>
-        <w:spacing w:before="100" w:after="100" w:line="240"/>
-        <w:ind w:right="0" w:left="720" w:hanging="360"/>
-        <w:jc w:val="left"/>
-        <w:rPr>
-          <w:rFonts w:ascii="Times New Roman" w:hAnsi="Times New Roman" w:cs="Times New Roman" w:eastAsia="Times New Roman"/>
-          <w:color w:val="auto"/>
-          <w:spacing w:val="0"/>
-          <w:position w:val="0"/>
-          <w:sz w:val="24"/>
-          <w:shd w:fill="auto" w:val="clear"/>
-        </w:rPr>
-      </w:pPr>
-      <w:r>
-        <w:rPr>
-          <w:rFonts w:ascii="Times New Roman" w:hAnsi="Times New Roman" w:cs="Times New Roman" w:eastAsia="Times New Roman"/>
-          <w:color w:val="auto"/>
-          <w:spacing w:val="0"/>
-          <w:position w:val="0"/>
-          <w:sz w:val="24"/>
-          <w:shd w:fill="auto" w:val="clear"/>
-        </w:rPr>
-        <w:t xml:space="preserve">DQN configuration </w:t>
-      </w:r>
-    </w:p>
-    <w:p>
-      <w:pPr>
-        <w:numPr>
-          <w:ilvl w:val="0"/>
-          <w:numId w:val="47"/>
-        </w:numPr>
-        <w:tabs>
-          <w:tab w:val="left" w:pos="720" w:leader="none"/>
-        </w:tabs>
-        <w:spacing w:before="100" w:after="100" w:line="240"/>
-        <w:ind w:right="0" w:left="720" w:hanging="360"/>
-        <w:jc w:val="left"/>
-        <w:rPr>
-          <w:rFonts w:ascii="Times New Roman" w:hAnsi="Times New Roman" w:cs="Times New Roman" w:eastAsia="Times New Roman"/>
-          <w:color w:val="auto"/>
-          <w:spacing w:val="0"/>
-          <w:position w:val="0"/>
-          <w:sz w:val="24"/>
-          <w:shd w:fill="auto" w:val="clear"/>
-        </w:rPr>
-      </w:pPr>
-      <w:r>
-        <w:rPr>
-          <w:rFonts w:ascii="Times New Roman" w:hAnsi="Times New Roman" w:cs="Times New Roman" w:eastAsia="Times New Roman"/>
-          <w:color w:val="auto"/>
-          <w:spacing w:val="0"/>
-          <w:position w:val="0"/>
-          <w:sz w:val="24"/>
-          <w:shd w:fill="auto" w:val="clear"/>
-        </w:rPr>
-        <w:t xml:space="preserve">Double DQN configuration </w:t>
-      </w:r>
-    </w:p>
-    <w:p>
-      <w:pPr>
-        <w:spacing w:before="0" w:after="0" w:line="240"/>
-        <w:ind w:right="0" w:left="0" w:firstLine="0"/>
-        <w:jc w:val="left"/>
-        <w:rPr>
-          <w:rFonts w:ascii="Times New Roman" w:hAnsi="Times New Roman" w:cs="Times New Roman" w:eastAsia="Times New Roman"/>
-          <w:color w:val="auto"/>
-          <w:spacing w:val="0"/>
-          <w:position w:val="0"/>
-          <w:sz w:val="24"/>
-          <w:shd w:fill="auto" w:val="clear"/>
-        </w:rPr>
-      </w:pPr>
-    </w:p>
-    <w:p>
-      <w:pPr>
-        <w:spacing w:before="100" w:after="100" w:line="240"/>
-        <w:ind w:right="0" w:left="0" w:firstLine="0"/>
-        <w:jc w:val="left"/>
-        <w:rPr>
-          <w:rFonts w:ascii="Times New Roman" w:hAnsi="Times New Roman" w:cs="Times New Roman" w:eastAsia="Times New Roman"/>
-          <w:b/>
-          <w:color w:val="auto"/>
-          <w:spacing w:val="0"/>
-          <w:position w:val="0"/>
-          <w:sz w:val="36"/>
-          <w:shd w:fill="auto" w:val="clear"/>
-        </w:rPr>
-      </w:pPr>
-      <w:r>
-        <w:rPr>
-          <w:rFonts w:ascii="Times New Roman" w:hAnsi="Times New Roman" w:cs="Times New Roman" w:eastAsia="Times New Roman"/>
-          <w:b/>
-          <w:color w:val="auto"/>
-          <w:spacing w:val="0"/>
-          <w:position w:val="0"/>
-          <w:sz w:val="36"/>
-          <w:shd w:fill="auto" w:val="clear"/>
-        </w:rPr>
-        <w:t xml:space="preserve">Phase 7 </w:t>
-      </w:r>
-      <w:r>
-        <w:rPr>
-          <w:rFonts w:ascii="Times New Roman" w:hAnsi="Times New Roman" w:cs="Times New Roman" w:eastAsia="Times New Roman"/>
-          <w:b/>
-          <w:color w:val="auto"/>
-          <w:spacing w:val="0"/>
-          <w:position w:val="0"/>
-          <w:sz w:val="36"/>
-          <w:shd w:fill="auto" w:val="clear"/>
-        </w:rPr>
-        <w:t xml:space="preserve">–</w:t>
-      </w:r>
-      <w:r>
-        <w:rPr>
-          <w:rFonts w:ascii="Times New Roman" w:hAnsi="Times New Roman" w:cs="Times New Roman" w:eastAsia="Times New Roman"/>
-          <w:b/>
-          <w:color w:val="auto"/>
-          <w:spacing w:val="0"/>
-          <w:position w:val="0"/>
-          <w:sz w:val="36"/>
-          <w:shd w:fill="auto" w:val="clear"/>
-        </w:rPr>
-        <w:t xml:space="preserve"> Evaluation</w:t>
-      </w:r>
-    </w:p>
-    <w:p>
-      <w:pPr>
-        <w:spacing w:before="100" w:after="100" w:line="240"/>
-        <w:ind w:right="0" w:left="0" w:firstLine="0"/>
-        <w:jc w:val="left"/>
-        <w:rPr>
-          <w:rFonts w:ascii="Times New Roman" w:hAnsi="Times New Roman" w:cs="Times New Roman" w:eastAsia="Times New Roman"/>
-          <w:b/>
-          <w:color w:val="auto"/>
-          <w:spacing w:val="0"/>
-          <w:position w:val="0"/>
-          <w:sz w:val="27"/>
-          <w:shd w:fill="auto" w:val="clear"/>
-        </w:rPr>
-      </w:pPr>
-      <w:r>
-        <w:rPr>
-          <w:rFonts w:ascii="Times New Roman" w:hAnsi="Times New Roman" w:cs="Times New Roman" w:eastAsia="Times New Roman"/>
-          <w:b/>
-          <w:color w:val="auto"/>
-          <w:spacing w:val="0"/>
-          <w:position w:val="0"/>
-          <w:sz w:val="27"/>
-          <w:shd w:fill="auto" w:val="clear"/>
-        </w:rPr>
         <w:t xml:space="preserve">Task 19: Train DQN</w:t>
       </w:r>
     </w:p>
@@ -4461,65 +4450,65 @@
           <w:sz w:val="24"/>
           <w:shd w:fill="auto" w:val="clear"/>
         </w:rPr>
-        <w:t xml:space="preserve">Metrics: average reward: 3.69</w:t>
-      </w:r>
-    </w:p>
-    <w:p>
-      <w:pPr>
-        <w:tabs>
-          <w:tab w:val="left" w:pos="720" w:leader="none"/>
-        </w:tabs>
-        <w:spacing w:before="100" w:after="100" w:line="240"/>
-        <w:ind w:right="0" w:left="0" w:firstLine="0"/>
-        <w:jc w:val="left"/>
-        <w:rPr>
-          <w:rFonts w:ascii="Times New Roman" w:hAnsi="Times New Roman" w:cs="Times New Roman" w:eastAsia="Times New Roman"/>
-          <w:color w:val="auto"/>
-          <w:spacing w:val="0"/>
-          <w:position w:val="0"/>
-          <w:sz w:val="24"/>
-          <w:shd w:fill="auto" w:val="clear"/>
-        </w:rPr>
-      </w:pPr>
-      <w:r>
-        <w:rPr>
-          <w:rFonts w:ascii="Times New Roman" w:hAnsi="Times New Roman" w:cs="Times New Roman" w:eastAsia="Times New Roman"/>
-          <w:color w:val="auto"/>
-          <w:spacing w:val="0"/>
-          <w:position w:val="0"/>
-          <w:sz w:val="24"/>
-          <w:shd w:fill="auto" w:val="clear"/>
-        </w:rPr>
-        <w:t xml:space="preserve">maximum reward: 11.0</w:t>
-      </w:r>
-    </w:p>
-    <w:p>
-      <w:pPr>
-        <w:tabs>
-          <w:tab w:val="left" w:pos="720" w:leader="none"/>
-        </w:tabs>
-        <w:spacing w:before="100" w:after="100" w:line="240"/>
-        <w:ind w:right="0" w:left="0" w:firstLine="0"/>
-        <w:jc w:val="left"/>
-        <w:rPr>
-          <w:rFonts w:ascii="Times New Roman" w:hAnsi="Times New Roman" w:cs="Times New Roman" w:eastAsia="Times New Roman"/>
-          <w:color w:val="auto"/>
-          <w:spacing w:val="0"/>
-          <w:position w:val="0"/>
-          <w:sz w:val="24"/>
-          <w:shd w:fill="auto" w:val="clear"/>
-        </w:rPr>
-      </w:pPr>
-      <w:r>
-        <w:rPr>
-          <w:rFonts w:ascii="Times New Roman" w:hAnsi="Times New Roman" w:cs="Times New Roman" w:eastAsia="Times New Roman"/>
-          <w:color w:val="auto"/>
-          <w:spacing w:val="0"/>
-          <w:position w:val="0"/>
-          <w:sz w:val="24"/>
-          <w:shd w:fill="auto" w:val="clear"/>
-        </w:rPr>
-        <w:t xml:space="preserve">variability/standard deviation: 2.3439069947418987</w:t>
+        <w:t xml:space="preserve">Metrics: average reward: 2.48</w:t>
+      </w:r>
+    </w:p>
+    <w:p>
+      <w:pPr>
+        <w:tabs>
+          <w:tab w:val="left" w:pos="720" w:leader="none"/>
+        </w:tabs>
+        <w:spacing w:before="100" w:after="100" w:line="240"/>
+        <w:ind w:right="0" w:left="0" w:firstLine="0"/>
+        <w:jc w:val="left"/>
+        <w:rPr>
+          <w:rFonts w:ascii="Times New Roman" w:hAnsi="Times New Roman" w:cs="Times New Roman" w:eastAsia="Times New Roman"/>
+          <w:color w:val="auto"/>
+          <w:spacing w:val="0"/>
+          <w:position w:val="0"/>
+          <w:sz w:val="24"/>
+          <w:shd w:fill="auto" w:val="clear"/>
+        </w:rPr>
+      </w:pPr>
+      <w:r>
+        <w:rPr>
+          <w:rFonts w:ascii="Times New Roman" w:hAnsi="Times New Roman" w:cs="Times New Roman" w:eastAsia="Times New Roman"/>
+          <w:color w:val="auto"/>
+          <w:spacing w:val="0"/>
+          <w:position w:val="0"/>
+          <w:sz w:val="24"/>
+          <w:shd w:fill="auto" w:val="clear"/>
+        </w:rPr>
+        <w:t xml:space="preserve">maximum reward: 8.0</w:t>
+      </w:r>
+    </w:p>
+    <w:p>
+      <w:pPr>
+        <w:tabs>
+          <w:tab w:val="left" w:pos="720" w:leader="none"/>
+        </w:tabs>
+        <w:spacing w:before="100" w:after="100" w:line="240"/>
+        <w:ind w:right="0" w:left="0" w:firstLine="0"/>
+        <w:jc w:val="left"/>
+        <w:rPr>
+          <w:rFonts w:ascii="Times New Roman" w:hAnsi="Times New Roman" w:cs="Times New Roman" w:eastAsia="Times New Roman"/>
+          <w:color w:val="auto"/>
+          <w:spacing w:val="0"/>
+          <w:position w:val="0"/>
+          <w:sz w:val="24"/>
+          <w:shd w:fill="auto" w:val="clear"/>
+        </w:rPr>
+      </w:pPr>
+      <w:r>
+        <w:rPr>
+          <w:rFonts w:ascii="Times New Roman" w:hAnsi="Times New Roman" w:cs="Times New Roman" w:eastAsia="Times New Roman"/>
+          <w:color w:val="auto"/>
+          <w:spacing w:val="0"/>
+          <w:position w:val="0"/>
+          <w:sz w:val="24"/>
+          <w:shd w:fill="auto" w:val="clear"/>
+        </w:rPr>
+        <w:t xml:space="preserve">variability/standard deviation: 1.6939893742287757</w:t>
       </w:r>
     </w:p>
     <w:p>
@@ -4550,8 +4539,191 @@
         </w:rPr>
         <w:t xml:space="preserve">final epsilon: 0.1000089999999999</w:t>
         <w:br/>
-        <w:t xml:space="preserve">final loss: 0.009555711410939693</w:t>
-      </w:r>
+        <w:t xml:space="preserve">final loss: 0.01035758201032877</w:t>
+      </w:r>
+    </w:p>
+    <w:p>
+      <w:pPr>
+        <w:tabs>
+          <w:tab w:val="left" w:pos="720" w:leader="none"/>
+        </w:tabs>
+        <w:spacing w:before="100" w:after="100" w:line="240"/>
+        <w:ind w:right="0" w:left="0" w:firstLine="0"/>
+        <w:jc w:val="left"/>
+        <w:rPr>
+          <w:rFonts w:ascii="Times New Roman" w:hAnsi="Times New Roman" w:cs="Times New Roman" w:eastAsia="Times New Roman"/>
+          <w:color w:val="auto"/>
+          <w:spacing w:val="0"/>
+          <w:position w:val="0"/>
+          <w:sz w:val="24"/>
+          <w:shd w:fill="auto" w:val="clear"/>
+        </w:rPr>
+      </w:pPr>
+    </w:p>
+    <w:p>
+      <w:pPr>
+        <w:tabs>
+          <w:tab w:val="left" w:pos="720" w:leader="none"/>
+        </w:tabs>
+        <w:spacing w:before="100" w:after="100" w:line="240"/>
+        <w:ind w:right="0" w:left="0" w:firstLine="0"/>
+        <w:jc w:val="left"/>
+        <w:rPr>
+          <w:rFonts w:ascii="Times New Roman" w:hAnsi="Times New Roman" w:cs="Times New Roman" w:eastAsia="Times New Roman"/>
+          <w:color w:val="auto"/>
+          <w:spacing w:val="0"/>
+          <w:position w:val="0"/>
+          <w:sz w:val="24"/>
+          <w:shd w:fill="auto" w:val="clear"/>
+        </w:rPr>
+      </w:pPr>
+      <w:r>
+        <w:rPr>
+          <w:rFonts w:ascii="Times New Roman" w:hAnsi="Times New Roman" w:cs="Times New Roman" w:eastAsia="Times New Roman"/>
+          <w:color w:val="auto"/>
+          <w:spacing w:val="0"/>
+          <w:position w:val="0"/>
+          <w:sz w:val="24"/>
+          <w:shd w:fill="auto" w:val="clear"/>
+        </w:rPr>
+        <w:t xml:space="preserve">200K steps continued from 100K steps</w:t>
+      </w:r>
+    </w:p>
+    <w:p>
+      <w:pPr>
+        <w:tabs>
+          <w:tab w:val="left" w:pos="720" w:leader="none"/>
+        </w:tabs>
+        <w:spacing w:before="100" w:after="100" w:line="240"/>
+        <w:ind w:right="0" w:left="0" w:firstLine="0"/>
+        <w:jc w:val="left"/>
+        <w:rPr>
+          <w:rFonts w:ascii="Times New Roman" w:hAnsi="Times New Roman" w:cs="Times New Roman" w:eastAsia="Times New Roman"/>
+          <w:color w:val="auto"/>
+          <w:spacing w:val="0"/>
+          <w:position w:val="0"/>
+          <w:sz w:val="24"/>
+          <w:shd w:fill="auto" w:val="clear"/>
+        </w:rPr>
+      </w:pPr>
+      <w:r>
+        <w:rPr>
+          <w:rFonts w:ascii="Times New Roman" w:hAnsi="Times New Roman" w:cs="Times New Roman" w:eastAsia="Times New Roman"/>
+          <w:color w:val="auto"/>
+          <w:spacing w:val="0"/>
+          <w:position w:val="0"/>
+          <w:sz w:val="24"/>
+          <w:shd w:fill="auto" w:val="clear"/>
+        </w:rPr>
+        <w:t xml:space="preserve">Metrics: average reward: 7.88</w:t>
+      </w:r>
+    </w:p>
+    <w:p>
+      <w:pPr>
+        <w:tabs>
+          <w:tab w:val="left" w:pos="720" w:leader="none"/>
+        </w:tabs>
+        <w:spacing w:before="100" w:after="100" w:line="240"/>
+        <w:ind w:right="0" w:left="0" w:firstLine="0"/>
+        <w:jc w:val="left"/>
+        <w:rPr>
+          <w:rFonts w:ascii="Times New Roman" w:hAnsi="Times New Roman" w:cs="Times New Roman" w:eastAsia="Times New Roman"/>
+          <w:color w:val="auto"/>
+          <w:spacing w:val="0"/>
+          <w:position w:val="0"/>
+          <w:sz w:val="24"/>
+          <w:shd w:fill="auto" w:val="clear"/>
+        </w:rPr>
+      </w:pPr>
+      <w:r>
+        <w:rPr>
+          <w:rFonts w:ascii="Times New Roman" w:hAnsi="Times New Roman" w:cs="Times New Roman" w:eastAsia="Times New Roman"/>
+          <w:color w:val="auto"/>
+          <w:spacing w:val="0"/>
+          <w:position w:val="0"/>
+          <w:sz w:val="24"/>
+          <w:shd w:fill="auto" w:val="clear"/>
+        </w:rPr>
+        <w:t xml:space="preserve">maximum reward: 18.0</w:t>
+      </w:r>
+    </w:p>
+    <w:p>
+      <w:pPr>
+        <w:tabs>
+          <w:tab w:val="left" w:pos="720" w:leader="none"/>
+        </w:tabs>
+        <w:spacing w:before="100" w:after="100" w:line="240"/>
+        <w:ind w:right="0" w:left="0" w:firstLine="0"/>
+        <w:jc w:val="left"/>
+        <w:rPr>
+          <w:rFonts w:ascii="Times New Roman" w:hAnsi="Times New Roman" w:cs="Times New Roman" w:eastAsia="Times New Roman"/>
+          <w:color w:val="auto"/>
+          <w:spacing w:val="0"/>
+          <w:position w:val="0"/>
+          <w:sz w:val="24"/>
+          <w:shd w:fill="auto" w:val="clear"/>
+        </w:rPr>
+      </w:pPr>
+      <w:r>
+        <w:rPr>
+          <w:rFonts w:ascii="Times New Roman" w:hAnsi="Times New Roman" w:cs="Times New Roman" w:eastAsia="Times New Roman"/>
+          <w:color w:val="auto"/>
+          <w:spacing w:val="0"/>
+          <w:position w:val="0"/>
+          <w:sz w:val="24"/>
+          <w:shd w:fill="auto" w:val="clear"/>
+        </w:rPr>
+        <w:t xml:space="preserve">variability/standard deviation: 3.043944808960898</w:t>
+      </w:r>
+    </w:p>
+    <w:p>
+      <w:pPr>
+        <w:tabs>
+          <w:tab w:val="left" w:pos="720" w:leader="none"/>
+        </w:tabs>
+        <w:spacing w:before="100" w:after="100" w:line="240"/>
+        <w:ind w:right="0" w:left="0" w:firstLine="0"/>
+        <w:jc w:val="left"/>
+        <w:rPr>
+          <w:rFonts w:ascii="Times New Roman" w:hAnsi="Times New Roman" w:cs="Times New Roman" w:eastAsia="Times New Roman"/>
+          <w:color w:val="auto"/>
+          <w:spacing w:val="0"/>
+          <w:position w:val="0"/>
+          <w:sz w:val="24"/>
+          <w:shd w:fill="auto" w:val="clear"/>
+        </w:rPr>
+      </w:pPr>
+      <w:r>
+        <w:rPr>
+          <w:rFonts w:ascii="Times New Roman" w:hAnsi="Times New Roman" w:cs="Times New Roman" w:eastAsia="Times New Roman"/>
+          <w:color w:val="auto"/>
+          <w:spacing w:val="0"/>
+          <w:position w:val="0"/>
+          <w:sz w:val="24"/>
+          <w:shd w:fill="auto" w:val="clear"/>
+        </w:rPr>
+        <w:t xml:space="preserve">final epsilon: 0.1 (throughout)</w:t>
+        <w:br/>
+        <w:t xml:space="preserve">final loss: 0.008446241728961468</w:t>
+      </w:r>
+    </w:p>
+    <w:p>
+      <w:pPr>
+        <w:tabs>
+          <w:tab w:val="left" w:pos="720" w:leader="none"/>
+        </w:tabs>
+        <w:spacing w:before="100" w:after="100" w:line="240"/>
+        <w:ind w:right="0" w:left="0" w:firstLine="0"/>
+        <w:jc w:val="left"/>
+        <w:rPr>
+          <w:rFonts w:ascii="Times New Roman" w:hAnsi="Times New Roman" w:cs="Times New Roman" w:eastAsia="Times New Roman"/>
+          <w:color w:val="auto"/>
+          <w:spacing w:val="0"/>
+          <w:position w:val="0"/>
+          <w:sz w:val="24"/>
+          <w:shd w:fill="auto" w:val="clear"/>
+        </w:rPr>
+      </w:pPr>
     </w:p>
     <w:p>
       <w:pPr>
@@ -4585,7 +4757,7 @@
       <w:pPr>
         <w:numPr>
           <w:ilvl w:val="0"/>
-          <w:numId w:val="53"/>
+          <w:numId w:val="55"/>
         </w:numPr>
         <w:tabs>
           <w:tab w:val="left" w:pos="720" w:leader="none"/>
@@ -4618,7 +4790,7 @@
       <w:pPr>
         <w:numPr>
           <w:ilvl w:val="0"/>
-          <w:numId w:val="53"/>
+          <w:numId w:val="55"/>
         </w:numPr>
         <w:tabs>
           <w:tab w:val="left" w:pos="720" w:leader="none"/>
@@ -4651,7 +4823,7 @@
       <w:pPr>
         <w:numPr>
           <w:ilvl w:val="0"/>
-          <w:numId w:val="53"/>
+          <w:numId w:val="55"/>
         </w:numPr>
         <w:tabs>
           <w:tab w:val="left" w:pos="720" w:leader="none"/>
@@ -4682,6 +4854,354 @@
     </w:p>
     <w:p>
       <w:pPr>
+        <w:tabs>
+          <w:tab w:val="left" w:pos="720" w:leader="none"/>
+        </w:tabs>
+        <w:spacing w:before="100" w:after="100" w:line="240"/>
+        <w:ind w:right="0" w:left="0" w:firstLine="0"/>
+        <w:jc w:val="left"/>
+        <w:rPr>
+          <w:rFonts w:ascii="Times New Roman" w:hAnsi="Times New Roman" w:cs="Times New Roman" w:eastAsia="Times New Roman"/>
+          <w:color w:val="auto"/>
+          <w:spacing w:val="0"/>
+          <w:position w:val="0"/>
+          <w:sz w:val="24"/>
+          <w:shd w:fill="auto" w:val="clear"/>
+        </w:rPr>
+      </w:pPr>
+      <w:r>
+        <w:rPr>
+          <w:rFonts w:ascii="Times New Roman" w:hAnsi="Times New Roman" w:cs="Times New Roman" w:eastAsia="Times New Roman"/>
+          <w:color w:val="auto"/>
+          <w:spacing w:val="0"/>
+          <w:position w:val="0"/>
+          <w:sz w:val="24"/>
+          <w:shd w:fill="auto" w:val="clear"/>
+        </w:rPr>
+        <w:t xml:space="preserve">100K Steps</w:t>
+      </w:r>
+    </w:p>
+    <w:p>
+      <w:pPr>
+        <w:tabs>
+          <w:tab w:val="left" w:pos="720" w:leader="none"/>
+        </w:tabs>
+        <w:spacing w:before="100" w:after="100" w:line="240"/>
+        <w:ind w:right="0" w:left="0" w:firstLine="0"/>
+        <w:jc w:val="left"/>
+        <w:rPr>
+          <w:rFonts w:ascii="Times New Roman" w:hAnsi="Times New Roman" w:cs="Times New Roman" w:eastAsia="Times New Roman"/>
+          <w:color w:val="auto"/>
+          <w:spacing w:val="0"/>
+          <w:position w:val="0"/>
+          <w:sz w:val="24"/>
+          <w:shd w:fill="auto" w:val="clear"/>
+        </w:rPr>
+      </w:pPr>
+      <w:r>
+        <w:rPr>
+          <w:rFonts w:ascii="Times New Roman" w:hAnsi="Times New Roman" w:cs="Times New Roman" w:eastAsia="Times New Roman"/>
+          <w:color w:val="auto"/>
+          <w:spacing w:val="0"/>
+          <w:position w:val="0"/>
+          <w:sz w:val="24"/>
+          <w:shd w:fill="auto" w:val="clear"/>
+        </w:rPr>
+        <w:t xml:space="preserve">Metrics: average reward: 2.28</w:t>
+      </w:r>
+    </w:p>
+    <w:p>
+      <w:pPr>
+        <w:tabs>
+          <w:tab w:val="left" w:pos="720" w:leader="none"/>
+        </w:tabs>
+        <w:spacing w:before="100" w:after="100" w:line="240"/>
+        <w:ind w:right="0" w:left="0" w:firstLine="0"/>
+        <w:jc w:val="left"/>
+        <w:rPr>
+          <w:rFonts w:ascii="Times New Roman" w:hAnsi="Times New Roman" w:cs="Times New Roman" w:eastAsia="Times New Roman"/>
+          <w:color w:val="auto"/>
+          <w:spacing w:val="0"/>
+          <w:position w:val="0"/>
+          <w:sz w:val="24"/>
+          <w:shd w:fill="auto" w:val="clear"/>
+        </w:rPr>
+      </w:pPr>
+      <w:r>
+        <w:rPr>
+          <w:rFonts w:ascii="Times New Roman" w:hAnsi="Times New Roman" w:cs="Times New Roman" w:eastAsia="Times New Roman"/>
+          <w:color w:val="auto"/>
+          <w:spacing w:val="0"/>
+          <w:position w:val="0"/>
+          <w:sz w:val="24"/>
+          <w:shd w:fill="auto" w:val="clear"/>
+        </w:rPr>
+        <w:t xml:space="preserve">maximum reward: 8.0</w:t>
+      </w:r>
+    </w:p>
+    <w:p>
+      <w:pPr>
+        <w:tabs>
+          <w:tab w:val="left" w:pos="720" w:leader="none"/>
+        </w:tabs>
+        <w:spacing w:before="100" w:after="100" w:line="240"/>
+        <w:ind w:right="0" w:left="0" w:firstLine="0"/>
+        <w:jc w:val="left"/>
+        <w:rPr>
+          <w:rFonts w:ascii="Times New Roman" w:hAnsi="Times New Roman" w:cs="Times New Roman" w:eastAsia="Times New Roman"/>
+          <w:color w:val="auto"/>
+          <w:spacing w:val="0"/>
+          <w:position w:val="0"/>
+          <w:sz w:val="24"/>
+          <w:shd w:fill="auto" w:val="clear"/>
+        </w:rPr>
+      </w:pPr>
+      <w:r>
+        <w:rPr>
+          <w:rFonts w:ascii="Times New Roman" w:hAnsi="Times New Roman" w:cs="Times New Roman" w:eastAsia="Times New Roman"/>
+          <w:color w:val="auto"/>
+          <w:spacing w:val="0"/>
+          <w:position w:val="0"/>
+          <w:sz w:val="24"/>
+          <w:shd w:fill="auto" w:val="clear"/>
+        </w:rPr>
+        <w:t xml:space="preserve">variability/standard deviation: 1.2812493902437574</w:t>
+      </w:r>
+    </w:p>
+    <w:p>
+      <w:pPr>
+        <w:tabs>
+          <w:tab w:val="left" w:pos="720" w:leader="none"/>
+        </w:tabs>
+        <w:spacing w:before="100" w:after="100" w:line="240"/>
+        <w:ind w:right="0" w:left="0" w:firstLine="0"/>
+        <w:jc w:val="left"/>
+        <w:rPr>
+          <w:rFonts w:ascii="Times New Roman" w:hAnsi="Times New Roman" w:cs="Times New Roman" w:eastAsia="Times New Roman"/>
+          <w:color w:val="auto"/>
+          <w:spacing w:val="0"/>
+          <w:position w:val="0"/>
+          <w:sz w:val="24"/>
+          <w:shd w:fill="auto" w:val="clear"/>
+        </w:rPr>
+      </w:pPr>
+      <w:r>
+        <w:rPr>
+          <w:rFonts w:ascii="Times New Roman" w:hAnsi="Times New Roman" w:cs="Times New Roman" w:eastAsia="Times New Roman"/>
+          <w:color w:val="auto"/>
+          <w:spacing w:val="0"/>
+          <w:position w:val="0"/>
+          <w:sz w:val="24"/>
+          <w:shd w:fill="auto" w:val="clear"/>
+        </w:rPr>
+        <w:t xml:space="preserve">final epsilon: 0.1000089999999999</w:t>
+        <w:br/>
+        <w:t xml:space="preserve">final loss: 0.003254551440477371</w:t>
+      </w:r>
+    </w:p>
+    <w:p>
+      <w:pPr>
+        <w:tabs>
+          <w:tab w:val="left" w:pos="720" w:leader="none"/>
+        </w:tabs>
+        <w:spacing w:before="100" w:after="100" w:line="240"/>
+        <w:ind w:right="0" w:left="0" w:firstLine="0"/>
+        <w:jc w:val="left"/>
+        <w:rPr>
+          <w:rFonts w:ascii="Times New Roman" w:hAnsi="Times New Roman" w:cs="Times New Roman" w:eastAsia="Times New Roman"/>
+          <w:color w:val="auto"/>
+          <w:spacing w:val="0"/>
+          <w:position w:val="0"/>
+          <w:sz w:val="24"/>
+          <w:shd w:fill="auto" w:val="clear"/>
+        </w:rPr>
+      </w:pPr>
+    </w:p>
+    <w:p>
+      <w:pPr>
+        <w:tabs>
+          <w:tab w:val="left" w:pos="720" w:leader="none"/>
+        </w:tabs>
+        <w:spacing w:before="100" w:after="100" w:line="240"/>
+        <w:ind w:right="0" w:left="0" w:firstLine="0"/>
+        <w:jc w:val="left"/>
+        <w:rPr>
+          <w:rFonts w:ascii="Times New Roman" w:hAnsi="Times New Roman" w:cs="Times New Roman" w:eastAsia="Times New Roman"/>
+          <w:color w:val="auto"/>
+          <w:spacing w:val="0"/>
+          <w:position w:val="0"/>
+          <w:sz w:val="24"/>
+          <w:shd w:fill="auto" w:val="clear"/>
+        </w:rPr>
+      </w:pPr>
+      <w:r>
+        <w:rPr>
+          <w:rFonts w:ascii="Times New Roman" w:hAnsi="Times New Roman" w:cs="Times New Roman" w:eastAsia="Times New Roman"/>
+          <w:color w:val="auto"/>
+          <w:spacing w:val="0"/>
+          <w:position w:val="0"/>
+          <w:sz w:val="24"/>
+          <w:shd w:fill="auto" w:val="clear"/>
+        </w:rPr>
+        <w:t xml:space="preserve">200K steps continued from 100K steps</w:t>
+      </w:r>
+    </w:p>
+    <w:p>
+      <w:pPr>
+        <w:tabs>
+          <w:tab w:val="left" w:pos="720" w:leader="none"/>
+        </w:tabs>
+        <w:spacing w:before="100" w:after="100" w:line="240"/>
+        <w:ind w:right="0" w:left="0" w:firstLine="0"/>
+        <w:jc w:val="left"/>
+        <w:rPr>
+          <w:rFonts w:ascii="Times New Roman" w:hAnsi="Times New Roman" w:cs="Times New Roman" w:eastAsia="Times New Roman"/>
+          <w:color w:val="auto"/>
+          <w:spacing w:val="0"/>
+          <w:position w:val="0"/>
+          <w:sz w:val="24"/>
+          <w:shd w:fill="auto" w:val="clear"/>
+        </w:rPr>
+      </w:pPr>
+      <w:r>
+        <w:rPr>
+          <w:rFonts w:ascii="Times New Roman" w:hAnsi="Times New Roman" w:cs="Times New Roman" w:eastAsia="Times New Roman"/>
+          <w:color w:val="auto"/>
+          <w:spacing w:val="0"/>
+          <w:position w:val="0"/>
+          <w:sz w:val="24"/>
+          <w:shd w:fill="auto" w:val="clear"/>
+        </w:rPr>
+        <w:t xml:space="preserve">Metrics: average reward: 11.08</w:t>
+      </w:r>
+    </w:p>
+    <w:p>
+      <w:pPr>
+        <w:tabs>
+          <w:tab w:val="left" w:pos="720" w:leader="none"/>
+        </w:tabs>
+        <w:spacing w:before="100" w:after="100" w:line="240"/>
+        <w:ind w:right="0" w:left="0" w:firstLine="0"/>
+        <w:jc w:val="left"/>
+        <w:rPr>
+          <w:rFonts w:ascii="Times New Roman" w:hAnsi="Times New Roman" w:cs="Times New Roman" w:eastAsia="Times New Roman"/>
+          <w:color w:val="auto"/>
+          <w:spacing w:val="0"/>
+          <w:position w:val="0"/>
+          <w:sz w:val="24"/>
+          <w:shd w:fill="auto" w:val="clear"/>
+        </w:rPr>
+      </w:pPr>
+      <w:r>
+        <w:rPr>
+          <w:rFonts w:ascii="Times New Roman" w:hAnsi="Times New Roman" w:cs="Times New Roman" w:eastAsia="Times New Roman"/>
+          <w:color w:val="auto"/>
+          <w:spacing w:val="0"/>
+          <w:position w:val="0"/>
+          <w:sz w:val="24"/>
+          <w:shd w:fill="auto" w:val="clear"/>
+        </w:rPr>
+        <w:t xml:space="preserve">maximum reward: 26</w:t>
+      </w:r>
+    </w:p>
+    <w:p>
+      <w:pPr>
+        <w:tabs>
+          <w:tab w:val="left" w:pos="720" w:leader="none"/>
+        </w:tabs>
+        <w:spacing w:before="100" w:after="100" w:line="240"/>
+        <w:ind w:right="0" w:left="0" w:firstLine="0"/>
+        <w:jc w:val="left"/>
+        <w:rPr>
+          <w:rFonts w:ascii="Times New Roman" w:hAnsi="Times New Roman" w:cs="Times New Roman" w:eastAsia="Times New Roman"/>
+          <w:color w:val="auto"/>
+          <w:spacing w:val="0"/>
+          <w:position w:val="0"/>
+          <w:sz w:val="24"/>
+          <w:shd w:fill="auto" w:val="clear"/>
+        </w:rPr>
+      </w:pPr>
+      <w:r>
+        <w:rPr>
+          <w:rFonts w:ascii="Times New Roman" w:hAnsi="Times New Roman" w:cs="Times New Roman" w:eastAsia="Times New Roman"/>
+          <w:color w:val="auto"/>
+          <w:spacing w:val="0"/>
+          <w:position w:val="0"/>
+          <w:sz w:val="24"/>
+          <w:shd w:fill="auto" w:val="clear"/>
+        </w:rPr>
+        <w:t xml:space="preserve">variability/standard deviation: 4.058768286069062</w:t>
+      </w:r>
+    </w:p>
+    <w:p>
+      <w:pPr>
+        <w:tabs>
+          <w:tab w:val="left" w:pos="720" w:leader="none"/>
+        </w:tabs>
+        <w:spacing w:before="100" w:after="100" w:line="240"/>
+        <w:ind w:right="0" w:left="0" w:firstLine="0"/>
+        <w:jc w:val="left"/>
+        <w:rPr>
+          <w:rFonts w:ascii="Times New Roman" w:hAnsi="Times New Roman" w:cs="Times New Roman" w:eastAsia="Times New Roman"/>
+          <w:color w:val="auto"/>
+          <w:spacing w:val="0"/>
+          <w:position w:val="0"/>
+          <w:sz w:val="24"/>
+          <w:shd w:fill="auto" w:val="clear"/>
+        </w:rPr>
+      </w:pPr>
+      <w:r>
+        <w:rPr>
+          <w:rFonts w:ascii="Times New Roman" w:hAnsi="Times New Roman" w:cs="Times New Roman" w:eastAsia="Times New Roman"/>
+          <w:color w:val="auto"/>
+          <w:spacing w:val="0"/>
+          <w:position w:val="0"/>
+          <w:sz w:val="24"/>
+          <w:shd w:fill="auto" w:val="clear"/>
+        </w:rPr>
+        <w:t xml:space="preserve">final epsilon: 0.1 (throughout)</w:t>
+        <w:br/>
+        <w:t xml:space="preserve">final loss: 0.0022561608348041773</w:t>
+      </w:r>
+    </w:p>
+    <w:p>
+      <w:pPr>
+        <w:tabs>
+          <w:tab w:val="left" w:pos="720" w:leader="none"/>
+        </w:tabs>
+        <w:spacing w:before="100" w:after="100" w:line="240"/>
+        <w:ind w:right="0" w:left="0" w:firstLine="0"/>
+        <w:jc w:val="left"/>
+        <w:rPr>
+          <w:rFonts w:ascii="Times New Roman" w:hAnsi="Times New Roman" w:cs="Times New Roman" w:eastAsia="Times New Roman"/>
+          <w:color w:val="auto"/>
+          <w:spacing w:val="0"/>
+          <w:position w:val="0"/>
+          <w:sz w:val="24"/>
+          <w:shd w:fill="auto" w:val="clear"/>
+        </w:rPr>
+      </w:pPr>
+    </w:p>
+    <w:p>
+      <w:pPr>
+        <w:tabs>
+          <w:tab w:val="left" w:pos="720" w:leader="none"/>
+        </w:tabs>
+        <w:spacing w:before="100" w:after="100" w:line="240"/>
+        <w:ind w:right="0" w:left="0" w:firstLine="0"/>
+        <w:jc w:val="left"/>
+        <w:rPr>
+          <w:rFonts w:ascii="Times New Roman" w:hAnsi="Times New Roman" w:cs="Times New Roman" w:eastAsia="Times New Roman"/>
+          <w:color w:val="auto"/>
+          <w:spacing w:val="0"/>
+          <w:position w:val="0"/>
+          <w:sz w:val="24"/>
+          <w:shd w:fill="auto" w:val="clear"/>
+        </w:rPr>
+      </w:pPr>
+    </w:p>
+    <w:p>
+      <w:pPr>
         <w:spacing w:before="100" w:after="100" w:line="240"/>
         <w:ind w:right="0" w:left="0" w:firstLine="0"/>
         <w:jc w:val="left"/>
@@ -4712,7 +5232,7 @@
       <w:pPr>
         <w:numPr>
           <w:ilvl w:val="0"/>
-          <w:numId w:val="55"/>
+          <w:numId w:val="60"/>
         </w:numPr>
         <w:tabs>
           <w:tab w:val="left" w:pos="720" w:leader="none"/>
@@ -4745,7 +5265,7 @@
       <w:pPr>
         <w:numPr>
           <w:ilvl w:val="0"/>
-          <w:numId w:val="55"/>
+          <w:numId w:val="60"/>
         </w:numPr>
         <w:tabs>
           <w:tab w:val="left" w:pos="720" w:leader="none"/>
@@ -4778,7 +5298,7 @@
       <w:pPr>
         <w:numPr>
           <w:ilvl w:val="0"/>
-          <w:numId w:val="55"/>
+          <w:numId w:val="60"/>
         </w:numPr>
         <w:tabs>
           <w:tab w:val="left" w:pos="720" w:leader="none"/>
@@ -4811,7 +5331,7 @@
       <w:pPr>
         <w:numPr>
           <w:ilvl w:val="0"/>
-          <w:numId w:val="55"/>
+          <w:numId w:val="60"/>
         </w:numPr>
         <w:tabs>
           <w:tab w:val="left" w:pos="720" w:leader="none"/>
@@ -4939,7 +5459,7 @@
       <w:pPr>
         <w:numPr>
           <w:ilvl w:val="0"/>
-          <w:numId w:val="58"/>
+          <w:numId w:val="63"/>
         </w:numPr>
         <w:tabs>
           <w:tab w:val="left" w:pos="720" w:leader="none"/>
@@ -4972,7 +5492,7 @@
       <w:pPr>
         <w:numPr>
           <w:ilvl w:val="0"/>
-          <w:numId w:val="58"/>
+          <w:numId w:val="63"/>
         </w:numPr>
         <w:tabs>
           <w:tab w:val="left" w:pos="720" w:leader="none"/>
@@ -5005,7 +5525,7 @@
       <w:pPr>
         <w:numPr>
           <w:ilvl w:val="0"/>
-          <w:numId w:val="58"/>
+          <w:numId w:val="63"/>
         </w:numPr>
         <w:tabs>
           <w:tab w:val="left" w:pos="720" w:leader="none"/>
@@ -5066,7 +5586,7 @@
       <w:pPr>
         <w:numPr>
           <w:ilvl w:val="0"/>
-          <w:numId w:val="60"/>
+          <w:numId w:val="65"/>
         </w:numPr>
         <w:tabs>
           <w:tab w:val="left" w:pos="720" w:leader="none"/>
@@ -5099,7 +5619,7 @@
       <w:pPr>
         <w:numPr>
           <w:ilvl w:val="0"/>
-          <w:numId w:val="60"/>
+          <w:numId w:val="65"/>
         </w:numPr>
         <w:tabs>
           <w:tab w:val="left" w:pos="720" w:leader="none"/>
@@ -5132,7 +5652,7 @@
       <w:pPr>
         <w:numPr>
           <w:ilvl w:val="0"/>
-          <w:numId w:val="60"/>
+          <w:numId w:val="65"/>
         </w:numPr>
         <w:tabs>
           <w:tab w:val="left" w:pos="720" w:leader="none"/>
@@ -5193,7 +5713,7 @@
       <w:pPr>
         <w:numPr>
           <w:ilvl w:val="0"/>
-          <w:numId w:val="62"/>
+          <w:numId w:val="67"/>
         </w:numPr>
         <w:tabs>
           <w:tab w:val="left" w:pos="720" w:leader="none"/>
@@ -5226,7 +5746,7 @@
       <w:pPr>
         <w:numPr>
           <w:ilvl w:val="0"/>
-          <w:numId w:val="62"/>
+          <w:numId w:val="67"/>
         </w:numPr>
         <w:tabs>
           <w:tab w:val="left" w:pos="720" w:leader="none"/>
@@ -5287,40 +5807,40 @@
       <w:pPr>
         <w:numPr>
           <w:ilvl w:val="0"/>
-          <w:numId w:val="64"/>
-        </w:numPr>
-        <w:tabs>
-          <w:tab w:val="left" w:pos="720" w:leader="none"/>
-        </w:tabs>
-        <w:spacing w:before="100" w:after="100" w:line="240"/>
-        <w:ind w:right="0" w:left="720" w:hanging="360"/>
-        <w:jc w:val="left"/>
-        <w:rPr>
-          <w:rFonts w:ascii="Times New Roman" w:hAnsi="Times New Roman" w:cs="Times New Roman" w:eastAsia="Times New Roman"/>
-          <w:color w:val="auto"/>
-          <w:spacing w:val="0"/>
-          <w:position w:val="0"/>
-          <w:sz w:val="24"/>
-          <w:shd w:fill="auto" w:val="clear"/>
-        </w:rPr>
-      </w:pPr>
-      <w:r>
-        <w:rPr>
-          <w:rFonts w:ascii="Times New Roman" w:hAnsi="Times New Roman" w:cs="Times New Roman" w:eastAsia="Times New Roman"/>
-          <w:color w:val="auto"/>
-          <w:spacing w:val="0"/>
-          <w:position w:val="0"/>
-          <w:sz w:val="24"/>
-          <w:shd w:fill="auto" w:val="clear"/>
-        </w:rPr>
-        <w:t xml:space="preserve">Motivation </w:t>
-      </w:r>
-    </w:p>
-    <w:p>
-      <w:pPr>
-        <w:numPr>
-          <w:ilvl w:val="0"/>
-          <w:numId w:val="64"/>
+          <w:numId w:val="69"/>
+        </w:numPr>
+        <w:tabs>
+          <w:tab w:val="left" w:pos="720" w:leader="none"/>
+        </w:tabs>
+        <w:spacing w:before="100" w:after="100" w:line="240"/>
+        <w:ind w:right="0" w:left="720" w:hanging="360"/>
+        <w:jc w:val="left"/>
+        <w:rPr>
+          <w:rFonts w:ascii="Times New Roman" w:hAnsi="Times New Roman" w:cs="Times New Roman" w:eastAsia="Times New Roman"/>
+          <w:color w:val="auto"/>
+          <w:spacing w:val="0"/>
+          <w:position w:val="0"/>
+          <w:sz w:val="24"/>
+          <w:shd w:fill="auto" w:val="clear"/>
+        </w:rPr>
+      </w:pPr>
+      <w:r>
+        <w:rPr>
+          <w:rFonts w:ascii="Times New Roman" w:hAnsi="Times New Roman" w:cs="Times New Roman" w:eastAsia="Times New Roman"/>
+          <w:color w:val="auto"/>
+          <w:spacing w:val="0"/>
+          <w:position w:val="0"/>
+          <w:sz w:val="24"/>
+          <w:shd w:fill="auto" w:val="clear"/>
+        </w:rPr>
+        <w:t xml:space="preserve">Motivation  </w:t>
+      </w:r>
+    </w:p>
+    <w:p>
+      <w:pPr>
+        <w:numPr>
+          <w:ilvl w:val="0"/>
+          <w:numId w:val="69"/>
         </w:numPr>
         <w:tabs>
           <w:tab w:val="left" w:pos="720" w:leader="none"/>
@@ -5353,7 +5873,7 @@
       <w:pPr>
         <w:numPr>
           <w:ilvl w:val="0"/>
-          <w:numId w:val="64"/>
+          <w:numId w:val="69"/>
         </w:numPr>
         <w:tabs>
           <w:tab w:val="left" w:pos="720" w:leader="none"/>
@@ -5386,7 +5906,7 @@
       <w:pPr>
         <w:numPr>
           <w:ilvl w:val="0"/>
-          <w:numId w:val="64"/>
+          <w:numId w:val="69"/>
         </w:numPr>
         <w:tabs>
           <w:tab w:val="left" w:pos="720" w:leader="none"/>
@@ -5419,7 +5939,7 @@
       <w:pPr>
         <w:numPr>
           <w:ilvl w:val="0"/>
-          <w:numId w:val="64"/>
+          <w:numId w:val="69"/>
         </w:numPr>
         <w:tabs>
           <w:tab w:val="left" w:pos="720" w:leader="none"/>
@@ -5452,7 +5972,7 @@
       <w:pPr>
         <w:numPr>
           <w:ilvl w:val="0"/>
-          <w:numId w:val="64"/>
+          <w:numId w:val="69"/>
         </w:numPr>
         <w:tabs>
           <w:tab w:val="left" w:pos="720" w:leader="none"/>
@@ -5734,22 +6254,22 @@
   <w:num w:numId="50">
     <w:abstractNumId w:val="36"/>
   </w:num>
-  <w:num w:numId="53">
+  <w:num w:numId="55">
     <w:abstractNumId w:val="30"/>
   </w:num>
-  <w:num w:numId="55">
+  <w:num w:numId="60">
     <w:abstractNumId w:val="24"/>
   </w:num>
-  <w:num w:numId="58">
+  <w:num w:numId="63">
     <w:abstractNumId w:val="18"/>
   </w:num>
-  <w:num w:numId="60">
+  <w:num w:numId="65">
     <w:abstractNumId w:val="12"/>
   </w:num>
-  <w:num w:numId="62">
+  <w:num w:numId="67">
     <w:abstractNumId w:val="6"/>
   </w:num>
-  <w:num w:numId="64">
+  <w:num w:numId="69">
     <w:abstractNumId w:val="0"/>
   </w:num>
 </w:numbering>

</xml_diff>

<commit_message>
added resources and final ppt with results
</commit_message>
<xml_diff>
--- a/Project_details.docx
+++ b/Project_details.docx
@@ -4586,7 +4586,7 @@
           <w:sz w:val="24"/>
           <w:shd w:fill="auto" w:val="clear"/>
         </w:rPr>
-        <w:t xml:space="preserve">200K steps continued from 100K steps</w:t>
+        <w:t xml:space="preserve">200K steps continued from 100K steps (epsilon 0.1 constant)</w:t>
       </w:r>
     </w:p>
     <w:p>
@@ -4757,7 +4757,7 @@
       <w:pPr>
         <w:numPr>
           <w:ilvl w:val="0"/>
-          <w:numId w:val="55"/>
+          <w:numId w:val="53"/>
         </w:numPr>
         <w:tabs>
           <w:tab w:val="left" w:pos="720" w:leader="none"/>
@@ -4790,7 +4790,7 @@
       <w:pPr>
         <w:numPr>
           <w:ilvl w:val="0"/>
-          <w:numId w:val="55"/>
+          <w:numId w:val="53"/>
         </w:numPr>
         <w:tabs>
           <w:tab w:val="left" w:pos="720" w:leader="none"/>
@@ -4823,7 +4823,7 @@
       <w:pPr>
         <w:numPr>
           <w:ilvl w:val="0"/>
-          <w:numId w:val="55"/>
+          <w:numId w:val="53"/>
         </w:numPr>
         <w:tabs>
           <w:tab w:val="left" w:pos="720" w:leader="none"/>
@@ -5043,7 +5043,7 @@
           <w:sz w:val="24"/>
           <w:shd w:fill="auto" w:val="clear"/>
         </w:rPr>
-        <w:t xml:space="preserve">200K steps continued from 100K steps</w:t>
+        <w:t xml:space="preserve">200K steps continued from 100K steps (epsilon 0.1 constant)</w:t>
       </w:r>
     </w:p>
     <w:p>
@@ -5232,7 +5232,7 @@
       <w:pPr>
         <w:numPr>
           <w:ilvl w:val="0"/>
-          <w:numId w:val="60"/>
+          <w:numId w:val="56"/>
         </w:numPr>
         <w:tabs>
           <w:tab w:val="left" w:pos="720" w:leader="none"/>
@@ -5265,7 +5265,7 @@
       <w:pPr>
         <w:numPr>
           <w:ilvl w:val="0"/>
-          <w:numId w:val="60"/>
+          <w:numId w:val="56"/>
         </w:numPr>
         <w:tabs>
           <w:tab w:val="left" w:pos="720" w:leader="none"/>
@@ -5298,7 +5298,7 @@
       <w:pPr>
         <w:numPr>
           <w:ilvl w:val="0"/>
-          <w:numId w:val="60"/>
+          <w:numId w:val="56"/>
         </w:numPr>
         <w:tabs>
           <w:tab w:val="left" w:pos="720" w:leader="none"/>
@@ -5331,7 +5331,7 @@
       <w:pPr>
         <w:numPr>
           <w:ilvl w:val="0"/>
-          <w:numId w:val="60"/>
+          <w:numId w:val="56"/>
         </w:numPr>
         <w:tabs>
           <w:tab w:val="left" w:pos="720" w:leader="none"/>
@@ -5459,6 +5459,260 @@
       <w:pPr>
         <w:numPr>
           <w:ilvl w:val="0"/>
+          <w:numId w:val="59"/>
+        </w:numPr>
+        <w:tabs>
+          <w:tab w:val="left" w:pos="720" w:leader="none"/>
+        </w:tabs>
+        <w:spacing w:before="100" w:after="100" w:line="240"/>
+        <w:ind w:right="0" w:left="720" w:hanging="360"/>
+        <w:jc w:val="left"/>
+        <w:rPr>
+          <w:rFonts w:ascii="Times New Roman" w:hAnsi="Times New Roman" w:cs="Times New Roman" w:eastAsia="Times New Roman"/>
+          <w:color w:val="auto"/>
+          <w:spacing w:val="0"/>
+          <w:position w:val="0"/>
+          <w:sz w:val="24"/>
+          <w:shd w:fill="auto" w:val="clear"/>
+        </w:rPr>
+      </w:pPr>
+      <w:r>
+        <w:rPr>
+          <w:rFonts w:ascii="Times New Roman" w:hAnsi="Times New Roman" w:cs="Times New Roman" w:eastAsia="Times New Roman"/>
+          <w:color w:val="auto"/>
+          <w:spacing w:val="0"/>
+          <w:position w:val="0"/>
+          <w:sz w:val="24"/>
+          <w:shd w:fill="auto" w:val="clear"/>
+        </w:rPr>
+        <w:t xml:space="preserve">Architecture </w:t>
+      </w:r>
+    </w:p>
+    <w:p>
+      <w:pPr>
+        <w:numPr>
+          <w:ilvl w:val="0"/>
+          <w:numId w:val="59"/>
+        </w:numPr>
+        <w:tabs>
+          <w:tab w:val="left" w:pos="720" w:leader="none"/>
+        </w:tabs>
+        <w:spacing w:before="100" w:after="100" w:line="240"/>
+        <w:ind w:right="0" w:left="720" w:hanging="360"/>
+        <w:jc w:val="left"/>
+        <w:rPr>
+          <w:rFonts w:ascii="Times New Roman" w:hAnsi="Times New Roman" w:cs="Times New Roman" w:eastAsia="Times New Roman"/>
+          <w:color w:val="auto"/>
+          <w:spacing w:val="0"/>
+          <w:position w:val="0"/>
+          <w:sz w:val="24"/>
+          <w:shd w:fill="auto" w:val="clear"/>
+        </w:rPr>
+      </w:pPr>
+      <w:r>
+        <w:rPr>
+          <w:rFonts w:ascii="Times New Roman" w:hAnsi="Times New Roman" w:cs="Times New Roman" w:eastAsia="Times New Roman"/>
+          <w:color w:val="auto"/>
+          <w:spacing w:val="0"/>
+          <w:position w:val="0"/>
+          <w:sz w:val="24"/>
+          <w:shd w:fill="auto" w:val="clear"/>
+        </w:rPr>
+        <w:t xml:space="preserve">Replay Buffer </w:t>
+      </w:r>
+    </w:p>
+    <w:p>
+      <w:pPr>
+        <w:numPr>
+          <w:ilvl w:val="0"/>
+          <w:numId w:val="59"/>
+        </w:numPr>
+        <w:tabs>
+          <w:tab w:val="left" w:pos="720" w:leader="none"/>
+        </w:tabs>
+        <w:spacing w:before="100" w:after="100" w:line="240"/>
+        <w:ind w:right="0" w:left="720" w:hanging="360"/>
+        <w:jc w:val="left"/>
+        <w:rPr>
+          <w:rFonts w:ascii="Times New Roman" w:hAnsi="Times New Roman" w:cs="Times New Roman" w:eastAsia="Times New Roman"/>
+          <w:color w:val="auto"/>
+          <w:spacing w:val="0"/>
+          <w:position w:val="0"/>
+          <w:sz w:val="24"/>
+          <w:shd w:fill="auto" w:val="clear"/>
+        </w:rPr>
+      </w:pPr>
+      <w:r>
+        <w:rPr>
+          <w:rFonts w:ascii="Times New Roman" w:hAnsi="Times New Roman" w:cs="Times New Roman" w:eastAsia="Times New Roman"/>
+          <w:color w:val="auto"/>
+          <w:spacing w:val="0"/>
+          <w:position w:val="0"/>
+          <w:sz w:val="24"/>
+          <w:shd w:fill="auto" w:val="clear"/>
+        </w:rPr>
+        <w:t xml:space="preserve">Target Network </w:t>
+      </w:r>
+    </w:p>
+    <w:p>
+      <w:pPr>
+        <w:spacing w:before="100" w:after="100" w:line="240"/>
+        <w:ind w:right="0" w:left="0" w:firstLine="0"/>
+        <w:jc w:val="left"/>
+        <w:rPr>
+          <w:rFonts w:ascii="Times New Roman" w:hAnsi="Times New Roman" w:cs="Times New Roman" w:eastAsia="Times New Roman"/>
+          <w:b/>
+          <w:color w:val="auto"/>
+          <w:spacing w:val="0"/>
+          <w:position w:val="0"/>
+          <w:sz w:val="27"/>
+          <w:shd w:fill="auto" w:val="clear"/>
+        </w:rPr>
+      </w:pPr>
+      <w:r>
+        <w:rPr>
+          <w:rFonts w:ascii="Times New Roman" w:hAnsi="Times New Roman" w:cs="Times New Roman" w:eastAsia="Times New Roman"/>
+          <w:b/>
+          <w:color w:val="auto"/>
+          <w:spacing w:val="0"/>
+          <w:position w:val="0"/>
+          <w:sz w:val="27"/>
+          <w:shd w:fill="auto" w:val="clear"/>
+        </w:rPr>
+        <w:t xml:space="preserve">Task 23: Explain Double DQN</w:t>
+      </w:r>
+    </w:p>
+    <w:p>
+      <w:pPr>
+        <w:numPr>
+          <w:ilvl w:val="0"/>
+          <w:numId w:val="61"/>
+        </w:numPr>
+        <w:tabs>
+          <w:tab w:val="left" w:pos="720" w:leader="none"/>
+        </w:tabs>
+        <w:spacing w:before="100" w:after="100" w:line="240"/>
+        <w:ind w:right="0" w:left="720" w:hanging="360"/>
+        <w:jc w:val="left"/>
+        <w:rPr>
+          <w:rFonts w:ascii="Times New Roman" w:hAnsi="Times New Roman" w:cs="Times New Roman" w:eastAsia="Times New Roman"/>
+          <w:color w:val="auto"/>
+          <w:spacing w:val="0"/>
+          <w:position w:val="0"/>
+          <w:sz w:val="24"/>
+          <w:shd w:fill="auto" w:val="clear"/>
+        </w:rPr>
+      </w:pPr>
+      <w:r>
+        <w:rPr>
+          <w:rFonts w:ascii="Times New Roman" w:hAnsi="Times New Roman" w:cs="Times New Roman" w:eastAsia="Times New Roman"/>
+          <w:color w:val="auto"/>
+          <w:spacing w:val="0"/>
+          <w:position w:val="0"/>
+          <w:sz w:val="24"/>
+          <w:shd w:fill="auto" w:val="clear"/>
+        </w:rPr>
+        <w:t xml:space="preserve">Overestimation bias </w:t>
+      </w:r>
+    </w:p>
+    <w:p>
+      <w:pPr>
+        <w:numPr>
+          <w:ilvl w:val="0"/>
+          <w:numId w:val="61"/>
+        </w:numPr>
+        <w:tabs>
+          <w:tab w:val="left" w:pos="720" w:leader="none"/>
+        </w:tabs>
+        <w:spacing w:before="100" w:after="100" w:line="240"/>
+        <w:ind w:right="0" w:left="720" w:hanging="360"/>
+        <w:jc w:val="left"/>
+        <w:rPr>
+          <w:rFonts w:ascii="Times New Roman" w:hAnsi="Times New Roman" w:cs="Times New Roman" w:eastAsia="Times New Roman"/>
+          <w:color w:val="auto"/>
+          <w:spacing w:val="0"/>
+          <w:position w:val="0"/>
+          <w:sz w:val="24"/>
+          <w:shd w:fill="auto" w:val="clear"/>
+        </w:rPr>
+      </w:pPr>
+      <w:r>
+        <w:rPr>
+          <w:rFonts w:ascii="Times New Roman" w:hAnsi="Times New Roman" w:cs="Times New Roman" w:eastAsia="Times New Roman"/>
+          <w:color w:val="auto"/>
+          <w:spacing w:val="0"/>
+          <w:position w:val="0"/>
+          <w:sz w:val="24"/>
+          <w:shd w:fill="auto" w:val="clear"/>
+        </w:rPr>
+        <w:t xml:space="preserve">Modified target equation </w:t>
+      </w:r>
+    </w:p>
+    <w:p>
+      <w:pPr>
+        <w:numPr>
+          <w:ilvl w:val="0"/>
+          <w:numId w:val="61"/>
+        </w:numPr>
+        <w:tabs>
+          <w:tab w:val="left" w:pos="720" w:leader="none"/>
+        </w:tabs>
+        <w:spacing w:before="100" w:after="100" w:line="240"/>
+        <w:ind w:right="0" w:left="720" w:hanging="360"/>
+        <w:jc w:val="left"/>
+        <w:rPr>
+          <w:rFonts w:ascii="Times New Roman" w:hAnsi="Times New Roman" w:cs="Times New Roman" w:eastAsia="Times New Roman"/>
+          <w:color w:val="auto"/>
+          <w:spacing w:val="0"/>
+          <w:position w:val="0"/>
+          <w:sz w:val="24"/>
+          <w:shd w:fill="auto" w:val="clear"/>
+        </w:rPr>
+      </w:pPr>
+      <w:r>
+        <w:rPr>
+          <w:rFonts w:ascii="Times New Roman" w:hAnsi="Times New Roman" w:cs="Times New Roman" w:eastAsia="Times New Roman"/>
+          <w:color w:val="auto"/>
+          <w:spacing w:val="0"/>
+          <w:position w:val="0"/>
+          <w:sz w:val="24"/>
+          <w:shd w:fill="auto" w:val="clear"/>
+        </w:rPr>
+        <w:t xml:space="preserve">Why it improves DQN </w:t>
+      </w:r>
+    </w:p>
+    <w:p>
+      <w:pPr>
+        <w:spacing w:before="100" w:after="100" w:line="240"/>
+        <w:ind w:right="0" w:left="0" w:firstLine="0"/>
+        <w:jc w:val="left"/>
+        <w:rPr>
+          <w:rFonts w:ascii="Times New Roman" w:hAnsi="Times New Roman" w:cs="Times New Roman" w:eastAsia="Times New Roman"/>
+          <w:b/>
+          <w:color w:val="auto"/>
+          <w:spacing w:val="0"/>
+          <w:position w:val="0"/>
+          <w:sz w:val="27"/>
+          <w:shd w:fill="auto" w:val="clear"/>
+        </w:rPr>
+      </w:pPr>
+      <w:r>
+        <w:rPr>
+          <w:rFonts w:ascii="Times New Roman" w:hAnsi="Times New Roman" w:cs="Times New Roman" w:eastAsia="Times New Roman"/>
+          <w:b/>
+          <w:color w:val="auto"/>
+          <w:spacing w:val="0"/>
+          <w:position w:val="0"/>
+          <w:sz w:val="27"/>
+          <w:shd w:fill="auto" w:val="clear"/>
+        </w:rPr>
+        <w:t xml:space="preserve">Task 24: Present Results</w:t>
+      </w:r>
+    </w:p>
+    <w:p>
+      <w:pPr>
+        <w:numPr>
+          <w:ilvl w:val="0"/>
           <w:numId w:val="63"/>
         </w:numPr>
         <w:tabs>
@@ -5485,7 +5739,7 @@
           <w:sz w:val="24"/>
           <w:shd w:fill="auto" w:val="clear"/>
         </w:rPr>
-        <w:t xml:space="preserve">Architecture </w:t>
+        <w:t xml:space="preserve">W&amp;B plots </w:t>
       </w:r>
     </w:p>
     <w:p>
@@ -5518,40 +5772,7 @@
           <w:sz w:val="24"/>
           <w:shd w:fill="auto" w:val="clear"/>
         </w:rPr>
-        <w:t xml:space="preserve">Replay Buffer </w:t>
-      </w:r>
-    </w:p>
-    <w:p>
-      <w:pPr>
-        <w:numPr>
-          <w:ilvl w:val="0"/>
-          <w:numId w:val="63"/>
-        </w:numPr>
-        <w:tabs>
-          <w:tab w:val="left" w:pos="720" w:leader="none"/>
-        </w:tabs>
-        <w:spacing w:before="100" w:after="100" w:line="240"/>
-        <w:ind w:right="0" w:left="720" w:hanging="360"/>
-        <w:jc w:val="left"/>
-        <w:rPr>
-          <w:rFonts w:ascii="Times New Roman" w:hAnsi="Times New Roman" w:cs="Times New Roman" w:eastAsia="Times New Roman"/>
-          <w:color w:val="auto"/>
-          <w:spacing w:val="0"/>
-          <w:position w:val="0"/>
-          <w:sz w:val="24"/>
-          <w:shd w:fill="auto" w:val="clear"/>
-        </w:rPr>
-      </w:pPr>
-      <w:r>
-        <w:rPr>
-          <w:rFonts w:ascii="Times New Roman" w:hAnsi="Times New Roman" w:cs="Times New Roman" w:eastAsia="Times New Roman"/>
-          <w:color w:val="auto"/>
-          <w:spacing w:val="0"/>
-          <w:position w:val="0"/>
-          <w:sz w:val="24"/>
-          <w:shd w:fill="auto" w:val="clear"/>
-        </w:rPr>
-        <w:t xml:space="preserve">Target Network </w:t>
+        <w:t xml:space="preserve">DQN vs Double DQN comparison </w:t>
       </w:r>
     </w:p>
     <w:p>
@@ -5579,7 +5800,7 @@
           <w:sz w:val="27"/>
           <w:shd w:fill="auto" w:val="clear"/>
         </w:rPr>
-        <w:t xml:space="preserve">Task 23: Explain Double DQN</w:t>
+        <w:t xml:space="preserve">Task 25: Final Report / Slides</w:t>
       </w:r>
     </w:p>
     <w:p>
@@ -5612,7 +5833,7 @@
           <w:sz w:val="24"/>
           <w:shd w:fill="auto" w:val="clear"/>
         </w:rPr>
-        <w:t xml:space="preserve">Overestimation bias </w:t>
+        <w:t xml:space="preserve">Motivation  </w:t>
       </w:r>
     </w:p>
     <w:p>
@@ -5645,7 +5866,7 @@
           <w:sz w:val="24"/>
           <w:shd w:fill="auto" w:val="clear"/>
         </w:rPr>
-        <w:t xml:space="preserve">Modified target equation </w:t>
+        <w:t xml:space="preserve">Methodology </w:t>
       </w:r>
     </w:p>
     <w:p>
@@ -5678,227 +5899,6 @@
           <w:sz w:val="24"/>
           <w:shd w:fill="auto" w:val="clear"/>
         </w:rPr>
-        <w:t xml:space="preserve">Why it improves DQN </w:t>
-      </w:r>
-    </w:p>
-    <w:p>
-      <w:pPr>
-        <w:spacing w:before="100" w:after="100" w:line="240"/>
-        <w:ind w:right="0" w:left="0" w:firstLine="0"/>
-        <w:jc w:val="left"/>
-        <w:rPr>
-          <w:rFonts w:ascii="Times New Roman" w:hAnsi="Times New Roman" w:cs="Times New Roman" w:eastAsia="Times New Roman"/>
-          <w:b/>
-          <w:color w:val="auto"/>
-          <w:spacing w:val="0"/>
-          <w:position w:val="0"/>
-          <w:sz w:val="27"/>
-          <w:shd w:fill="auto" w:val="clear"/>
-        </w:rPr>
-      </w:pPr>
-      <w:r>
-        <w:rPr>
-          <w:rFonts w:ascii="Times New Roman" w:hAnsi="Times New Roman" w:cs="Times New Roman" w:eastAsia="Times New Roman"/>
-          <w:b/>
-          <w:color w:val="auto"/>
-          <w:spacing w:val="0"/>
-          <w:position w:val="0"/>
-          <w:sz w:val="27"/>
-          <w:shd w:fill="auto" w:val="clear"/>
-        </w:rPr>
-        <w:t xml:space="preserve">Task 24: Present Results</w:t>
-      </w:r>
-    </w:p>
-    <w:p>
-      <w:pPr>
-        <w:numPr>
-          <w:ilvl w:val="0"/>
-          <w:numId w:val="67"/>
-        </w:numPr>
-        <w:tabs>
-          <w:tab w:val="left" w:pos="720" w:leader="none"/>
-        </w:tabs>
-        <w:spacing w:before="100" w:after="100" w:line="240"/>
-        <w:ind w:right="0" w:left="720" w:hanging="360"/>
-        <w:jc w:val="left"/>
-        <w:rPr>
-          <w:rFonts w:ascii="Times New Roman" w:hAnsi="Times New Roman" w:cs="Times New Roman" w:eastAsia="Times New Roman"/>
-          <w:color w:val="auto"/>
-          <w:spacing w:val="0"/>
-          <w:position w:val="0"/>
-          <w:sz w:val="24"/>
-          <w:shd w:fill="auto" w:val="clear"/>
-        </w:rPr>
-      </w:pPr>
-      <w:r>
-        <w:rPr>
-          <w:rFonts w:ascii="Times New Roman" w:hAnsi="Times New Roman" w:cs="Times New Roman" w:eastAsia="Times New Roman"/>
-          <w:color w:val="auto"/>
-          <w:spacing w:val="0"/>
-          <w:position w:val="0"/>
-          <w:sz w:val="24"/>
-          <w:shd w:fill="auto" w:val="clear"/>
-        </w:rPr>
-        <w:t xml:space="preserve">W&amp;B plots </w:t>
-      </w:r>
-    </w:p>
-    <w:p>
-      <w:pPr>
-        <w:numPr>
-          <w:ilvl w:val="0"/>
-          <w:numId w:val="67"/>
-        </w:numPr>
-        <w:tabs>
-          <w:tab w:val="left" w:pos="720" w:leader="none"/>
-        </w:tabs>
-        <w:spacing w:before="100" w:after="100" w:line="240"/>
-        <w:ind w:right="0" w:left="720" w:hanging="360"/>
-        <w:jc w:val="left"/>
-        <w:rPr>
-          <w:rFonts w:ascii="Times New Roman" w:hAnsi="Times New Roman" w:cs="Times New Roman" w:eastAsia="Times New Roman"/>
-          <w:color w:val="auto"/>
-          <w:spacing w:val="0"/>
-          <w:position w:val="0"/>
-          <w:sz w:val="24"/>
-          <w:shd w:fill="auto" w:val="clear"/>
-        </w:rPr>
-      </w:pPr>
-      <w:r>
-        <w:rPr>
-          <w:rFonts w:ascii="Times New Roman" w:hAnsi="Times New Roman" w:cs="Times New Roman" w:eastAsia="Times New Roman"/>
-          <w:color w:val="auto"/>
-          <w:spacing w:val="0"/>
-          <w:position w:val="0"/>
-          <w:sz w:val="24"/>
-          <w:shd w:fill="auto" w:val="clear"/>
-        </w:rPr>
-        <w:t xml:space="preserve">DQN vs Double DQN comparison </w:t>
-      </w:r>
-    </w:p>
-    <w:p>
-      <w:pPr>
-        <w:spacing w:before="100" w:after="100" w:line="240"/>
-        <w:ind w:right="0" w:left="0" w:firstLine="0"/>
-        <w:jc w:val="left"/>
-        <w:rPr>
-          <w:rFonts w:ascii="Times New Roman" w:hAnsi="Times New Roman" w:cs="Times New Roman" w:eastAsia="Times New Roman"/>
-          <w:b/>
-          <w:color w:val="auto"/>
-          <w:spacing w:val="0"/>
-          <w:position w:val="0"/>
-          <w:sz w:val="27"/>
-          <w:shd w:fill="auto" w:val="clear"/>
-        </w:rPr>
-      </w:pPr>
-      <w:r>
-        <w:rPr>
-          <w:rFonts w:ascii="Times New Roman" w:hAnsi="Times New Roman" w:cs="Times New Roman" w:eastAsia="Times New Roman"/>
-          <w:b/>
-          <w:color w:val="auto"/>
-          <w:spacing w:val="0"/>
-          <w:position w:val="0"/>
-          <w:sz w:val="27"/>
-          <w:shd w:fill="auto" w:val="clear"/>
-        </w:rPr>
-        <w:t xml:space="preserve">Task 25: Final Report / Slides</w:t>
-      </w:r>
-    </w:p>
-    <w:p>
-      <w:pPr>
-        <w:numPr>
-          <w:ilvl w:val="0"/>
-          <w:numId w:val="69"/>
-        </w:numPr>
-        <w:tabs>
-          <w:tab w:val="left" w:pos="720" w:leader="none"/>
-        </w:tabs>
-        <w:spacing w:before="100" w:after="100" w:line="240"/>
-        <w:ind w:right="0" w:left="720" w:hanging="360"/>
-        <w:jc w:val="left"/>
-        <w:rPr>
-          <w:rFonts w:ascii="Times New Roman" w:hAnsi="Times New Roman" w:cs="Times New Roman" w:eastAsia="Times New Roman"/>
-          <w:color w:val="auto"/>
-          <w:spacing w:val="0"/>
-          <w:position w:val="0"/>
-          <w:sz w:val="24"/>
-          <w:shd w:fill="auto" w:val="clear"/>
-        </w:rPr>
-      </w:pPr>
-      <w:r>
-        <w:rPr>
-          <w:rFonts w:ascii="Times New Roman" w:hAnsi="Times New Roman" w:cs="Times New Roman" w:eastAsia="Times New Roman"/>
-          <w:color w:val="auto"/>
-          <w:spacing w:val="0"/>
-          <w:position w:val="0"/>
-          <w:sz w:val="24"/>
-          <w:shd w:fill="auto" w:val="clear"/>
-        </w:rPr>
-        <w:t xml:space="preserve">Motivation  </w:t>
-      </w:r>
-    </w:p>
-    <w:p>
-      <w:pPr>
-        <w:numPr>
-          <w:ilvl w:val="0"/>
-          <w:numId w:val="69"/>
-        </w:numPr>
-        <w:tabs>
-          <w:tab w:val="left" w:pos="720" w:leader="none"/>
-        </w:tabs>
-        <w:spacing w:before="100" w:after="100" w:line="240"/>
-        <w:ind w:right="0" w:left="720" w:hanging="360"/>
-        <w:jc w:val="left"/>
-        <w:rPr>
-          <w:rFonts w:ascii="Times New Roman" w:hAnsi="Times New Roman" w:cs="Times New Roman" w:eastAsia="Times New Roman"/>
-          <w:color w:val="auto"/>
-          <w:spacing w:val="0"/>
-          <w:position w:val="0"/>
-          <w:sz w:val="24"/>
-          <w:shd w:fill="auto" w:val="clear"/>
-        </w:rPr>
-      </w:pPr>
-      <w:r>
-        <w:rPr>
-          <w:rFonts w:ascii="Times New Roman" w:hAnsi="Times New Roman" w:cs="Times New Roman" w:eastAsia="Times New Roman"/>
-          <w:color w:val="auto"/>
-          <w:spacing w:val="0"/>
-          <w:position w:val="0"/>
-          <w:sz w:val="24"/>
-          <w:shd w:fill="auto" w:val="clear"/>
-        </w:rPr>
-        <w:t xml:space="preserve">Methodology </w:t>
-      </w:r>
-    </w:p>
-    <w:p>
-      <w:pPr>
-        <w:numPr>
-          <w:ilvl w:val="0"/>
-          <w:numId w:val="69"/>
-        </w:numPr>
-        <w:tabs>
-          <w:tab w:val="left" w:pos="720" w:leader="none"/>
-        </w:tabs>
-        <w:spacing w:before="100" w:after="100" w:line="240"/>
-        <w:ind w:right="0" w:left="720" w:hanging="360"/>
-        <w:jc w:val="left"/>
-        <w:rPr>
-          <w:rFonts w:ascii="Times New Roman" w:hAnsi="Times New Roman" w:cs="Times New Roman" w:eastAsia="Times New Roman"/>
-          <w:color w:val="auto"/>
-          <w:spacing w:val="0"/>
-          <w:position w:val="0"/>
-          <w:sz w:val="24"/>
-          <w:shd w:fill="auto" w:val="clear"/>
-        </w:rPr>
-      </w:pPr>
-      <w:r>
-        <w:rPr>
-          <w:rFonts w:ascii="Times New Roman" w:hAnsi="Times New Roman" w:cs="Times New Roman" w:eastAsia="Times New Roman"/>
-          <w:color w:val="auto"/>
-          <w:spacing w:val="0"/>
-          <w:position w:val="0"/>
-          <w:sz w:val="24"/>
-          <w:shd w:fill="auto" w:val="clear"/>
-        </w:rPr>
         <w:t xml:space="preserve">Implementation details </w:t>
       </w:r>
     </w:p>
@@ -5906,7 +5906,7 @@
       <w:pPr>
         <w:numPr>
           <w:ilvl w:val="0"/>
-          <w:numId w:val="69"/>
+          <w:numId w:val="65"/>
         </w:numPr>
         <w:tabs>
           <w:tab w:val="left" w:pos="720" w:leader="none"/>
@@ -5939,7 +5939,7 @@
       <w:pPr>
         <w:numPr>
           <w:ilvl w:val="0"/>
-          <w:numId w:val="69"/>
+          <w:numId w:val="65"/>
         </w:numPr>
         <w:tabs>
           <w:tab w:val="left" w:pos="720" w:leader="none"/>
@@ -5972,7 +5972,7 @@
       <w:pPr>
         <w:numPr>
           <w:ilvl w:val="0"/>
-          <w:numId w:val="69"/>
+          <w:numId w:val="65"/>
         </w:numPr>
         <w:tabs>
           <w:tab w:val="left" w:pos="720" w:leader="none"/>
@@ -6254,22 +6254,22 @@
   <w:num w:numId="50">
     <w:abstractNumId w:val="36"/>
   </w:num>
-  <w:num w:numId="55">
+  <w:num w:numId="53">
     <w:abstractNumId w:val="30"/>
   </w:num>
-  <w:num w:numId="60">
+  <w:num w:numId="56">
     <w:abstractNumId w:val="24"/>
   </w:num>
-  <w:num w:numId="63">
+  <w:num w:numId="59">
     <w:abstractNumId w:val="18"/>
   </w:num>
-  <w:num w:numId="65">
+  <w:num w:numId="61">
     <w:abstractNumId w:val="12"/>
   </w:num>
-  <w:num w:numId="67">
+  <w:num w:numId="63">
     <w:abstractNumId w:val="6"/>
   </w:num>
-  <w:num w:numId="69">
+  <w:num w:numId="65">
     <w:abstractNumId w:val="0"/>
   </w:num>
 </w:numbering>

</xml_diff>